<commit_message>
L05: geprüfte Mastercheckliste und Abnahmeprotokoll veröffentlichen
</commit_message>
<xml_diff>
--- a/DOKUMENTATION/bauhaus.docx
+++ b/DOKUMENTATION/bauhaus.docx
@@ -29,7 +29,7 @@
       </w:pPr>
       <w:r/>
       <w:r>
-        <w:t>Stand: 27. Oktober 2026   •   Basis: Mein Alltag V0.0.2   •   Aktuelle App-Version: V0.4.0 (L04)</w:t>
+        <w:t>Stand: 27. Oktober 2026   •   Basis: Mein Alltag V0.0.2   •   Aktuelle App-Version: V0.5.0 (L05)</w:t>
       </w:r>
     </w:p>
     <w:p>
@@ -91,7 +91,7 @@
     <w:p>
       <w:r/>
       <w:r>
-        <w:t>Abgeschlossen (Code und GitHub): 4 / 36 Updates   |   Offen: 32 / 36 Updates. L04 auf GitHub main in V0.4.0 veröffentlicht (Commit 7d287f3). Android-Funktionstest V0.4.0 offen.</w:t>
+        <w:t>Abgeschlossen (Code und GitHub): 5 / 36 Updates   |   Offen: 31 / 36 Updates. L05 auf GitHub main in V0.5.0 veröffentlicht (Commit 599068de). Android-Praxistest offen.</w:t>
       </w:r>
     </w:p>
     <w:p>
@@ -351,14 +351,14 @@
         <w:sdtPr>
           <w:alias w:val="Update abgeschlossen"/>
           <w14:checkbox>
-            <w14:checked w14:val="0"/>
+            <w14:checked w14:val="1"/>
             <w14:checkedState w14:val="2612" w14:font="MS Gothic"/>
             <w14:uncheckedState w14:val="2610" w14:font="MS Gothic"/>
           </w14:checkbox>
         </w:sdtPr>
         <w:sdtContent>
           <w:r>
-            <w:t>☐</w:t>
+            <w:t>☑</w:t>
           </w:r>
         </w:sdtContent>
       </w:sdt>
@@ -392,6 +392,14 @@
       </w:r>
       <w:r>
         <w:t>Artikel anlegen, bearbeiten, anzeigen und löschen; keine fremden Modul-Daten verändert.</w:t>
+      </w:r>
+    </w:p>
+    <w:p>
+      <w:pPr>
+        <w:pStyle w:val="Caption"/>
+      </w:pPr>
+      <w:r>
+        <w:t>Status L05: Beta V0.5.0; 27.10.2026 auf GitHub main veröffentlicht, Commit 599068de264d70b0fecce30006c05607e87845e6. Artikelkarten anlegen, bearbeiten, ansehen, durchsuchen und löschen. Felder: Name, Typ, Kategorie, Menge, Einheit, Marke, Artikelnummer, Zustand, Notiz, Foto-Platzhalter, Standort Raum/Möbel/Fach. Stabile Artikelcodes A-0001 ff., getrennte lagerhaus/items.v1-Datenspeicherung und atomare ID-Zählung. Löschsperre bei belegten Lagerorten; Artikelstandort folgt Fach-/Möbelverschiebungen über stabile IDs. Unit-/Syntax-/Bestandstests PASS, Veröffentlichungsdateien abgeglichen. Browser-/Android-Praxistest offen (Chromium-Zugriff lokal blockiert).</w:t>
       </w:r>
     </w:p>
     <w:p>
@@ -2007,9 +2015,7 @@
       </w:r>
     </w:p>
     <w:p>
-      <w:r>
-        <w:br w:type="page"/>
-      </w:r>
+      <w:r/>
     </w:p>
     <w:p>
       <w:pPr>
@@ -2486,6 +2492,48 @@
           </w:p>
         </w:tc>
       </w:tr>
+      <w:tr>
+        <w:tc>
+          <w:tcPr>
+            <w:tcW w:type="dxa" w:w="2465"/>
+          </w:tcPr>
+          <w:p>
+            <w:r>
+              <w:t>L05</w:t>
+            </w:r>
+          </w:p>
+        </w:tc>
+        <w:tc>
+          <w:tcPr>
+            <w:tcW w:type="dxa" w:w="2465"/>
+          </w:tcPr>
+          <w:p>
+            <w:r>
+              <w:t>0.5.0</w:t>
+            </w:r>
+          </w:p>
+        </w:tc>
+        <w:tc>
+          <w:tcPr>
+            <w:tcW w:type="dxa" w:w="2465"/>
+          </w:tcPr>
+          <w:p>
+            <w:r>
+              <w:t>27.10.2026</w:t>
+            </w:r>
+          </w:p>
+        </w:tc>
+        <w:tc>
+          <w:tcPr>
+            <w:tcW w:type="dxa" w:w="2465"/>
+          </w:tcPr>
+          <w:p>
+            <w:r>
+              <w:t>GitHub: 599068de · Node PASS · Android offen</w:t>
+            </w:r>
+          </w:p>
+        </w:tc>
+      </w:tr>
     </w:tbl>
     <w:p>
       <w:pPr>
@@ -2755,6 +2803,169 @@
       </w:sdt>
       <w:r>
         <w:t xml:space="preserve">  L04: Browser-End-to-End-Test ausgeführt</w:t>
+      </w:r>
+    </w:p>
+    <w:p>
+      <w:pPr>
+        <w:pStyle w:val="Heading2"/>
+      </w:pPr>
+      <w:r>
+        <w:t>L05 · Veröffentlichung V0.5.0 / Artikelkarten</w:t>
+      </w:r>
+    </w:p>
+    <w:p>
+      <w:r>
+        <w:t>GitHub main: Commit 599068de264d70b0fecce30006c05607e87845e6. Nach dem Hochladen wurden version.json, assets/app.js, sw.js und die beiden neuen Module lagerhaus-items.js / lagerhaus-items-view.js erneut von GitHub abgerufen. Alle Versionen 0.5.0.</w:t>
+      </w:r>
+    </w:p>
+    <w:p>
+      <w:r>
+        <w:t>Implementiert: eigenständige Artikelseite, Suche, Erstellung und Bearbeitung einschließlich Bezeichnung, Typ, Kategorie, Menge (bis drei Dezimalstellen), Einheit, optional Marke/Artikelnummer, Zustand, Notizen und Lagerort. Standort mit stabiler ID unabhängig vom angezeigten Pfad. Foto-Platzhalter ohne Kamera – Fotodokumentation erst L10. Artikel in lagerhaus/items.v1 und fortlaufender Kennungszähler in lagerhaus/items.sequence.v1. Kein Eingriff in andere Module. Bereits gespeicherte Räume/Möbel/Fächer bleiben erhalten.</w:t>
+      </w:r>
+    </w:p>
+    <w:p>
+      <w:r>
+        <w:t>Tests: node release-check.mjs und node release-check-l05.mjs bestanden; JavaScript-Syntax, JSON, SW-Cacheliste und Artikelvalidierung bestanden; Neu-/Bearbeitungs-/Löschabläufe auf Datenlogikebene geprüft, Hierarchiebezug nach Fachumzug und Schutz gegen verwaiste Artikel getestet. Browser-End-to-End nicht ausgeführt: Chromium meldet ERR_BLOCKED_BY_ADMINISTRATOR. Tatsächlicher Android-Offline-/Touchtest weiter offen und darf nicht als bestanden gelten.</w:t>
+      </w:r>
+    </w:p>
+    <w:p>
+      <w:sdt>
+        <w:sdtPr>
+          <w:alias w:val="Update abgeschlossen"/>
+          <w14:checkbox>
+            <w14:checked w14:val="1"/>
+            <w14:checkedState w14:val="2612" w14:font="MS Gothic"/>
+            <w14:uncheckedState w14:val="2610" w14:font="MS Gothic"/>
+          </w14:checkbox>
+        </w:sdtPr>
+        <w:sdtContent>
+          <w:r>
+            <w:t>☑</w:t>
+          </w:r>
+        </w:sdtContent>
+      </w:sdt>
+      <w:r>
+        <w:t xml:space="preserve">  L05 – Quellcode, Artikel-CRUD und Standortmodell implementiert</w:t>
+      </w:r>
+    </w:p>
+    <w:p>
+      <w:sdt>
+        <w:sdtPr>
+          <w:alias w:val="Update abgeschlossen"/>
+          <w14:checkbox>
+            <w14:checked w14:val="1"/>
+            <w14:checkedState w14:val="2612" w14:font="MS Gothic"/>
+            <w14:uncheckedState w14:val="2610" w14:font="MS Gothic"/>
+          </w14:checkbox>
+        </w:sdtPr>
+        <w:sdtContent>
+          <w:r>
+            <w:t>☑</w:t>
+          </w:r>
+        </w:sdtContent>
+      </w:sdt>
+      <w:r>
+        <w:t xml:space="preserve">  L05 – JS-Syntax, Datenlogik, Bestands-/Migrationsprüfungen bestanden</w:t>
+      </w:r>
+    </w:p>
+    <w:p>
+      <w:sdt>
+        <w:sdtPr>
+          <w:alias w:val="Update abgeschlossen"/>
+          <w14:checkbox>
+            <w14:checked w14:val="1"/>
+            <w14:checkedState w14:val="2612" w14:font="MS Gothic"/>
+            <w14:uncheckedState w14:val="2610" w14:font="MS Gothic"/>
+          </w14:checkbox>
+        </w:sdtPr>
+        <w:sdtContent>
+          <w:r>
+            <w:t>☑</w:t>
+          </w:r>
+        </w:sdtContent>
+      </w:sdt>
+      <w:r>
+        <w:t xml:space="preserve">  L05 – Service Worker und Versionsstand 0.5.0 synchron</w:t>
+      </w:r>
+    </w:p>
+    <w:p>
+      <w:sdt>
+        <w:sdtPr>
+          <w:alias w:val="Update abgeschlossen"/>
+          <w14:checkbox>
+            <w14:checked w14:val="1"/>
+            <w14:checkedState w14:val="2612" w14:font="MS Gothic"/>
+            <w14:uncheckedState w14:val="2610" w14:font="MS Gothic"/>
+          </w14:checkbox>
+        </w:sdtPr>
+        <w:sdtContent>
+          <w:r>
+            <w:t>☑</w:t>
+          </w:r>
+        </w:sdtContent>
+      </w:sdt>
+      <w:r>
+        <w:t xml:space="preserve">  L05 – GitHub main publiziert und Dateien erneut gelesen</w:t>
+      </w:r>
+    </w:p>
+    <w:p>
+      <w:sdt>
+        <w:sdtPr>
+          <w:alias w:val="Update abgeschlossen"/>
+          <w14:checkbox>
+            <w14:checked w14:val="1"/>
+            <w14:checkedState w14:val="2612" w14:font="MS Gothic"/>
+            <w14:uncheckedState w14:val="2610" w14:font="MS Gothic"/>
+          </w14:checkbox>
+        </w:sdtPr>
+        <w:sdtContent>
+          <w:r>
+            <w:t>☑</w:t>
+          </w:r>
+        </w:sdtContent>
+      </w:sdt>
+      <w:r>
+        <w:t xml:space="preserve">  L05 – ZIP vollständig und Word-Mastercheckliste enthalten</w:t>
+      </w:r>
+    </w:p>
+    <w:p>
+      <w:sdt>
+        <w:sdtPr>
+          <w:alias w:val="Update abgeschlossen"/>
+          <w14:checkbox>
+            <w14:checked w14:val="0"/>
+            <w14:checkedState w14:val="2612" w14:font="MS Gothic"/>
+            <w14:uncheckedState w14:val="2610" w14:font="MS Gothic"/>
+          </w14:checkbox>
+        </w:sdtPr>
+        <w:sdtContent>
+          <w:r>
+            <w:t>☐</w:t>
+          </w:r>
+        </w:sdtContent>
+      </w:sdt>
+      <w:r>
+        <w:t xml:space="preserve">  L05 – Chromium-/Android-Browser-Praxistest bestanden</w:t>
+      </w:r>
+    </w:p>
+    <w:p>
+      <w:sdt>
+        <w:sdtPr>
+          <w:alias w:val="Update abgeschlossen"/>
+          <w14:checkbox>
+            <w14:checked w14:val="0"/>
+            <w14:checkedState w14:val="2612" w14:font="MS Gothic"/>
+            <w14:uncheckedState w14:val="2610" w14:font="MS Gothic"/>
+          </w14:checkbox>
+        </w:sdtPr>
+        <w:sdtContent>
+          <w:r>
+            <w:t>☐</w:t>
+          </w:r>
+        </w:sdtContent>
+      </w:sdt>
+      <w:r>
+        <w:t xml:space="preserve">  L05 – Offline-/Touchbedienung am Vivo X300 Pro bestätigt</w:t>
       </w:r>
     </w:p>
     <w:sectPr>

</xml_diff>

<commit_message>
L06 release: completed bauhaus checklist, acceptance report and install notes
</commit_message>
<xml_diff>
--- a/DOKUMENTATION/bauhaus.docx
+++ b/DOKUMENTATION/bauhaus.docx
@@ -29,7 +29,7 @@
       </w:pPr>
       <w:r/>
       <w:r>
-        <w:t>Stand: 27. Oktober 2026   •   Basis: Mein Alltag V0.0.2   •   Aktuelle App-Version: V0.5.0 (L05)</w:t>
+        <w:t>Stand: 27. Oktober 2026   •   Basis: Mein Alltag V0.0.2   •   Aktuelle App-Version: V0.6.0 (L06)</w:t>
       </w:r>
     </w:p>
     <w:p>
@@ -411,14 +411,14 @@
         <w:sdtPr>
           <w:alias w:val="Update abgeschlossen"/>
           <w14:checkbox>
-            <w14:checked w14:val="0"/>
+            <w14:checked w14:val="1"/>
             <w14:checkedState w14:val="2612" w14:font="MS Gothic"/>
             <w14:uncheckedState w14:val="2610" w14:font="MS Gothic"/>
           </w14:checkbox>
         </w:sdtPr>
         <w:sdtContent>
           <w:r>
-            <w:t>☐</w:t>
+            <w:t>☑</w:t>
           </w:r>
         </w:sdtContent>
       </w:sdt>
@@ -452,6 +452,14 @@
       </w:r>
       <w:r>
         <w:t>Typabhängige Felder; einfache Schnellerfassung ohne Pflicht-Datenballast.</w:t>
+      </w:r>
+    </w:p>
+    <w:p>
+      <w:pPr>
+        <w:pStyle w:val="Caption"/>
+      </w:pPr>
+      <w:r>
+        <w:t>Status L06: Beta V0.6.0; 27.10.2026 auf GitHub main veröffentlicht, Code-Commit 47e9629756e5c5a7ce925da8f6a1b4c07326c207. Drei Artikeltypen mit 11 typabhängigen Zusatzfeldern und 8 Vorlagen; „Sonstiges“ bleibt erhalten. Neue Artikel lassen sich mit wenigen Angaben erfassen, weitere Eigenschaften sind einblendbar. Alte Artikel-IDs, Codes und Datenspeicher bleiben bestehen. JS-Syntax, L04/L05-Regression und neue L06-Logiktests PASS; echter Browser-/Android-Test noch offen.</w:t>
       </w:r>
     </w:p>
     <w:p>
@@ -2534,6 +2542,48 @@
           </w:p>
         </w:tc>
       </w:tr>
+      <w:tr>
+        <w:tc>
+          <w:tcPr>
+            <w:tcW w:type="dxa" w:w="2465"/>
+          </w:tcPr>
+          <w:p>
+            <w:r>
+              <w:t>L06</w:t>
+            </w:r>
+          </w:p>
+        </w:tc>
+        <w:tc>
+          <w:tcPr>
+            <w:tcW w:type="dxa" w:w="2465"/>
+          </w:tcPr>
+          <w:p>
+            <w:r>
+              <w:t>0.6.0</w:t>
+            </w:r>
+          </w:p>
+        </w:tc>
+        <w:tc>
+          <w:tcPr>
+            <w:tcW w:type="dxa" w:w="2465"/>
+          </w:tcPr>
+          <w:p>
+            <w:r>
+              <w:t>27.10.2026</w:t>
+            </w:r>
+          </w:p>
+        </w:tc>
+        <w:tc>
+          <w:tcPr>
+            <w:tcW w:type="dxa" w:w="2465"/>
+          </w:tcPr>
+          <w:p>
+            <w:r>
+              <w:t>GitHub: 47e96297 · Node PASS · Android offen</w:t>
+            </w:r>
+          </w:p>
+        </w:tc>
+      </w:tr>
     </w:tbl>
     <w:p>
       <w:pPr>
@@ -2968,12 +3018,195 @@
         <w:t xml:space="preserve">  L05 – Offline-/Touchbedienung am Vivo X300 Pro bestätigt</w:t>
       </w:r>
     </w:p>
+    <w:p>
+      <w:pPr>
+        <w:pStyle w:val="Heading2"/>
+      </w:pPr>
+      <w:r>
+        <w:t>L06 · Veröffentlichung V0.6.0 / Artikeltypen und Feldvorlagen</w:t>
+      </w:r>
+    </w:p>
+    <w:p>
+      <w:r>
+        <w:t>GitHub main: Code-Commit 47e9629756e5c5a7ce925da8f6a1b4c07326c207. App, Service Worker und version.json melden V0.6.0. Die Publikation wurde durch erneutes Abrufen überprüft.</w:t>
+      </w:r>
+    </w:p>
+    <w:p>
+      <w:r>
+        <w:t>Funktionsumfang: acht vordefinierte Artikelvorlagen, typspezifische Zusatzfelder, optionale Detailansicht und Schnellerfassung. L05-Datensätze ohne „properties“ können ohne Migration weiterbearbeitet werden. Keine Änderung am IndexedDB-Datenbanknamen, Schema oder den bestehenden Modulschlüsseln.</w:t>
+      </w:r>
+    </w:p>
+    <w:p>
+      <w:r>
+        <w:t>Tests: node release-check.mjs, node release-check-l05.mjs, node release-check-l06.mjs, sämtliche JS-Syntaxprüfungen und JSON-Prüfungen PASS. Lokaler Chromium-Aufruf liefert keinen verlässlichen End-to-End-Nachweis und wurde durch Timeout beendet. Android-Praxistest und Offline-Bedienung nicht durchgeführt.</w:t>
+      </w:r>
+    </w:p>
     <w:sectPr>
       <w:pgSz w:w="12240" w:h="15840"/>
       <w:pgMar w:top="1191" w:right="1134" w:bottom="1020" w:left="1247" w:header="720" w:footer="720" w:gutter="0"/>
       <w:cols w:space="720"/>
       <w:docGrid w:linePitch="360"/>
     </w:sectPr>
+    <w:p>
+      <w:sdt>
+        <w:sdtPr>
+          <w:alias w:val="Update abgeschlossen"/>
+          <w14:checkbox>
+            <w14:checked w14:val="1"/>
+            <w14:checkedState w14:val="2612" w14:font="MS Gothic"/>
+            <w14:uncheckedState w14:val="2610" w14:font="MS Gothic"/>
+          </w14:checkbox>
+        </w:sdtPr>
+        <w:sdtContent>
+          <w:r>
+            <w:t>☑</w:t>
+          </w:r>
+        </w:sdtContent>
+      </w:sdt>
+      <w:r>
+        <w:t xml:space="preserve">  L06 – Vorlagen und typabhängige Eingabefelder implementiert</w:t>
+      </w:r>
+    </w:p>
+    <w:p>
+      <w:sdt>
+        <w:sdtPr>
+          <w:alias w:val="Update abgeschlossen"/>
+          <w14:checkbox>
+            <w14:checked w14:val="1"/>
+            <w14:checkedState w14:val="2612" w14:font="MS Gothic"/>
+            <w14:uncheckedState w14:val="2610" w14:font="MS Gothic"/>
+          </w14:checkbox>
+        </w:sdtPr>
+        <w:sdtContent>
+          <w:r>
+            <w:t>☑</w:t>
+          </w:r>
+        </w:sdtContent>
+      </w:sdt>
+      <w:r>
+        <w:t xml:space="preserve">  L06 – Schnellerfassung ohne zusätzliche Pflichtfelder implementiert</w:t>
+      </w:r>
+    </w:p>
+    <w:p>
+      <w:sdt>
+        <w:sdtPr>
+          <w:alias w:val="Update abgeschlossen"/>
+          <w14:checkbox>
+            <w14:checked w14:val="1"/>
+            <w14:checkedState w14:val="2612" w14:font="MS Gothic"/>
+            <w14:uncheckedState w14:val="2610" w14:font="MS Gothic"/>
+          </w14:checkbox>
+        </w:sdtPr>
+        <w:sdtContent>
+          <w:r>
+            <w:t>☑</w:t>
+          </w:r>
+        </w:sdtContent>
+      </w:sdt>
+      <w:r>
+        <w:t xml:space="preserve">  L06 – L04/L05-Regression, L06-Daten- und Syntaxprüfungen bestanden</w:t>
+      </w:r>
+    </w:p>
+    <w:p>
+      <w:sdt>
+        <w:sdtPr>
+          <w:alias w:val="Update abgeschlossen"/>
+          <w14:checkbox>
+            <w14:checked w14:val="1"/>
+            <w14:checkedState w14:val="2612" w14:font="MS Gothic"/>
+            <w14:uncheckedState w14:val="2610" w14:font="MS Gothic"/>
+          </w14:checkbox>
+        </w:sdtPr>
+        <w:sdtContent>
+          <w:r>
+            <w:t>☑</w:t>
+          </w:r>
+        </w:sdtContent>
+      </w:sdt>
+      <w:r>
+        <w:t xml:space="preserve">  L06 – App-Version, version.json und Service Worker V0.6.0 geprüft</w:t>
+      </w:r>
+    </w:p>
+    <w:p>
+      <w:sdt>
+        <w:sdtPr>
+          <w:alias w:val="Update abgeschlossen"/>
+          <w14:checkbox>
+            <w14:checked w14:val="1"/>
+            <w14:checkedState w14:val="2612" w14:font="MS Gothic"/>
+            <w14:uncheckedState w14:val="2610" w14:font="MS Gothic"/>
+          </w14:checkbox>
+        </w:sdtPr>
+        <w:sdtContent>
+          <w:r>
+            <w:t>☑</w:t>
+          </w:r>
+        </w:sdtContent>
+      </w:sdt>
+      <w:r>
+        <w:t xml:space="preserve">  L06 – GitHub main veröffentlicht und Dateien erneut abgerufen</w:t>
+      </w:r>
+    </w:p>
+    <w:p>
+      <w:sdt>
+        <w:sdtPr>
+          <w:alias w:val="Update abgeschlossen"/>
+          <w14:checkbox>
+            <w14:checked w14:val="1"/>
+            <w14:checkedState w14:val="2612" w14:font="MS Gothic"/>
+            <w14:uncheckedState w14:val="2610" w14:font="MS Gothic"/>
+          </w14:checkbox>
+        </w:sdtPr>
+        <w:sdtContent>
+          <w:r>
+            <w:t>☑</w:t>
+          </w:r>
+        </w:sdtContent>
+      </w:sdt>
+      <w:r>
+        <w:t xml:space="preserve">  L06 – Vollständige ZIP einschließlich aktueller Word-Checkliste erstellt</w:t>
+      </w:r>
+    </w:p>
+    <w:p>
+      <w:sdt>
+        <w:sdtPr>
+          <w:alias w:val="Update abgeschlossen"/>
+          <w14:checkbox>
+            <w14:checked w14:val="0"/>
+            <w14:checkedState w14:val="2612" w14:font="MS Gothic"/>
+            <w14:uncheckedState w14:val="2610" w14:font="MS Gothic"/>
+          </w14:checkbox>
+        </w:sdtPr>
+        <w:sdtContent>
+          <w:r>
+            <w:t>☐</w:t>
+          </w:r>
+        </w:sdtContent>
+      </w:sdt>
+      <w:r>
+        <w:t xml:space="preserve">  L06 – Browser-End-to-End-Test in Chrome nachgewiesen</w:t>
+      </w:r>
+    </w:p>
+    <w:p>
+      <w:sdt>
+        <w:sdtPr>
+          <w:alias w:val="Update abgeschlossen"/>
+          <w14:checkbox>
+            <w14:checked w14:val="0"/>
+            <w14:checkedState w14:val="2612" w14:font="MS Gothic"/>
+            <w14:uncheckedState w14:val="2610" w14:font="MS Gothic"/>
+          </w14:checkbox>
+        </w:sdtPr>
+        <w:sdtContent>
+          <w:r>
+            <w:t>☐</w:t>
+          </w:r>
+        </w:sdtContent>
+      </w:sdt>
+      <w:r>
+        <w:t xml:space="preserve">  L06 – Echte Touch-/Offlineprüfung am Vivo X300 Pro bestanden</w:t>
+      </w:r>
+    </w:p>
   </w:body>
 </w:document>
 </file>

</xml_diff>

<commit_message>
L07 release: verified bauhaus checklist, instructions and acceptance record
</commit_message>
<xml_diff>
--- a/DOKUMENTATION/bauhaus.docx
+++ b/DOKUMENTATION/bauhaus.docx
@@ -29,7 +29,7 @@
       </w:pPr>
       <w:r/>
       <w:r>
-        <w:t>Stand: 27. Oktober 2026   •   Basis: Mein Alltag V0.0.2   •   Aktuelle App-Version: V0.6.0 (L06)</w:t>
+        <w:t>Stand: 27. Oktober 2026   •   Basis: Mein Alltag V0.0.2   •   Aktuelle App-Version: V0.7.0 (L07)</w:t>
       </w:r>
     </w:p>
     <w:p>
@@ -471,14 +471,14 @@
         <w:sdtPr>
           <w:alias w:val="Update abgeschlossen"/>
           <w14:checkbox>
-            <w14:checked w14:val="0"/>
+            <w14:checked w14:val="1"/>
             <w14:checkedState w14:val="2612" w14:font="MS Gothic"/>
             <w14:uncheckedState w14:val="2610" w14:font="MS Gothic"/>
           </w14:checkbox>
         </w:sdtPr>
         <w:sdtContent>
           <w:r>
-            <w:t>☐</w:t>
+            <w:t>☑</w:t>
           </w:r>
         </w:sdtContent>
       </w:sdt>
@@ -512,6 +512,17 @@
       </w:r>
       <w:r>
         <w:t>Summe aller Lagerorte korrekt; keine negative Menge durch Fehlbedienung.</w:t>
+      </w:r>
+    </w:p>
+    <w:p>
+      <w:r>
+        <w:rPr>
+          <w:b/>
+        </w:rPr>
+        <w:t xml:space="preserve">Status L07: </w:t>
+      </w:r>
+      <w:r>
+        <w:t>Beta V0.7.0 am 27.10.2026 auf GitHub main veröffentlicht, Code-Commit c137bf12f802a476470c0fb677ef6f01caabd381. Lagerort-Mengen mit korrekter Gesamtsumme, Ein-/Auslagerung und Umlagerung ohne negative Mengen, Mindestbestand-Warnungen, Packungsgrößen und Buchungshistorie. L05/L06-Artikel werden erst bei ihrer ersten Buchung übernommen, IDs und Namen bleiben erhalten. Datenbankname und Schema unverändert. Alle vier Testpakete (L04–L07) sowie Syntax und Offline-Dateiliste PASS. GitHub-Quellcode erneut abgerufen. Lokaler Chromium-Browsertest lief in einen Timeout; Android-/PWA-Touchtest offen.</w:t>
       </w:r>
     </w:p>
     <w:p>
@@ -2584,6 +2595,48 @@
           </w:p>
         </w:tc>
       </w:tr>
+      <w:tr>
+        <w:tc>
+          <w:tcPr>
+            <w:tcW w:type="dxa" w:w="2465"/>
+          </w:tcPr>
+          <w:p>
+            <w:r>
+              <w:t>L07</w:t>
+            </w:r>
+          </w:p>
+        </w:tc>
+        <w:tc>
+          <w:tcPr>
+            <w:tcW w:type="dxa" w:w="2465"/>
+          </w:tcPr>
+          <w:p>
+            <w:r>
+              <w:t>0.7.0</w:t>
+            </w:r>
+          </w:p>
+        </w:tc>
+        <w:tc>
+          <w:tcPr>
+            <w:tcW w:type="dxa" w:w="2465"/>
+          </w:tcPr>
+          <w:p>
+            <w:r>
+              <w:t>27.10.2026</w:t>
+            </w:r>
+          </w:p>
+        </w:tc>
+        <w:tc>
+          <w:tcPr>
+            <w:tcW w:type="dxa" w:w="2465"/>
+          </w:tcPr>
+          <w:p>
+            <w:r>
+              <w:t>GitHub: c137bf12 · Node PASS · Android offen</w:t>
+            </w:r>
+          </w:p>
+        </w:tc>
+      </w:tr>
     </w:tbl>
     <w:p>
       <w:pPr>
@@ -3041,12 +3094,6 @@
         <w:t>Tests: node release-check.mjs, node release-check-l05.mjs, node release-check-l06.mjs, sämtliche JS-Syntaxprüfungen und JSON-Prüfungen PASS. Lokaler Chromium-Aufruf liefert keinen verlässlichen End-to-End-Nachweis und wurde durch Timeout beendet. Android-Praxistest und Offline-Bedienung nicht durchgeführt.</w:t>
       </w:r>
     </w:p>
-    <w:sectPr>
-      <w:pgSz w:w="12240" w:h="15840"/>
-      <w:pgMar w:top="1191" w:right="1134" w:bottom="1020" w:left="1247" w:header="720" w:footer="720" w:gutter="0"/>
-      <w:cols w:space="720"/>
-      <w:docGrid w:linePitch="360"/>
-    </w:sectPr>
     <w:p>
       <w:sdt>
         <w:sdtPr>
@@ -3205,6 +3252,216 @@
       </w:sdt>
       <w:r>
         <w:t xml:space="preserve">  L06 – Echte Touch-/Offlineprüfung am Vivo X300 Pro bestanden</w:t>
+      </w:r>
+    </w:p>
+    <w:p>
+      <w:pPr>
+        <w:pStyle w:val="Heading2"/>
+        <w:pageBreakBefore/>
+      </w:pPr>
+      <w:r>
+        <w:t>L07 · Veröffentlichung V0.7.0 / Bestandsmanager</w:t>
+      </w:r>
+    </w:p>
+    <w:p>
+      <w:r>
+        <w:t>GitHub main: Code-Commit c137bf12f802a476470c0fb677ef6f01caabd381. app.js, version.json, sw.js und neue Bestands-/Datenbank-Module nach Veröffentlichung erneut abgerufen. Versionen: V0.7.0.</w:t>
+      </w:r>
+    </w:p>
+    <w:p>
+      <w:r>
+        <w:t>Funktionsumfang: mehrere Lagerpositionen pro Artikel, Einlagerung, Entnahme, Umlagerung, eindeutige Mengen-Summen, Mindestbestand, Packungsgrößen und lokales Buchungsprotokoll. Buchungen ändern alle relevanten Schlüssel innerhalb einer IndexedDB-Transaktion. Aktuelle Bestände werden bei Lösch-/Hierarchieoperationen in derselben Transaktion berücksichtigt.</w:t>
+      </w:r>
+    </w:p>
+    <w:p>
+      <w:r>
+        <w:t>Prüfungen: node release-check.mjs, release-check-l05.mjs, release-check-l06.mjs und release-check-l07.mjs bestanden; alle JS-Dateien Syntax PASS. HTTP-Smoke-Test 200. Chromium-Headless-Browsertest nicht erfolgreich (Timeout). Android-Offline-/Touchtest ausstehend.</w:t>
+      </w:r>
+    </w:p>
+    <w:sectPr>
+      <w:pgSz w:w="12240" w:h="15840"/>
+      <w:pgMar w:top="1191" w:right="1134" w:bottom="1020" w:left="1247" w:header="720" w:footer="720" w:gutter="0"/>
+      <w:cols w:space="720"/>
+      <w:docGrid w:linePitch="360"/>
+    </w:sectPr>
+    <w:p>
+      <w:sdt>
+        <w:sdtPr>
+          <w:alias w:val="Update abgeschlossen"/>
+          <w14:checkbox>
+            <w14:checked w14:val="1"/>
+            <w14:checkedState w14:val="2612" w14:font="MS Gothic"/>
+            <w14:uncheckedState w14:val="2610" w14:font="MS Gothic"/>
+          </w14:checkbox>
+        </w:sdtPr>
+        <w:sdtContent>
+          <w:r>
+            <w:t>☑</w:t>
+          </w:r>
+        </w:sdtContent>
+      </w:sdt>
+      <w:r>
+        <w:t xml:space="preserve">  L07 – Einlagern, Entnehmen und Umlagern mit mehreren Lagerorten implementiert</w:t>
+      </w:r>
+    </w:p>
+    <w:p>
+      <w:sdt>
+        <w:sdtPr>
+          <w:alias w:val="Update abgeschlossen"/>
+          <w14:checkbox>
+            <w14:checked w14:val="1"/>
+            <w14:checkedState w14:val="2612" w14:font="MS Gothic"/>
+            <w14:uncheckedState w14:val="2610" w14:font="MS Gothic"/>
+          </w14:checkbox>
+        </w:sdtPr>
+        <w:sdtContent>
+          <w:r>
+            <w:t>☑</w:t>
+          </w:r>
+        </w:sdtContent>
+      </w:sdt>
+      <w:r>
+        <w:t xml:space="preserve">  L07 – Atomare Bestandsbuchungen und Schutz gegen negative Mengen getestet</w:t>
+      </w:r>
+    </w:p>
+    <w:p>
+      <w:sdt>
+        <w:sdtPr>
+          <w:alias w:val="Update abgeschlossen"/>
+          <w14:checkbox>
+            <w14:checked w14:val="1"/>
+            <w14:checkedState w14:val="2612" w14:font="MS Gothic"/>
+            <w14:uncheckedState w14:val="2610" w14:font="MS Gothic"/>
+          </w14:checkbox>
+        </w:sdtPr>
+        <w:sdtContent>
+          <w:r>
+            <w:t>☑</w:t>
+          </w:r>
+        </w:sdtContent>
+      </w:sdt>
+      <w:r>
+        <w:t xml:space="preserve">  L07 – Packungsgrößen, Mindestbestand und Buchungsprotokoll getestet</w:t>
+      </w:r>
+    </w:p>
+    <w:p>
+      <w:sdt>
+        <w:sdtPr>
+          <w:alias w:val="Update abgeschlossen"/>
+          <w14:checkbox>
+            <w14:checked w14:val="1"/>
+            <w14:checkedState w14:val="2612" w14:font="MS Gothic"/>
+            <w14:uncheckedState w14:val="2610" w14:font="MS Gothic"/>
+          </w14:checkbox>
+        </w:sdtPr>
+        <w:sdtContent>
+          <w:r>
+            <w:t>☑</w:t>
+          </w:r>
+        </w:sdtContent>
+      </w:sdt>
+      <w:r>
+        <w:t xml:space="preserve">  L07 – L04–L06-Regressions- und L07-Logiktests bestanden</w:t>
+      </w:r>
+    </w:p>
+    <w:p>
+      <w:sdt>
+        <w:sdtPr>
+          <w:alias w:val="Update abgeschlossen"/>
+          <w14:checkbox>
+            <w14:checked w14:val="1"/>
+            <w14:checkedState w14:val="2612" w14:font="MS Gothic"/>
+            <w14:uncheckedState w14:val="2610" w14:font="MS Gothic"/>
+          </w14:checkbox>
+        </w:sdtPr>
+        <w:sdtContent>
+          <w:r>
+            <w:t>☑</w:t>
+          </w:r>
+        </w:sdtContent>
+      </w:sdt>
+      <w:r>
+        <w:t xml:space="preserve">  L07 – App/Service Worker/Versionsdatei V0.7.0 geprüft</w:t>
+      </w:r>
+    </w:p>
+    <w:p>
+      <w:sdt>
+        <w:sdtPr>
+          <w:alias w:val="Update abgeschlossen"/>
+          <w14:checkbox>
+            <w14:checked w14:val="1"/>
+            <w14:checkedState w14:val="2612" w14:font="MS Gothic"/>
+            <w14:uncheckedState w14:val="2610" w14:font="MS Gothic"/>
+          </w14:checkbox>
+        </w:sdtPr>
+        <w:sdtContent>
+          <w:r>
+            <w:t>☑</w:t>
+          </w:r>
+        </w:sdtContent>
+      </w:sdt>
+      <w:r>
+        <w:t xml:space="preserve">  L07 – GitHub main veröffentlicht und Dateien erneut abgerufen</w:t>
+      </w:r>
+    </w:p>
+    <w:p>
+      <w:sdt>
+        <w:sdtPr>
+          <w:alias w:val="Update abgeschlossen"/>
+          <w14:checkbox>
+            <w14:checked w14:val="1"/>
+            <w14:checkedState w14:val="2612" w14:font="MS Gothic"/>
+            <w14:uncheckedState w14:val="2610" w14:font="MS Gothic"/>
+          </w14:checkbox>
+        </w:sdtPr>
+        <w:sdtContent>
+          <w:r>
+            <w:t>☑</w:t>
+          </w:r>
+        </w:sdtContent>
+      </w:sdt>
+      <w:r>
+        <w:t xml:space="preserve">  L07 – Vollständige ZIP mit bauhaus.docx erstellt und geprüft</w:t>
+      </w:r>
+    </w:p>
+    <w:p>
+      <w:sdt>
+        <w:sdtPr>
+          <w:alias w:val="Update abgeschlossen"/>
+          <w14:checkbox>
+            <w14:checked w14:val="0"/>
+            <w14:checkedState w14:val="2612" w14:font="MS Gothic"/>
+            <w14:uncheckedState w14:val="2610" w14:font="MS Gothic"/>
+          </w14:checkbox>
+        </w:sdtPr>
+        <w:sdtContent>
+          <w:r>
+            <w:t>☐</w:t>
+          </w:r>
+        </w:sdtContent>
+      </w:sdt>
+      <w:r>
+        <w:t xml:space="preserve">  L07 – Browser-End-to-End-Test unter Chromium/Chrome durchgeführt</w:t>
+      </w:r>
+    </w:p>
+    <w:p>
+      <w:sdt>
+        <w:sdtPr>
+          <w:alias w:val="Update abgeschlossen"/>
+          <w14:checkbox>
+            <w14:checked w14:val="0"/>
+            <w14:checkedState w14:val="2612" w14:font="MS Gothic"/>
+            <w14:uncheckedState w14:val="2610" w14:font="MS Gothic"/>
+          </w14:checkbox>
+        </w:sdtPr>
+        <w:sdtContent>
+          <w:r>
+            <w:t>☐</w:t>
+          </w:r>
+        </w:sdtContent>
+      </w:sdt>
+      <w:r>
+        <w:t xml:space="preserve">  L07 – Android-Touch-/Offline-/Updateprüfung bestätigt</w:t>
       </w:r>
     </w:p>
   </w:body>

</xml_diff>

<commit_message>
L08 release: verified bauhaus checklist and acceptance records
</commit_message>
<xml_diff>
--- a/DOKUMENTATION/bauhaus.docx
+++ b/DOKUMENTATION/bauhaus.docx
@@ -29,7 +29,7 @@
       </w:pPr>
       <w:r/>
       <w:r>
-        <w:t>Stand: 27. Oktober 2026   •   Basis: Mein Alltag V0.0.2   •   Aktuelle App-Version: V0.7.0 (L07)</w:t>
+        <w:t>Stand: 27. Oktober 2026   •   Basis: Mein Alltag V0.0.2   •   Aktuelle App-Version: V0.8.0 (L08)</w:t>
       </w:r>
     </w:p>
     <w:p>
@@ -534,14 +534,14 @@
         <w:sdtPr>
           <w:alias w:val="Update abgeschlossen"/>
           <w14:checkbox>
-            <w14:checked w14:val="0"/>
+            <w14:checked w14:val="1"/>
             <w14:checkedState w14:val="2612" w14:font="MS Gothic"/>
             <w14:uncheckedState w14:val="2610" w14:font="MS Gothic"/>
           </w14:checkbox>
         </w:sdtPr>
         <w:sdtContent>
           <w:r>
-            <w:t>☐</w:t>
+            <w:t>☑</w:t>
           </w:r>
         </w:sdtContent>
       </w:sdt>
@@ -575,6 +575,17 @@
       </w:r>
       <w:r>
         <w:t>Einzelgeräte separat identifizierbar; offene Gebinde korrekt geführt.</w:t>
+      </w:r>
+    </w:p>
+    <w:p>
+      <w:r>
+        <w:rPr>
+          <w:b/>
+        </w:rPr>
+        <w:t xml:space="preserve">Status L08: </w:t>
+      </w:r>
+      <w:r>
+        <w:t>Beta V0.8.0 am 27.10.2026 auf GitHub main veröffentlicht (Code-Commit 62789369dde74cedccf24c64f955226ecd6ecca4). Für Verbrauchsmaterialien: individuelle Gebinde mit Kennung, Kapazität, verbleibender Menge und Zuständen voll, angebrochen, leer. Für Geräte: eindeutige Seriennummer, Einzelgeräte-ID, Zustand und Lagerort. Bestehender Bestand kann ohne doppelte Mengenerfassung gekennzeichnet werden; Neu-Zugänge buchen zu. Teilverbrauch/Umlagerung und Entnahme respektieren gebundene Mengen. L04–L08-Tests und Syntaxprüfung PASS. Vollständiger Browser-/Android-Praxistest noch offen.</w:t>
       </w:r>
     </w:p>
     <w:p>
@@ -2637,6 +2648,48 @@
           </w:p>
         </w:tc>
       </w:tr>
+      <w:tr>
+        <w:tc>
+          <w:tcPr>
+            <w:tcW w:type="dxa" w:w="2465"/>
+          </w:tcPr>
+          <w:p>
+            <w:r>
+              <w:t>L08</w:t>
+            </w:r>
+          </w:p>
+        </w:tc>
+        <w:tc>
+          <w:tcPr>
+            <w:tcW w:type="dxa" w:w="2465"/>
+          </w:tcPr>
+          <w:p>
+            <w:r>
+              <w:t>0.8.0</w:t>
+            </w:r>
+          </w:p>
+        </w:tc>
+        <w:tc>
+          <w:tcPr>
+            <w:tcW w:type="dxa" w:w="2465"/>
+          </w:tcPr>
+          <w:p>
+            <w:r>
+              <w:t>27.10.2026</w:t>
+            </w:r>
+          </w:p>
+        </w:tc>
+        <w:tc>
+          <w:tcPr>
+            <w:tcW w:type="dxa" w:w="2465"/>
+          </w:tcPr>
+          <w:p>
+            <w:r>
+              <w:t>GitHub: 62789369 · Node PASS · Android offen</w:t>
+            </w:r>
+          </w:p>
+        </w:tc>
+      </w:tr>
     </w:tbl>
     <w:p>
       <w:pPr>
@@ -3276,6 +3329,49 @@
     <w:p>
       <w:r>
         <w:t>Prüfungen: node release-check.mjs, release-check-l05.mjs, release-check-l06.mjs und release-check-l07.mjs bestanden; alle JS-Dateien Syntax PASS. HTTP-Smoke-Test 200. Chromium-Headless-Browsertest nicht erfolgreich (Timeout). Android-Offline-/Touchtest ausstehend.</w:t>
+      </w:r>
+    </w:p>
+    <w:p>
+      <w:sdt>
+        <w:sdtPr>
+          <w:alias w:val="Update abgeschlossen"/>
+          <w14:checkbox>
+            <w14:checked w14:val="0"/>
+            <w14:checkedState w14:val="2612" w14:font="MS Gothic"/>
+            <w14:uncheckedState w14:val="2610" w14:font="MS Gothic"/>
+          </w14:checkbox>
+        </w:sdtPr>
+        <w:sdtContent>
+          <w:r>
+            <w:t>☐</w:t>
+          </w:r>
+        </w:sdtContent>
+      </w:sdt>
+      <w:r>
+        <w:t xml:space="preserve">  L07 – Android-Touch-/Offline-/Updateprüfung bestätigt</w:t>
+      </w:r>
+    </w:p>
+    <w:p>
+      <w:pPr>
+        <w:pStyle w:val="Heading2"/>
+      </w:pPr>
+      <w:r>
+        <w:t>L08 · Veröffentlichung V0.8.0 / Gebinde und Einzelgeräte</w:t>
+      </w:r>
+    </w:p>
+    <w:p>
+      <w:r>
+        <w:t>GitHub main: Code-Commit 62789369dde74cedccf24c64f955226ecd6ecca4. app.js, version.json, Service-Worker und das neue Tracking-Modul nach Veröffentlichung erneut abgerufen. Alle Versionsangaben sind V0.8.0.</w:t>
+      </w:r>
+    </w:p>
+    <w:p>
+      <w:r>
+        <w:t>Umfang: volle, angebrochene und leere Gebinde; teilweiser Verbrauch; individuelle Seriengeräte mit Zustand, Lagerort und eindeutig bleibenden Kennungen. Gebinde und Geräte belegen nur einen Teil des bestehenden Gesamtbestands und werden nie doppelt gezählt. Neu-Anlage als Bestandszugang ist ausdrücklich auswählbar. Bestehende Artikel/Module bleiben erhalten; IndexedDB-Struktur unverändert.</w:t>
+      </w:r>
+    </w:p>
+    <w:p>
+      <w:r>
+        <w:t>Tests: node release-check.mjs sowie release-check-l05.mjs bis release-check-l08.mjs erfolgreich. Alle produktiven JavaScript-Dateien bestehen die Syntaxprüfung. Browsertest unter Chromium durch ERR_BLOCKED_BY_ADMINISTRATOR nicht möglich. Android-Touch-, Offline- und Updateprüfung noch offen.</w:t>
       </w:r>
     </w:p>
     <w:sectPr>
@@ -3449,6 +3545,206 @@
         <w:sdtPr>
           <w:alias w:val="Update abgeschlossen"/>
           <w14:checkbox>
+            <w14:checked w14:val="1"/>
+            <w14:checkedState w14:val="2612" w14:font="MS Gothic"/>
+            <w14:uncheckedState w14:val="2610" w14:font="MS Gothic"/>
+          </w14:checkbox>
+        </w:sdtPr>
+        <w:sdtContent>
+          <w:r>
+            <w:t>☑</w:t>
+          </w:r>
+        </w:sdtContent>
+      </w:sdt>
+      <w:r>
+        <w:t xml:space="preserve">  L08 – Einzelgebinde mit Status voll/angebrochen/leer implementiert</w:t>
+      </w:r>
+    </w:p>
+    <w:p>
+      <w:sdt>
+        <w:sdtPr>
+          <w:alias w:val="Update abgeschlossen"/>
+          <w14:checkbox>
+            <w14:checked w14:val="1"/>
+            <w14:checkedState w14:val="2612" w14:font="MS Gothic"/>
+            <w14:uncheckedState w14:val="2610" w14:font="MS Gothic"/>
+          </w14:checkbox>
+        </w:sdtPr>
+        <w:sdtContent>
+          <w:r>
+            <w:t>☑</w:t>
+          </w:r>
+        </w:sdtContent>
+      </w:sdt>
+      <w:r>
+        <w:t xml:space="preserve">  L08 – Gebinde öffnen, Teilmengen verbrauchen und umlagern getestet</w:t>
+      </w:r>
+    </w:p>
+    <w:p>
+      <w:sdt>
+        <w:sdtPr>
+          <w:alias w:val="Update abgeschlossen"/>
+          <w14:checkbox>
+            <w14:checked w14:val="1"/>
+            <w14:checkedState w14:val="2612" w14:font="MS Gothic"/>
+            <w14:uncheckedState w14:val="2610" w14:font="MS Gothic"/>
+          </w14:checkbox>
+        </w:sdtPr>
+        <w:sdtContent>
+          <w:r>
+            <w:t>☑</w:t>
+          </w:r>
+        </w:sdtContent>
+      </w:sdt>
+      <w:r>
+        <w:t xml:space="preserve">  L08 – Einzelgeräte mit appweit eindeutigen Seriennummern implementiert</w:t>
+      </w:r>
+    </w:p>
+    <w:p>
+      <w:sdt>
+        <w:sdtPr>
+          <w:alias w:val="Update abgeschlossen"/>
+          <w14:checkbox>
+            <w14:checked w14:val="1"/>
+            <w14:checkedState w14:val="2612" w14:font="MS Gothic"/>
+            <w14:uncheckedState w14:val="2610" w14:font="MS Gothic"/>
+          </w14:checkbox>
+        </w:sdtPr>
+        <w:sdtContent>
+          <w:r>
+            <w:t>☑</w:t>
+          </w:r>
+        </w:sdtContent>
+      </w:sdt>
+      <w:r>
+        <w:t xml:space="preserve">  L08 – Einzelgeräte-Zustand, Umlagerung, Ausbuchung getestet</w:t>
+      </w:r>
+    </w:p>
+    <w:p>
+      <w:sdt>
+        <w:sdtPr>
+          <w:alias w:val="Update abgeschlossen"/>
+          <w14:checkbox>
+            <w14:checked w14:val="1"/>
+            <w14:checkedState w14:val="2612" w14:font="MS Gothic"/>
+            <w14:uncheckedState w14:val="2610" w14:font="MS Gothic"/>
+          </w14:checkbox>
+        </w:sdtPr>
+        <w:sdtContent>
+          <w:r>
+            <w:t>☑</w:t>
+          </w:r>
+        </w:sdtContent>
+      </w:sdt>
+      <w:r>
+        <w:t xml:space="preserve">  L08 – Freie und einzeln gebundene Bestände ohne Doppelzählung getestet</w:t>
+      </w:r>
+    </w:p>
+    <w:p>
+      <w:sdt>
+        <w:sdtPr>
+          <w:alias w:val="Update abgeschlossen"/>
+          <w14:checkbox>
+            <w14:checked w14:val="1"/>
+            <w14:checkedState w14:val="2612" w14:font="MS Gothic"/>
+            <w14:uncheckedState w14:val="2610" w14:font="MS Gothic"/>
+          </w14:checkbox>
+        </w:sdtPr>
+        <w:sdtContent>
+          <w:r>
+            <w:t>☑</w:t>
+          </w:r>
+        </w:sdtContent>
+      </w:sdt>
+      <w:r>
+        <w:t xml:space="preserve">  L08 – Stabile Kennungen auch nach Entfernen eines Einzeleintrags geprüft</w:t>
+      </w:r>
+    </w:p>
+    <w:p>
+      <w:sdt>
+        <w:sdtPr>
+          <w:alias w:val="Update abgeschlossen"/>
+          <w14:checkbox>
+            <w14:checked w14:val="1"/>
+            <w14:checkedState w14:val="2612" w14:font="MS Gothic"/>
+            <w14:uncheckedState w14:val="2610" w14:font="MS Gothic"/>
+          </w14:checkbox>
+        </w:sdtPr>
+        <w:sdtContent>
+          <w:r>
+            <w:t>☑</w:t>
+          </w:r>
+        </w:sdtContent>
+      </w:sdt>
+      <w:r>
+        <w:t xml:space="preserve">  L08 – L04–L07-Regressions- und L08-Logiktests erfolgreich</w:t>
+      </w:r>
+    </w:p>
+    <w:p>
+      <w:sdt>
+        <w:sdtPr>
+          <w:alias w:val="Update abgeschlossen"/>
+          <w14:checkbox>
+            <w14:checked w14:val="1"/>
+            <w14:checkedState w14:val="2612" w14:font="MS Gothic"/>
+            <w14:uncheckedState w14:val="2610" w14:font="MS Gothic"/>
+          </w14:checkbox>
+        </w:sdtPr>
+        <w:sdtContent>
+          <w:r>
+            <w:t>☑</w:t>
+          </w:r>
+        </w:sdtContent>
+      </w:sdt>
+      <w:r>
+        <w:t xml:space="preserve">  L08 – JavaScript-Syntax, Offline-Dateiliste, GitHub-Version V0.8.0 geprüft</w:t>
+      </w:r>
+    </w:p>
+    <w:p>
+      <w:sdt>
+        <w:sdtPr>
+          <w:alias w:val="Update abgeschlossen"/>
+          <w14:checkbox>
+            <w14:checked w14:val="1"/>
+            <w14:checkedState w14:val="2612" w14:font="MS Gothic"/>
+            <w14:uncheckedState w14:val="2610" w14:font="MS Gothic"/>
+          </w14:checkbox>
+        </w:sdtPr>
+        <w:sdtContent>
+          <w:r>
+            <w:t>☑</w:t>
+          </w:r>
+        </w:sdtContent>
+      </w:sdt>
+      <w:r>
+        <w:t xml:space="preserve">  L08 – GitHub main veröffentlicht und Code erneut abgerufen</w:t>
+      </w:r>
+    </w:p>
+    <w:p>
+      <w:sdt>
+        <w:sdtPr>
+          <w:alias w:val="Update abgeschlossen"/>
+          <w14:checkbox>
+            <w14:checked w14:val="1"/>
+            <w14:checkedState w14:val="2612" w14:font="MS Gothic"/>
+            <w14:uncheckedState w14:val="2610" w14:font="MS Gothic"/>
+          </w14:checkbox>
+        </w:sdtPr>
+        <w:sdtContent>
+          <w:r>
+            <w:t>☑</w:t>
+          </w:r>
+        </w:sdtContent>
+      </w:sdt>
+      <w:r>
+        <w:t xml:space="preserve">  L08 – Fertige ZIP inklusive aktualisierter Word-Checkliste erstellt und geprüft</w:t>
+      </w:r>
+    </w:p>
+    <w:p>
+      <w:sdt>
+        <w:sdtPr>
+          <w:alias w:val="Update abgeschlossen"/>
+          <w14:checkbox>
             <w14:checked w14:val="0"/>
             <w14:checkedState w14:val="2612" w14:font="MS Gothic"/>
             <w14:uncheckedState w14:val="2610" w14:font="MS Gothic"/>
@@ -3461,7 +3757,27 @@
         </w:sdtContent>
       </w:sdt>
       <w:r>
-        <w:t xml:space="preserve">  L07 – Android-Touch-/Offline-/Updateprüfung bestätigt</w:t>
+        <w:t xml:space="preserve">  L08 – Vollständiger Chromium-/Chrome-Browser-End-to-End-Test</w:t>
+      </w:r>
+    </w:p>
+    <w:p>
+      <w:sdt>
+        <w:sdtPr>
+          <w:alias w:val="Update abgeschlossen"/>
+          <w14:checkbox>
+            <w14:checked w14:val="0"/>
+            <w14:checkedState w14:val="2612" w14:font="MS Gothic"/>
+            <w14:uncheckedState w14:val="2610" w14:font="MS Gothic"/>
+          </w14:checkbox>
+        </w:sdtPr>
+        <w:sdtContent>
+          <w:r>
+            <w:t>☐</w:t>
+          </w:r>
+        </w:sdtContent>
+      </w:sdt>
+      <w:r>
+        <w:t xml:space="preserve">  L08 – Android-Touch-, Offline- und Update-Praxistest</w:t>
       </w:r>
     </w:p>
   </w:body>

</xml_diff>

<commit_message>
L09: geprüfte bauhaus Word-Checkliste und Abnahmeprotokoll
</commit_message>
<xml_diff>
--- a/DOKUMENTATION/bauhaus.docx
+++ b/DOKUMENTATION/bauhaus.docx
@@ -29,7 +29,7 @@
       </w:pPr>
       <w:r/>
       <w:r>
-        <w:t>Stand: 27. Oktober 2026   •   Basis: Mein Alltag V0.0.2   •   Aktuelle App-Version: V0.8.0 (L08)</w:t>
+        <w:t>Stand: 27. Oktober 2026   •   Basis: Mein Alltag V0.0.2   •   Aktuelle App-Version: V0.9.0 (L09)</w:t>
       </w:r>
     </w:p>
     <w:p>
@@ -89,9 +89,11 @@
       </w:r>
     </w:p>
     <w:p>
-      <w:r/>
-      <w:r>
-        <w:t>Abgeschlossen (Code und GitHub): 5 / 36 Updates   |   Offen: 31 / 36 Updates. L05 auf GitHub main in V0.5.0 veröffentlicht (Commit 599068de). Android-Praxistest offen.</w:t>
+      <w:r>
+        <w:t>Abgeschlossen (Code und GitHub): 9 / 36 Updates   |   Offen: 27 / 36 Updates. L09 auf GitHub main in V0.9.0 veröffentlicht (Commit 72b4a74c). Chrome-/Android-Praxistest weiterhin offen.</w:t>
+      </w:r>
+      <w:r>
+        <w:t>Abgeschlossen (Code und GitHub): 9 / 36 Updates   |   Offen: 27 / 36 Updates. L09 auf GitHub main in V0.9.0 veröffentlicht (Commit 72b4a74c). Chrome-/Android-Praxistest weiterhin offen.</w:t>
       </w:r>
     </w:p>
     <w:p>
@@ -597,14 +599,14 @@
         <w:sdtPr>
           <w:alias w:val="Update abgeschlossen"/>
           <w14:checkbox>
-            <w14:checked w14:val="0"/>
+            <w14:checked w14:val="1"/>
             <w14:checkedState w14:val="2612" w14:font="MS Gothic"/>
             <w14:uncheckedState w14:val="2610" w14:font="MS Gothic"/>
           </w14:checkbox>
         </w:sdtPr>
         <w:sdtContent>
           <w:r>
-            <w:t>☐</w:t>
+            <w:t>☑</w:t>
           </w:r>
         </w:sdtContent>
       </w:sdt>
@@ -638,6 +640,17 @@
       </w:r>
       <w:r>
         <w:t>Anklickbare Fachkarte; 3D- und Listenansicht stimmen überein.</w:t>
+      </w:r>
+    </w:p>
+    <w:p>
+      <w:r>
+        <w:rPr>
+          <w:b/>
+        </w:rPr>
+        <w:t xml:space="preserve">Status L09: </w:t>
+      </w:r>
+      <w:r>
+        <w:t>Beta V0.9.0 am 27.10.2026 auf GitHub main veröffentlicht (Code-Commit 72b4a74c9bdb5cb10c7f6c324886e775d9a3aa87). Schematische 3D-Fachmarkierungen und Fachkarten nutzen dieselben stabilen Fach-IDs. Volltextsuche über Fach, Code, Möbel und Artikel. Einlagern, Entnehmen und Umlagern zwischen Fächern durch atomare Bestandsbuchungen mit Bewegungshistorie. Vorhandene Artikel-, Raum-, Gebinde- und Geräte-IDs bleiben erhalten. Reservierte Einzelbestände sind gegen normale Entnahmen geschützt. JavaScript-Syntax, L04–L08-Regression, L09-Funktionstests und Offline-Prüfung PASS; realer Android-/Chrome-End-to-End-Test noch offen.</w:t>
       </w:r>
     </w:p>
     <w:p>
@@ -2690,6 +2703,48 @@
           </w:p>
         </w:tc>
       </w:tr>
+      <w:tr>
+        <w:tc>
+          <w:tcPr>
+            <w:tcW w:type="dxa" w:w="2465"/>
+          </w:tcPr>
+          <w:p>
+            <w:r>
+              <w:t>L09</w:t>
+            </w:r>
+          </w:p>
+        </w:tc>
+        <w:tc>
+          <w:tcPr>
+            <w:tcW w:type="dxa" w:w="2465"/>
+          </w:tcPr>
+          <w:p>
+            <w:r>
+              <w:t>0.9.0</w:t>
+            </w:r>
+          </w:p>
+        </w:tc>
+        <w:tc>
+          <w:tcPr>
+            <w:tcW w:type="dxa" w:w="2465"/>
+          </w:tcPr>
+          <w:p>
+            <w:r>
+              <w:t>27.10.2026</w:t>
+            </w:r>
+          </w:p>
+        </w:tc>
+        <w:tc>
+          <w:tcPr>
+            <w:tcW w:type="dxa" w:w="2465"/>
+          </w:tcPr>
+          <w:p>
+            <w:r>
+              <w:t>GitHub: 72b4a74c · Node PASS · Android offen</w:t>
+            </w:r>
+          </w:p>
+        </w:tc>
+      </w:tr>
     </w:tbl>
     <w:p>
       <w:pPr>
@@ -3372,6 +3427,29 @@
     <w:p>
       <w:r>
         <w:t>Tests: node release-check.mjs sowie release-check-l05.mjs bis release-check-l08.mjs erfolgreich. Alle produktiven JavaScript-Dateien bestehen die Syntaxprüfung. Browsertest unter Chromium durch ERR_BLOCKED_BY_ADMINISTRATOR nicht möglich. Android-Touch-, Offline- und Updateprüfung noch offen.</w:t>
+      </w:r>
+    </w:p>
+    <w:p>
+      <w:pPr>
+        <w:pStyle w:val="Heading2"/>
+      </w:pPr>
+      <w:r>
+        <w:t>L09 · Veröffentlichung V0.9.0 / 3D-Fachverwaltung</w:t>
+      </w:r>
+    </w:p>
+    <w:p>
+      <w:r>
+        <w:t>GitHub main: Code-Commit 72b4a74c9bdb5cb10c7f6c324886e775d9a3aa87. Im Anschluss wurden app.js, version.json, sw.js und das neue Modul lagerhaus-fach.js über GitHub erneut abgerufen. Versionsstand jeweils V0.9.0, Precache enthält das Fachmodul.</w:t>
+      </w:r>
+    </w:p>
+    <w:p>
+      <w:r>
+        <w:t>Umfang: In der 3D-Ansicht sind Fächer direkt auswählbar. Große Fachkarten listen die Bestände auf; per Volltext werden Kennungen, Namen, Möbel und Artikel gefunden. Über das Buchungsformular wird Bestand eingelagert, entnommen oder zwischen Fächern umgelagert. Artikel- und Standortkennungen werden nicht verändert; Bestände werden atomar zusammen mit Bewegungshistorie aktualisiert.</w:t>
+      </w:r>
+    </w:p>
+    <w:p>
+      <w:r>
+        <w:t>Technische Prüfungen: node release-check.mjs und release-check-l05.mjs bis release-check-l09.mjs erfolgreich; JavaScript-Syntax aller Module bestanden; sämtliche Dateien der Service-Worker-Präcache-Liste vorhanden. Vollständige Browser-Bedienprüfung und Android-Touch-/Offlineprüfung sind NICHT durchgeführt.</w:t>
       </w:r>
     </w:p>
     <w:sectPr>
@@ -3778,6 +3856,342 @@
       </w:sdt>
       <w:r>
         <w:t xml:space="preserve">  L08 – Android-Touch-, Offline- und Update-Praxistest</w:t>
+      </w:r>
+    </w:p>
+    <w:p>
+      <w:pPr>
+        <w:keepNext w:val="0"/>
+        <w:keepLines/>
+        <w:spacing w:before="0" w:after="20" w:line="240" w:lineRule="auto"/>
+      </w:pPr>
+      <w:sdt>
+        <w:sdtPr>
+          <w:alias w:val="Update abgeschlossen"/>
+          <w14:checkbox>
+            <w14:checked w14:val="1"/>
+            <w14:checkedState w14:val="2612" w14:font="MS Gothic"/>
+            <w14:uncheckedState w14:val="2610" w14:font="MS Gothic"/>
+          </w14:checkbox>
+        </w:sdtPr>
+        <w:sdtContent>
+          <w:r>
+            <w:t>☑</w:t>
+          </w:r>
+        </w:sdtContent>
+      </w:sdt>
+      <w:r>
+        <w:rPr>
+          <w:sz w:val="18"/>
+        </w:rPr>
+        <w:t xml:space="preserve">  L09 – Anklickbare 3D-Fachmarkierungen und Fachkarten mit gemeinsamer Kennung</w:t>
+      </w:r>
+    </w:p>
+    <w:p>
+      <w:pPr>
+        <w:keepNext w:val="0"/>
+        <w:keepLines/>
+        <w:spacing w:before="0" w:after="20" w:line="240" w:lineRule="auto"/>
+      </w:pPr>
+      <w:sdt>
+        <w:sdtPr>
+          <w:alias w:val="Update abgeschlossen"/>
+          <w14:checkbox>
+            <w14:checked w14:val="1"/>
+            <w14:checkedState w14:val="2612" w14:font="MS Gothic"/>
+            <w14:uncheckedState w14:val="2610" w14:font="MS Gothic"/>
+          </w14:checkbox>
+        </w:sdtPr>
+        <w:sdtContent>
+          <w:r>
+            <w:t>☑</w:t>
+          </w:r>
+        </w:sdtContent>
+      </w:sdt>
+      <w:r>
+        <w:rPr>
+          <w:sz w:val="18"/>
+        </w:rPr>
+        <w:t xml:space="preserve">  L09 – Suche nach Fachbezeichnung, Code, Möbel und Artikeln implementiert</w:t>
+      </w:r>
+    </w:p>
+    <w:p>
+      <w:pPr>
+        <w:keepNext w:val="0"/>
+        <w:keepLines/>
+        <w:spacing w:before="0" w:after="20" w:line="240" w:lineRule="auto"/>
+      </w:pPr>
+      <w:sdt>
+        <w:sdtPr>
+          <w:alias w:val="Update abgeschlossen"/>
+          <w14:checkbox>
+            <w14:checked w14:val="1"/>
+            <w14:checkedState w14:val="2612" w14:font="MS Gothic"/>
+            <w14:uncheckedState w14:val="2610" w14:font="MS Gothic"/>
+          </w14:checkbox>
+        </w:sdtPr>
+        <w:sdtContent>
+          <w:r>
+            <w:t>☑</w:t>
+          </w:r>
+        </w:sdtContent>
+      </w:sdt>
+      <w:r>
+        <w:rPr>
+          <w:sz w:val="18"/>
+        </w:rPr>
+        <w:t xml:space="preserve">  L09 – Artikelbestände stimmen in Fachkarte mit Artikelverwaltung überein (Logiktests)</w:t>
+      </w:r>
+    </w:p>
+    <w:p>
+      <w:pPr>
+        <w:keepNext w:val="0"/>
+        <w:keepLines/>
+        <w:spacing w:before="0" w:after="20" w:line="240" w:lineRule="auto"/>
+      </w:pPr>
+      <w:sdt>
+        <w:sdtPr>
+          <w:alias w:val="Update abgeschlossen"/>
+          <w14:checkbox>
+            <w14:checked w14:val="1"/>
+            <w14:checkedState w14:val="2612" w14:font="MS Gothic"/>
+            <w14:uncheckedState w14:val="2610" w14:font="MS Gothic"/>
+          </w14:checkbox>
+        </w:sdtPr>
+        <w:sdtContent>
+          <w:r>
+            <w:t>☑</w:t>
+          </w:r>
+        </w:sdtContent>
+      </w:sdt>
+      <w:r>
+        <w:rPr>
+          <w:sz w:val="18"/>
+        </w:rPr>
+        <w:t xml:space="preserve">  L09 – Einlagern, Entnehmen und Umlagern zwischen Fächern implementiert</w:t>
+      </w:r>
+    </w:p>
+    <w:p>
+      <w:pPr>
+        <w:keepNext w:val="0"/>
+        <w:keepLines/>
+        <w:spacing w:before="0" w:after="20" w:line="240" w:lineRule="auto"/>
+      </w:pPr>
+      <w:sdt>
+        <w:sdtPr>
+          <w:alias w:val="Update abgeschlossen"/>
+          <w14:checkbox>
+            <w14:checked w14:val="1"/>
+            <w14:checkedState w14:val="2612" w14:font="MS Gothic"/>
+            <w14:uncheckedState w14:val="2610" w14:font="MS Gothic"/>
+          </w14:checkbox>
+        </w:sdtPr>
+        <w:sdtContent>
+          <w:r>
+            <w:t>☑</w:t>
+          </w:r>
+        </w:sdtContent>
+      </w:sdt>
+      <w:r>
+        <w:rPr>
+          <w:sz w:val="18"/>
+        </w:rPr>
+        <w:t xml:space="preserve">  L09 – Mengenvalidierung, Reservierungsschutz, atomare Buchungen getestet</w:t>
+      </w:r>
+    </w:p>
+    <w:p>
+      <w:pPr>
+        <w:keepNext w:val="0"/>
+        <w:keepLines/>
+        <w:spacing w:before="0" w:after="20" w:line="240" w:lineRule="auto"/>
+      </w:pPr>
+      <w:sdt>
+        <w:sdtPr>
+          <w:alias w:val="Update abgeschlossen"/>
+          <w14:checkbox>
+            <w14:checked w14:val="1"/>
+            <w14:checkedState w14:val="2612" w14:font="MS Gothic"/>
+            <w14:uncheckedState w14:val="2610" w14:font="MS Gothic"/>
+          </w14:checkbox>
+        </w:sdtPr>
+        <w:sdtContent>
+          <w:r>
+            <w:t>☑</w:t>
+          </w:r>
+        </w:sdtContent>
+      </w:sdt>
+      <w:r>
+        <w:rPr>
+          <w:sz w:val="18"/>
+        </w:rPr>
+        <w:t xml:space="preserve">  L09 – Bestehende Lagerdaten und Fach-IDs werden beibehalten</w:t>
+      </w:r>
+    </w:p>
+    <w:p>
+      <w:pPr>
+        <w:keepNext w:val="0"/>
+        <w:keepLines/>
+        <w:spacing w:before="0" w:after="20" w:line="240" w:lineRule="auto"/>
+      </w:pPr>
+      <w:sdt>
+        <w:sdtPr>
+          <w:alias w:val="Update abgeschlossen"/>
+          <w14:checkbox>
+            <w14:checked w14:val="1"/>
+            <w14:checkedState w14:val="2612" w14:font="MS Gothic"/>
+            <w14:uncheckedState w14:val="2610" w14:font="MS Gothic"/>
+          </w14:checkbox>
+        </w:sdtPr>
+        <w:sdtContent>
+          <w:r>
+            <w:t>☑</w:t>
+          </w:r>
+        </w:sdtContent>
+      </w:sdt>
+      <w:r>
+        <w:rPr>
+          <w:sz w:val="18"/>
+        </w:rPr>
+        <w:t xml:space="preserve">  L09 – L04–L08-Regressions- und neue L09-Funktionstests bestanden</w:t>
+      </w:r>
+    </w:p>
+    <w:p>
+      <w:pPr>
+        <w:keepNext w:val="0"/>
+        <w:keepLines/>
+        <w:spacing w:before="0" w:after="20" w:line="240" w:lineRule="auto"/>
+      </w:pPr>
+      <w:sdt>
+        <w:sdtPr>
+          <w:alias w:val="Update abgeschlossen"/>
+          <w14:checkbox>
+            <w14:checked w14:val="1"/>
+            <w14:checkedState w14:val="2612" w14:font="MS Gothic"/>
+            <w14:uncheckedState w14:val="2610" w14:font="MS Gothic"/>
+          </w14:checkbox>
+        </w:sdtPr>
+        <w:sdtContent>
+          <w:r>
+            <w:t>☑</w:t>
+          </w:r>
+        </w:sdtContent>
+      </w:sdt>
+      <w:r>
+        <w:rPr>
+          <w:sz w:val="18"/>
+        </w:rPr>
+        <w:t xml:space="preserve">  L09 – Versionsdatei, Service Worker, Syntax und GitHub-Dateiabgleich geprüft</w:t>
+      </w:r>
+    </w:p>
+    <w:p>
+      <w:pPr>
+        <w:keepNext w:val="0"/>
+        <w:keepLines/>
+        <w:spacing w:before="0" w:after="20" w:line="240" w:lineRule="auto"/>
+      </w:pPr>
+      <w:sdt>
+        <w:sdtPr>
+          <w:alias w:val="Update abgeschlossen"/>
+          <w14:checkbox>
+            <w14:checked w14:val="1"/>
+            <w14:checkedState w14:val="2612" w14:font="MS Gothic"/>
+            <w14:uncheckedState w14:val="2610" w14:font="MS Gothic"/>
+          </w14:checkbox>
+        </w:sdtPr>
+        <w:sdtContent>
+          <w:r>
+            <w:t>☑</w:t>
+          </w:r>
+        </w:sdtContent>
+      </w:sdt>
+      <w:r>
+        <w:rPr>
+          <w:sz w:val="18"/>
+        </w:rPr>
+        <w:t xml:space="preserve">  L09 – GitHub main veröffentlicht und Code erneut abgerufen</w:t>
+      </w:r>
+    </w:p>
+    <w:p>
+      <w:pPr>
+        <w:keepNext w:val="0"/>
+        <w:keepLines/>
+        <w:spacing w:before="0" w:after="20" w:line="240" w:lineRule="auto"/>
+      </w:pPr>
+      <w:sdt>
+        <w:sdtPr>
+          <w:alias w:val="Update abgeschlossen"/>
+          <w14:checkbox>
+            <w14:checked w14:val="1"/>
+            <w14:checkedState w14:val="2612" w14:font="MS Gothic"/>
+            <w14:uncheckedState w14:val="2610" w14:font="MS Gothic"/>
+          </w14:checkbox>
+        </w:sdtPr>
+        <w:sdtContent>
+          <w:r>
+            <w:t>☑</w:t>
+          </w:r>
+        </w:sdtContent>
+      </w:sdt>
+      <w:r>
+        <w:rPr>
+          <w:sz w:val="18"/>
+        </w:rPr>
+        <w:t xml:space="preserve">  L09 – ZIP inklusive aktualisierter Word-Mastercheckliste geprüft</w:t>
+      </w:r>
+    </w:p>
+    <w:p>
+      <w:pPr>
+        <w:keepNext w:val="0"/>
+        <w:keepLines/>
+        <w:spacing w:before="0" w:after="20" w:line="240" w:lineRule="auto"/>
+      </w:pPr>
+      <w:sdt>
+        <w:sdtPr>
+          <w:alias w:val="Update abgeschlossen"/>
+          <w14:checkbox>
+            <w14:checked w14:val="0"/>
+            <w14:checkedState w14:val="2612" w14:font="MS Gothic"/>
+            <w14:uncheckedState w14:val="2610" w14:font="MS Gothic"/>
+          </w14:checkbox>
+        </w:sdtPr>
+        <w:sdtContent>
+          <w:r>
+            <w:t>☐</w:t>
+          </w:r>
+        </w:sdtContent>
+      </w:sdt>
+      <w:r>
+        <w:rPr>
+          <w:sz w:val="18"/>
+        </w:rPr>
+        <w:t xml:space="preserve">  L09 – Realer Browser-End-to-End-Test unter Chrome abgeschlossen</w:t>
+      </w:r>
+    </w:p>
+    <w:p>
+      <w:pPr>
+        <w:keepNext w:val="0"/>
+        <w:keepLines/>
+        <w:spacing w:before="0" w:after="20" w:line="240" w:lineRule="auto"/>
+      </w:pPr>
+      <w:sdt>
+        <w:sdtPr>
+          <w:alias w:val="Update abgeschlossen"/>
+          <w14:checkbox>
+            <w14:checked w14:val="0"/>
+            <w14:checkedState w14:val="2612" w14:font="MS Gothic"/>
+            <w14:uncheckedState w14:val="2610" w14:font="MS Gothic"/>
+          </w14:checkbox>
+        </w:sdtPr>
+        <w:sdtContent>
+          <w:r>
+            <w:t>☐</w:t>
+          </w:r>
+        </w:sdtContent>
+      </w:sdt>
+      <w:r>
+        <w:rPr>
+          <w:sz w:val="18"/>
+        </w:rPr>
+        <w:t xml:space="preserve">  L09 – Android-Touch-/Offline-/Updateprüfung abgeschlossen</w:t>
       </w:r>
     </w:p>
   </w:body>

</xml_diff>

<commit_message>
L10: Word-Mastercheckliste abgehakt, ZIP-Abnahme und Fotoauswahl finalisiert
</commit_message>
<xml_diff>
--- a/DOKUMENTATION/bauhaus.docx
+++ b/DOKUMENTATION/bauhaus.docx
@@ -27,9 +27,8 @@
       <w:pPr>
         <w:jc w:val="center"/>
       </w:pPr>
-      <w:r/>
-      <w:r>
-        <w:t>Stand: 27. Oktober 2026   •   Basis: Mein Alltag V0.0.2   •   Aktuelle App-Version: V0.9.0 (L09)</w:t>
+      <w:r>
+        <w:t>Stand: 27. Oktober 2026   •   Basis: Mein Alltag V0.0.2   •   Aktuelle App-Version: V0.10.0 (L10)</w:t>
       </w:r>
     </w:p>
     <w:p>
@@ -89,11 +88,9 @@
       </w:r>
     </w:p>
     <w:p>
-      <w:r>
-        <w:t>Abgeschlossen (Code und GitHub): 9 / 36 Updates   |   Offen: 27 / 36 Updates. L09 auf GitHub main in V0.9.0 veröffentlicht (Commit 72b4a74c). Chrome-/Android-Praxistest weiterhin offen.</w:t>
-      </w:r>
-      <w:r>
-        <w:t>Abgeschlossen (Code und GitHub): 9 / 36 Updates   |   Offen: 27 / 36 Updates. L09 auf GitHub main in V0.9.0 veröffentlicht (Commit 72b4a74c). Chrome-/Android-Praxistest weiterhin offen.</w:t>
+      <w:pPr/>
+      <w:r>
+        <w:t>Abgeschlossen (Code und GitHub): 10 / 36 Updates   |   Offen: 26 / 36 Updates. L10 auf GitHub main in V0.10.0 veröffentlicht (Commit 666a234d). Chrome-/Android-Praxistest weiterhin offen.</w:t>
       </w:r>
     </w:p>
     <w:p>
@@ -662,14 +659,14 @@
         <w:sdtPr>
           <w:alias w:val="Update abgeschlossen"/>
           <w14:checkbox>
-            <w14:checked w14:val="0"/>
+            <w14:checked w14:val="1"/>
             <w14:checkedState w14:val="2612" w14:font="MS Gothic"/>
             <w14:uncheckedState w14:val="2610" w14:font="MS Gothic"/>
           </w14:checkbox>
         </w:sdtPr>
         <w:sdtContent>
           <w:r>
-            <w:t>☐</w:t>
+            <w:t>☑</w:t>
           </w:r>
         </w:sdtContent>
       </w:sdt>
@@ -703,6 +700,12 @@
       </w:r>
       <w:r>
         <w:t>Fotos nach Neuladen verfügbar; keine unkontrollierte Qualitätsverluste.</w:t>
+      </w:r>
+    </w:p>
+    <w:p>
+      <w:pPr/>
+      <w:r>
+        <w:t>Status L10: Beta V0.10.0 am 27.10.2026 auf GitHub main veröffentlicht (Code-Commit 666a234d7e72ecb81ecee2ba661f97ae97c58ef7). Mehrere Bilder je Artikel und Lagerort mit Kamera/Galerie, Hauptbild, Kategorien, Vorschau und optional unveränderter Originaldatei. L04–L10 Modell-/Syntaxprüfungen und Bildkodierung im Chromium-Canvas-Test bestanden. Vollständiger Browser-End-to-End-Test lokal blockiert; Android-Praxistest offen.</w:t>
       </w:r>
     </w:p>
     <w:p>
@@ -2745,6 +2748,48 @@
           </w:p>
         </w:tc>
       </w:tr>
+      <w:tr>
+        <w:tc>
+          <w:tcPr>
+            <w:tcW w:type="dxa" w:w="2465"/>
+          </w:tcPr>
+          <w:p>
+            <w:r>
+              <w:t>L10</w:t>
+            </w:r>
+          </w:p>
+        </w:tc>
+        <w:tc>
+          <w:tcPr>
+            <w:tcW w:type="dxa" w:w="2465"/>
+          </w:tcPr>
+          <w:p>
+            <w:r>
+              <w:t>0.10.0</w:t>
+            </w:r>
+          </w:p>
+        </w:tc>
+        <w:tc>
+          <w:tcPr>
+            <w:tcW w:type="dxa" w:w="2465"/>
+          </w:tcPr>
+          <w:p>
+            <w:r>
+              <w:t>27.10.2026</w:t>
+            </w:r>
+          </w:p>
+        </w:tc>
+        <w:tc>
+          <w:tcPr>
+            <w:tcW w:type="dxa" w:w="2465"/>
+          </w:tcPr>
+          <w:p>
+            <w:r>
+              <w:t>GitHub: 666a234d · Node/Canvas PASS · Android offen</w:t>
+            </w:r>
+          </w:p>
+        </w:tc>
+      </w:tr>
     </w:tbl>
     <w:p>
       <w:pPr>
@@ -3450,6 +3495,29 @@
     <w:p>
       <w:r>
         <w:t>Technische Prüfungen: node release-check.mjs und release-check-l05.mjs bis release-check-l09.mjs erfolgreich; JavaScript-Syntax aller Module bestanden; sämtliche Dateien der Service-Worker-Präcache-Liste vorhanden. Vollständige Browser-Bedienprüfung und Android-Touch-/Offlineprüfung sind NICHT durchgeführt.</w:t>
+      </w:r>
+    </w:p>
+    <w:p>
+      <w:pPr>
+        <w:pStyle w:val="Heading2"/>
+      </w:pPr>
+      <w:r>
+        <w:t>L10 · Veröffentlichung V0.10.0 / Lokales Fotoarchiv</w:t>
+      </w:r>
+    </w:p>
+    <w:p>
+      <w:r>
+        <w:t>GitHub main: Code-Commit 666a234d7e72ecb81ecee2ba661f97ae97c58ef7. Version 0.10.0 und das neue Modul lagerhaus-photos.js wurden nach Veröffentlichung über GitHub erneut abgerufen. Der Service-Worker-Cache heißt mein-alltag-v0-10-0.</w:t>
+      </w:r>
+    </w:p>
+    <w:p>
+      <w:r>
+        <w:t>Umfang: Bilder mit stabilen Artikel-/Lagerort-IDs, Mehrfachauswahl und Kameraeingabe, Hauptbild, Kategorien, Beschreibung, Vorschau, Originalmodus oder optionale 90-%-WebP-Kopie bis 2048 px, getrennte lokale Blob-/Metadatenverwaltung. Artikelbilder werden beim Löschen des Artikels atomar mit entfernt. Bilder gelöschter Lagerorte bleiben zur manuellen Sicherung abrufbar. Keine automatische Cloud-Sicherung.</w:t>
+      </w:r>
+    </w:p>
+    <w:p>
+      <w:r>
+        <w:t>Tests: L04–L10 Node- und JS-Syntaxprüfungen PASS. Canvas-Bildverarbeitung unter Chromium about:blank mit Originalbytes und WebP-Zielauflösung PASS. Die vollständige lokale Browsernavigation ist mit ERR_BLOCKED_BY_ADMINISTRATOR blockiert. Echte Android-Kamera-, Galerie-, IndexedDB-Wiederöffnungs-, Offline- und Update-Prüfung ist ausstehend; diese Punkte dürfen nicht als bestanden gelten.</w:t>
       </w:r>
     </w:p>
     <w:sectPr>
@@ -4192,6 +4260,370 @@
           <w:sz w:val="18"/>
         </w:rPr>
         <w:t xml:space="preserve">  L09 – Android-Touch-/Offline-/Updateprüfung abgeschlossen</w:t>
+      </w:r>
+    </w:p>
+    <w:p>
+      <w:pPr>
+        <w:keepNext w:val="0"/>
+        <w:keepLines/>
+        <w:spacing w:before="0" w:after="20" w:line="240" w:lineRule="auto"/>
+      </w:pPr>
+      <w:sdt>
+        <w:sdtPr>
+          <w:alias w:val="Update abgeschlossen"/>
+          <w14:checkbox>
+            <w14:checked w14:val="1"/>
+            <w14:checkedState w14:val="2612" w14:font="MS Gothic"/>
+            <w14:uncheckedState w14:val="2610" w14:font="MS Gothic"/>
+          </w14:checkbox>
+        </w:sdtPr>
+        <w:sdtContent>
+          <w:r>
+            <w:t>☑</w:t>
+          </w:r>
+        </w:sdtContent>
+      </w:sdt>
+      <w:r>
+        <w:rPr>
+          <w:sz w:val="18"/>
+        </w:rPr>
+        <w:t xml:space="preserve">  L10 – Lokales Fotoarchiv für Artikel und Lagerorte implementiert</w:t>
+      </w:r>
+    </w:p>
+    <w:p>
+      <w:pPr>
+        <w:keepNext w:val="0"/>
+        <w:keepLines/>
+        <w:spacing w:before="0" w:after="20" w:line="240" w:lineRule="auto"/>
+      </w:pPr>
+      <w:sdt>
+        <w:sdtPr>
+          <w:alias w:val="Update abgeschlossen"/>
+          <w14:checkbox>
+            <w14:checked w14:val="1"/>
+            <w14:checkedState w14:val="2612" w14:font="MS Gothic"/>
+            <w14:uncheckedState w14:val="2610" w14:font="MS Gothic"/>
+          </w14:checkbox>
+        </w:sdtPr>
+        <w:sdtContent>
+          <w:r>
+            <w:t>☑</w:t>
+          </w:r>
+        </w:sdtContent>
+      </w:sdt>
+      <w:r>
+        <w:rPr>
+          <w:sz w:val="18"/>
+        </w:rPr>
+        <w:t xml:space="preserve">  L10 – Kamera-/Galerie-Auswahl und mehrere Fotos pro Zuordnung implementiert</w:t>
+      </w:r>
+    </w:p>
+    <w:p>
+      <w:pPr>
+        <w:keepNext w:val="0"/>
+        <w:keepLines/>
+        <w:spacing w:before="0" w:after="20" w:line="240" w:lineRule="auto"/>
+      </w:pPr>
+      <w:sdt>
+        <w:sdtPr>
+          <w:alias w:val="Update abgeschlossen"/>
+          <w14:checkbox>
+            <w14:checked w14:val="1"/>
+            <w14:checkedState w14:val="2612" w14:font="MS Gothic"/>
+            <w14:uncheckedState w14:val="2610" w14:font="MS Gothic"/>
+          </w14:checkbox>
+        </w:sdtPr>
+        <w:sdtContent>
+          <w:r>
+            <w:t>☑</w:t>
+          </w:r>
+        </w:sdtContent>
+      </w:sdt>
+      <w:r>
+        <w:rPr>
+          <w:sz w:val="18"/>
+        </w:rPr>
+        <w:t xml:space="preserve">  L10 – Hauptbild, sechs Kategorien und Beschreibungen umgesetzt</w:t>
+      </w:r>
+    </w:p>
+    <w:p>
+      <w:pPr>
+        <w:keepNext w:val="0"/>
+        <w:keepLines/>
+        <w:spacing w:before="0" w:after="20" w:line="240" w:lineRule="auto"/>
+      </w:pPr>
+      <w:sdt>
+        <w:sdtPr>
+          <w:alias w:val="Update abgeschlossen"/>
+          <w14:checkbox>
+            <w14:checked w14:val="1"/>
+            <w14:checkedState w14:val="2612" w14:font="MS Gothic"/>
+            <w14:uncheckedState w14:val="2610" w14:font="MS Gothic"/>
+          </w14:checkbox>
+        </w:sdtPr>
+        <w:sdtContent>
+          <w:r>
+            <w:t>☑</w:t>
+          </w:r>
+        </w:sdtContent>
+      </w:sdt>
+      <w:r>
+        <w:rPr>
+          <w:sz w:val="18"/>
+        </w:rPr>
+        <w:t xml:space="preserve">  L10 – Thumbnail und vergrößerte Bildvorschau implementiert</w:t>
+      </w:r>
+    </w:p>
+    <w:p>
+      <w:pPr>
+        <w:keepNext w:val="0"/>
+        <w:keepLines/>
+        <w:spacing w:before="0" w:after="20" w:line="240" w:lineRule="auto"/>
+      </w:pPr>
+      <w:sdt>
+        <w:sdtPr>
+          <w:alias w:val="Update abgeschlossen"/>
+          <w14:checkbox>
+            <w14:checked w14:val="1"/>
+            <w14:checkedState w14:val="2612" w14:font="MS Gothic"/>
+            <w14:uncheckedState w14:val="2610" w14:font="MS Gothic"/>
+          </w14:checkbox>
+        </w:sdtPr>
+        <w:sdtContent>
+          <w:r>
+            <w:t>☑</w:t>
+          </w:r>
+        </w:sdtContent>
+      </w:sdt>
+      <w:r>
+        <w:rPr>
+          <w:sz w:val="18"/>
+        </w:rPr>
+        <w:t xml:space="preserve">  L10 – Originaldatei wählbar; schonende optionale WebP-Komprimierung getestet</w:t>
+      </w:r>
+    </w:p>
+    <w:p>
+      <w:pPr>
+        <w:keepNext w:val="0"/>
+        <w:keepLines/>
+        <w:spacing w:before="0" w:after="20" w:line="240" w:lineRule="auto"/>
+      </w:pPr>
+      <w:sdt>
+        <w:sdtPr>
+          <w:alias w:val="Update abgeschlossen"/>
+          <w14:checkbox>
+            <w14:checked w14:val="1"/>
+            <w14:checkedState w14:val="2612" w14:font="MS Gothic"/>
+            <w14:uncheckedState w14:val="2610" w14:font="MS Gothic"/>
+          </w14:checkbox>
+        </w:sdtPr>
+        <w:sdtContent>
+          <w:r>
+            <w:t>☑</w:t>
+          </w:r>
+        </w:sdtContent>
+      </w:sdt>
+      <w:r>
+        <w:rPr>
+          <w:sz w:val="18"/>
+        </w:rPr>
+        <w:t xml:space="preserve">  L10 – Atomare Bild-/Metadatenverwaltung und Löschschutz umgesetzt</w:t>
+      </w:r>
+    </w:p>
+    <w:p>
+      <w:pPr>
+        <w:keepNext w:val="0"/>
+        <w:keepLines/>
+        <w:spacing w:before="0" w:after="20" w:line="240" w:lineRule="auto"/>
+      </w:pPr>
+      <w:sdt>
+        <w:sdtPr>
+          <w:alias w:val="Update abgeschlossen"/>
+          <w14:checkbox>
+            <w14:checked w14:val="1"/>
+            <w14:checkedState w14:val="2612" w14:font="MS Gothic"/>
+            <w14:uncheckedState w14:val="2610" w14:font="MS Gothic"/>
+          </w14:checkbox>
+        </w:sdtPr>
+        <w:sdtContent>
+          <w:r>
+            <w:t>☑</w:t>
+          </w:r>
+        </w:sdtContent>
+      </w:sdt>
+      <w:r>
+        <w:rPr>
+          <w:sz w:val="18"/>
+        </w:rPr>
+        <w:t xml:space="preserve">  L10 – Bestands-, Artikel- und Raumdaten bleiben bei Fotomutationen getrennt</w:t>
+      </w:r>
+    </w:p>
+    <w:p>
+      <w:pPr>
+        <w:keepNext w:val="0"/>
+        <w:keepLines/>
+        <w:spacing w:before="0" w:after="20" w:line="240" w:lineRule="auto"/>
+      </w:pPr>
+      <w:sdt>
+        <w:sdtPr>
+          <w:alias w:val="Update abgeschlossen"/>
+          <w14:checkbox>
+            <w14:checked w14:val="1"/>
+            <w14:checkedState w14:val="2612" w14:font="MS Gothic"/>
+            <w14:uncheckedState w14:val="2610" w14:font="MS Gothic"/>
+          </w14:checkbox>
+        </w:sdtPr>
+        <w:sdtContent>
+          <w:r>
+            <w:t>☑</w:t>
+          </w:r>
+        </w:sdtContent>
+      </w:sdt>
+      <w:r>
+        <w:rPr>
+          <w:sz w:val="18"/>
+        </w:rPr>
+        <w:t xml:space="preserve">  L10 – L04–L10-Regressions- und sämtliche Syntaxprüfungen bestanden</w:t>
+      </w:r>
+    </w:p>
+    <w:p>
+      <w:pPr>
+        <w:keepNext w:val="0"/>
+        <w:keepLines/>
+        <w:spacing w:before="0" w:after="20" w:line="240" w:lineRule="auto"/>
+      </w:pPr>
+      <w:sdt>
+        <w:sdtPr>
+          <w:alias w:val="Update abgeschlossen"/>
+          <w14:checkbox>
+            <w14:checked w14:val="1"/>
+            <w14:checkedState w14:val="2612" w14:font="MS Gothic"/>
+            <w14:uncheckedState w14:val="2610" w14:font="MS Gothic"/>
+          </w14:checkbox>
+        </w:sdtPr>
+        <w:sdtContent>
+          <w:r>
+            <w:t>☑</w:t>
+          </w:r>
+        </w:sdtContent>
+      </w:sdt>
+      <w:r>
+        <w:rPr>
+          <w:sz w:val="18"/>
+        </w:rPr>
+        <w:t xml:space="preserve">  L10 – Browser-Canvas-Komprimierung und Originaltreue geprüft</w:t>
+      </w:r>
+    </w:p>
+    <w:p>
+      <w:pPr>
+        <w:keepNext w:val="0"/>
+        <w:keepLines/>
+        <w:spacing w:before="0" w:after="20" w:line="240" w:lineRule="auto"/>
+      </w:pPr>
+      <w:sdt>
+        <w:sdtPr>
+          <w:alias w:val="Update abgeschlossen"/>
+          <w14:checkbox>
+            <w14:checked w14:val="1"/>
+            <w14:checkedState w14:val="2612" w14:font="MS Gothic"/>
+            <w14:uncheckedState w14:val="2610" w14:font="MS Gothic"/>
+          </w14:checkbox>
+        </w:sdtPr>
+        <w:sdtContent>
+          <w:r>
+            <w:t>☑</w:t>
+          </w:r>
+        </w:sdtContent>
+      </w:sdt>
+      <w:r>
+        <w:rPr>
+          <w:sz w:val="18"/>
+        </w:rPr>
+        <w:t xml:space="preserve">  L10 – GitHub main veröffentlicht, Version/Dateien erneut abgerufen</w:t>
+      </w:r>
+    </w:p>
+    <w:p>
+      <w:pPr>
+        <w:keepNext w:val="0"/>
+        <w:keepLines/>
+        <w:spacing w:before="0" w:after="20" w:line="240" w:lineRule="auto"/>
+      </w:pPr>
+      <w:sdt>
+        <w:sdtPr>
+          <w:alias w:val="Update abgeschlossen"/>
+          <w14:checkbox>
+            <w14:checked w14:val="1"/>
+            <w14:checkedState w14:val="2612" w14:font="MS Gothic"/>
+            <w14:uncheckedState w14:val="2610" w14:font="MS Gothic"/>
+          </w14:checkbox>
+        </w:sdtPr>
+        <w:sdtContent>
+          <w:r>
+            <w:t>☑</w:t>
+          </w:r>
+        </w:sdtContent>
+      </w:sdt>
+      <w:r>
+        <w:rPr>
+          <w:sz w:val="18"/>
+        </w:rPr>
+        <w:t xml:space="preserve">  L10 – ZIP einschließlich aktueller bauhaus.docx erstellt und geprüft</w:t>
+      </w:r>
+    </w:p>
+    <w:p>
+      <w:pPr>
+        <w:keepNext w:val="0"/>
+        <w:keepLines/>
+        <w:spacing w:before="0" w:after="20" w:line="240" w:lineRule="auto"/>
+      </w:pPr>
+      <w:sdt>
+        <w:sdtPr>
+          <w:alias w:val="Update abgeschlossen"/>
+          <w14:checkbox>
+            <w14:checked w14:val="0"/>
+            <w14:checkedState w14:val="2612" w14:font="MS Gothic"/>
+            <w14:uncheckedState w14:val="2610" w14:font="MS Gothic"/>
+          </w14:checkbox>
+        </w:sdtPr>
+        <w:sdtContent>
+          <w:r>
+            <w:t>☐</w:t>
+          </w:r>
+        </w:sdtContent>
+      </w:sdt>
+      <w:r>
+        <w:rPr>
+          <w:sz w:val="18"/>
+        </w:rPr>
+        <w:t xml:space="preserve">  L10 – Vollständige Chrome-Browser-End-to-End-Prüfung</w:t>
+      </w:r>
+    </w:p>
+    <w:p>
+      <w:pPr>
+        <w:keepNext w:val="0"/>
+        <w:keepLines/>
+        <w:spacing w:before="0" w:after="20" w:line="240" w:lineRule="auto"/>
+      </w:pPr>
+      <w:sdt>
+        <w:sdtPr>
+          <w:alias w:val="Update abgeschlossen"/>
+          <w14:checkbox>
+            <w14:checked w14:val="0"/>
+            <w14:checkedState w14:val="2612" w14:font="MS Gothic"/>
+            <w14:uncheckedState w14:val="2610" w14:font="MS Gothic"/>
+          </w14:checkbox>
+        </w:sdtPr>
+        <w:sdtContent>
+          <w:r>
+            <w:t>☐</w:t>
+          </w:r>
+        </w:sdtContent>
+      </w:sdt>
+      <w:r>
+        <w:rPr>
+          <w:sz w:val="18"/>
+        </w:rPr>
+        <w:t xml:space="preserve">  L10 – Reale Android-Kamera-/Galerie-/Offline-/Updateprüfung</w:t>
       </w:r>
     </w:p>
   </w:body>

</xml_diff>

<commit_message>
L11: geprüfte Word-Mastercheckliste, 11 von 36 Updates abgehakt
</commit_message>
<xml_diff>
--- a/DOKUMENTATION/bauhaus.docx
+++ b/DOKUMENTATION/bauhaus.docx
@@ -28,7 +28,7 @@
         <w:jc w:val="center"/>
       </w:pPr>
       <w:r>
-        <w:t>Stand: 27. Oktober 2026   •   Basis: Mein Alltag V0.0.2   •   Aktuelle App-Version: V0.10.0 (L10)</w:t>
+        <w:t>Stand: 27. Oktober 2026   •   Basis: Mein Alltag V0.0.2   •   Aktuelle App-Version: V0.11.0 (L11)</w:t>
       </w:r>
     </w:p>
     <w:p>
@@ -90,7 +90,7 @@
     <w:p>
       <w:pPr/>
       <w:r>
-        <w:t>Abgeschlossen (Code und GitHub): 10 / 36 Updates   |   Offen: 26 / 36 Updates. L10 auf GitHub main in V0.10.0 veröffentlicht (Commit 666a234d). Chrome-/Android-Praxistest weiterhin offen.</w:t>
+        <w:t>Abgeschlossen (Code und GitHub): 11 / 36 Updates   |   Offen: 25 / 36 Updates. L11 auf GitHub main in V0.11.0 veröffentlicht (Commit f11d7c29). Chrome-/Android-Praxistest weiterhin offen.</w:t>
       </w:r>
     </w:p>
     <w:p>
@@ -717,14 +717,14 @@
         <w:sdtPr>
           <w:alias w:val="Update abgeschlossen"/>
           <w14:checkbox>
-            <w14:checked w14:val="0"/>
+            <w14:checked w14:val="1"/>
             <w14:checkedState w14:val="2612" w14:font="MS Gothic"/>
             <w14:uncheckedState w14:val="2610" w14:font="MS Gothic"/>
           </w14:checkbox>
         </w:sdtPr>
         <w:sdtContent>
           <w:r>
-            <w:t>☐</w:t>
+            <w:t>☑</w:t>
           </w:r>
         </w:sdtContent>
       </w:sdt>
@@ -758,6 +758,11 @@
       </w:r>
       <w:r>
         <w:t>Alte und aktuelle Aufnahmen korrekt zugeordnet; löschen ohne Fremddatenverlust.</w:t>
+      </w:r>
+    </w:p>
+    <w:p>
+      <w:r>
+        <w:t>Status L11: Beta V0.11.0 am 27.10.2026 auf GitHub main veröffentlicht (Code-Commit f11d7c29b26c0d9bc405ec3773d0d1f5dc9305d8). Vorher/Nachher/Zwischenstand/Bestandsaufnahme mit frei benennbaren Vergleichsreihen und optional manuell gesetztem Aufnahmedatum. Filter nach Kategorie/Phase, Suche und chronologische Reihenfolge; Vergleich zweier Fotos innerhalb desselben Artikels bzw. Lagerortes. Einzelbild-Download und Löschung ohne Änderung fremder Daten. Bereits gespeicherte L10-Fotos bleiben erhalten; ohne Aufnahmedatum wird ausdrücklich das Importdatum angezeigt. Node-Regressionen L04–L11 und JS-Syntax bestanden. Komplette Browser-Navigation ist durch ERR_BLOCKED_BY_ADMINISTRATOR gesperrt, Android-Praxistests offen.</w:t>
       </w:r>
     </w:p>
     <w:p>
@@ -2790,6 +2795,48 @@
           </w:p>
         </w:tc>
       </w:tr>
+      <w:tr>
+        <w:tc>
+          <w:tcPr>
+            <w:tcW w:type="dxa" w:w="2465"/>
+          </w:tcPr>
+          <w:p>
+            <w:r>
+              <w:t>L11</w:t>
+            </w:r>
+          </w:p>
+        </w:tc>
+        <w:tc>
+          <w:tcPr>
+            <w:tcW w:type="dxa" w:w="2465"/>
+          </w:tcPr>
+          <w:p>
+            <w:r>
+              <w:t>0.11.0</w:t>
+            </w:r>
+          </w:p>
+        </w:tc>
+        <w:tc>
+          <w:tcPr>
+            <w:tcW w:type="dxa" w:w="2465"/>
+          </w:tcPr>
+          <w:p>
+            <w:r>
+              <w:t>27.10.2026</w:t>
+            </w:r>
+          </w:p>
+        </w:tc>
+        <w:tc>
+          <w:tcPr>
+            <w:tcW w:type="dxa" w:w="2465"/>
+          </w:tcPr>
+          <w:p>
+            <w:r>
+              <w:t>GitHub: f11d7c29 · Node PASS · Android offen</w:t>
+            </w:r>
+          </w:p>
+        </w:tc>
+      </w:tr>
     </w:tbl>
     <w:p>
       <w:pPr>
@@ -3527,23 +3574,26 @@
       <w:docGrid w:linePitch="360"/>
     </w:sectPr>
     <w:p>
-      <w:sdt>
-        <w:sdtPr>
-          <w:alias w:val="Update abgeschlossen"/>
-          <w14:checkbox>
-            <w14:checked w14:val="1"/>
-            <w14:checkedState w14:val="2612" w14:font="MS Gothic"/>
-            <w14:uncheckedState w14:val="2610" w14:font="MS Gothic"/>
-          </w14:checkbox>
-        </w:sdtPr>
-        <w:sdtContent>
-          <w:r>
-            <w:t>☑</w:t>
-          </w:r>
-        </w:sdtContent>
-      </w:sdt>
-      <w:r>
-        <w:t xml:space="preserve">  L07 – Einlagern, Entnehmen und Umlagern mit mehreren Lagerorten implementiert</w:t>
+      <w:pPr>
+        <w:pStyle w:val="Heading2"/>
+      </w:pPr>
+      <w:r>
+        <w:t>L11 · Veröffentlichung V0.11.0 / Fotohistorie und Vergleich</w:t>
+      </w:r>
+    </w:p>
+    <w:p>
+      <w:r>
+        <w:t>GitHub main: Code-Commit f11d7c29b26c0d9bc405ec3773d0d1f5dc9305d8. Veröffentlicht 27.10.2026. Version 0.11.0 und Service-Worker-Cache mein-alltag-v0-11-0. Alle bestehenden Store- und Foto-Indexschlüssel bleiben unverändert.</w:t>
+      </w:r>
+    </w:p>
+    <w:p>
+      <w:r>
+        <w:t>Umfang: Zustandsphasen Vorher/Nachher/Zwischenstand/Bestandsaufnahme; frei benennbare Vergleichsreihen; optionales Aufnahmedatum; Sortierung/Filter/Suche; Zwei-Bild-Ansicht mit Zuordnungsschutz; Bilddownload und Metadatenpflege. L10-Fotos brauchen keine Migration und bleiben zugeordnet.</w:t>
+      </w:r>
+    </w:p>
+    <w:p>
+      <w:r>
+        <w:t>Tests: L04–L11 Node-Regressionsprüfungen PASS; Syntax sämtlicher produktiver JS-Dateien PASS; Service-Worker-Precache vollständig. Kein bestandener interaktiver Chrome-/Android-End-to-End-Test wegen ERR_BLOCKED_BY_ADMINISTRATOR, Gerätetest offen. ZIP/Word-Datei werden nach der Dokumentation separat geprüft.</w:t>
       </w:r>
     </w:p>
     <w:p>
@@ -3563,7 +3613,7 @@
         </w:sdtContent>
       </w:sdt>
       <w:r>
-        <w:t xml:space="preserve">  L07 – Atomare Bestandsbuchungen und Schutz gegen negative Mengen getestet</w:t>
+        <w:t xml:space="preserve">  L07 – Einlagern, Entnehmen und Umlagern mit mehreren Lagerorten implementiert</w:t>
       </w:r>
     </w:p>
     <w:p>
@@ -3583,7 +3633,7 @@
         </w:sdtContent>
       </w:sdt>
       <w:r>
-        <w:t xml:space="preserve">  L07 – Packungsgrößen, Mindestbestand und Buchungsprotokoll getestet</w:t>
+        <w:t xml:space="preserve">  L07 – Atomare Bestandsbuchungen und Schutz gegen negative Mengen getestet</w:t>
       </w:r>
     </w:p>
     <w:p>
@@ -3603,7 +3653,7 @@
         </w:sdtContent>
       </w:sdt>
       <w:r>
-        <w:t xml:space="preserve">  L07 – L04–L06-Regressions- und L07-Logiktests bestanden</w:t>
+        <w:t xml:space="preserve">  L07 – Packungsgrößen, Mindestbestand und Buchungsprotokoll getestet</w:t>
       </w:r>
     </w:p>
     <w:p>
@@ -3623,7 +3673,7 @@
         </w:sdtContent>
       </w:sdt>
       <w:r>
-        <w:t xml:space="preserve">  L07 – App/Service Worker/Versionsdatei V0.7.0 geprüft</w:t>
+        <w:t xml:space="preserve">  L07 – L04–L06-Regressions- und L07-Logiktests bestanden</w:t>
       </w:r>
     </w:p>
     <w:p>
@@ -3643,7 +3693,7 @@
         </w:sdtContent>
       </w:sdt>
       <w:r>
-        <w:t xml:space="preserve">  L07 – GitHub main veröffentlicht und Dateien erneut abgerufen</w:t>
+        <w:t xml:space="preserve">  L07 – App/Service Worker/Versionsdatei V0.7.0 geprüft</w:t>
       </w:r>
     </w:p>
     <w:p>
@@ -3663,6 +3713,26 @@
         </w:sdtContent>
       </w:sdt>
       <w:r>
+        <w:t xml:space="preserve">  L07 – GitHub main veröffentlicht und Dateien erneut abgerufen</w:t>
+      </w:r>
+    </w:p>
+    <w:p>
+      <w:sdt>
+        <w:sdtPr>
+          <w:alias w:val="Update abgeschlossen"/>
+          <w14:checkbox>
+            <w14:checked w14:val="1"/>
+            <w14:checkedState w14:val="2612" w14:font="MS Gothic"/>
+            <w14:uncheckedState w14:val="2610" w14:font="MS Gothic"/>
+          </w14:checkbox>
+        </w:sdtPr>
+        <w:sdtContent>
+          <w:r>
+            <w:t>☑</w:t>
+          </w:r>
+        </w:sdtContent>
+      </w:sdt>
+      <w:r>
         <w:t xml:space="preserve">  L07 – Vollständige ZIP mit bauhaus.docx erstellt und geprüft</w:t>
       </w:r>
     </w:p>
@@ -4596,6 +4666,342 @@
           <w:sz w:val="18"/>
         </w:rPr>
         <w:t xml:space="preserve">  L10 – Vollständige Chrome-Browser-End-to-End-Prüfung</w:t>
+      </w:r>
+    </w:p>
+    <w:p>
+      <w:pPr>
+        <w:keepNext w:val="0"/>
+        <w:keepLines/>
+        <w:spacing w:before="0" w:after="20" w:line="240" w:lineRule="auto"/>
+      </w:pPr>
+      <w:sdt>
+        <w:sdtPr>
+          <w:alias w:val="Update abgeschlossen"/>
+          <w14:checkbox>
+            <w14:checked w14:val="1"/>
+            <w14:checkedState w14:val="2612" w14:font="MS Gothic"/>
+            <w14:uncheckedState w14:val="2610" w14:font="MS Gothic"/>
+          </w14:checkbox>
+        </w:sdtPr>
+        <w:sdtContent>
+          <w:r>
+            <w:t>☑</w:t>
+          </w:r>
+        </w:sdtContent>
+      </w:sdt>
+      <w:r>
+        <w:rPr>
+          <w:sz w:val="18"/>
+        </w:rPr>
+        <w:t xml:space="preserve">  L11 – Zustand Vorher/Nachher/Zwischenstand und Bestandsaufnahme gespeichert</w:t>
+      </w:r>
+    </w:p>
+    <w:p>
+      <w:pPr>
+        <w:keepNext w:val="0"/>
+        <w:keepLines/>
+        <w:spacing w:before="0" w:after="20" w:line="240" w:lineRule="auto"/>
+      </w:pPr>
+      <w:sdt>
+        <w:sdtPr>
+          <w:alias w:val="Update abgeschlossen"/>
+          <w14:checkbox>
+            <w14:checked w14:val="1"/>
+            <w14:checkedState w14:val="2612" w14:font="MS Gothic"/>
+            <w14:uncheckedState w14:val="2610" w14:font="MS Gothic"/>
+          </w14:checkbox>
+        </w:sdtPr>
+        <w:sdtContent>
+          <w:r>
+            <w:t>☑</w:t>
+          </w:r>
+        </w:sdtContent>
+      </w:sdt>
+      <w:r>
+        <w:rPr>
+          <w:sz w:val="18"/>
+        </w:rPr>
+        <w:t xml:space="preserve">  L11 – Vergleichsreihen und manuelles Aufnahmedatum umgesetzt</w:t>
+      </w:r>
+    </w:p>
+    <w:p>
+      <w:pPr>
+        <w:keepNext w:val="0"/>
+        <w:keepLines/>
+        <w:spacing w:before="0" w:after="20" w:line="240" w:lineRule="auto"/>
+      </w:pPr>
+      <w:sdt>
+        <w:sdtPr>
+          <w:alias w:val="Update abgeschlossen"/>
+          <w14:checkbox>
+            <w14:checked w14:val="1"/>
+            <w14:checkedState w14:val="2612" w14:font="MS Gothic"/>
+            <w14:uncheckedState w14:val="2610" w14:font="MS Gothic"/>
+          </w14:checkbox>
+        </w:sdtPr>
+        <w:sdtContent>
+          <w:r>
+            <w:t>☑</w:t>
+          </w:r>
+        </w:sdtContent>
+      </w:sdt>
+      <w:r>
+        <w:rPr>
+          <w:sz w:val="18"/>
+        </w:rPr>
+        <w:t xml:space="preserve">  L11 – Alte L10-Fotos mit korrektem Importdatum kompatibel</w:t>
+      </w:r>
+    </w:p>
+    <w:p>
+      <w:pPr>
+        <w:keepNext w:val="0"/>
+        <w:keepLines/>
+        <w:spacing w:before="0" w:after="20" w:line="240" w:lineRule="auto"/>
+      </w:pPr>
+      <w:sdt>
+        <w:sdtPr>
+          <w:alias w:val="Update abgeschlossen"/>
+          <w14:checkbox>
+            <w14:checked w14:val="1"/>
+            <w14:checkedState w14:val="2612" w14:font="MS Gothic"/>
+            <w14:uncheckedState w14:val="2610" w14:font="MS Gothic"/>
+          </w14:checkbox>
+        </w:sdtPr>
+        <w:sdtContent>
+          <w:r>
+            <w:t>☑</w:t>
+          </w:r>
+        </w:sdtContent>
+      </w:sdt>
+      <w:r>
+        <w:rPr>
+          <w:sz w:val="18"/>
+        </w:rPr>
+        <w:t xml:space="preserve">  L11 – Chronologie, Kategorie-/Phasenfilter und Suchfunktion getestet</w:t>
+      </w:r>
+    </w:p>
+    <w:p>
+      <w:pPr>
+        <w:keepNext w:val="0"/>
+        <w:keepLines/>
+        <w:spacing w:before="0" w:after="20" w:line="240" w:lineRule="auto"/>
+      </w:pPr>
+      <w:sdt>
+        <w:sdtPr>
+          <w:alias w:val="Update abgeschlossen"/>
+          <w14:checkbox>
+            <w14:checked w14:val="1"/>
+            <w14:checkedState w14:val="2612" w14:font="MS Gothic"/>
+            <w14:uncheckedState w14:val="2610" w14:font="MS Gothic"/>
+          </w14:checkbox>
+        </w:sdtPr>
+        <w:sdtContent>
+          <w:r>
+            <w:t>☑</w:t>
+          </w:r>
+        </w:sdtContent>
+      </w:sdt>
+      <w:r>
+        <w:rPr>
+          <w:sz w:val="18"/>
+        </w:rPr>
+        <w:t xml:space="preserve">  L11 – Zwei-Foto-Vergleich nur innerhalb desselben Artikels/Lagerortes</w:t>
+      </w:r>
+    </w:p>
+    <w:p>
+      <w:pPr>
+        <w:keepNext w:val="0"/>
+        <w:keepLines/>
+        <w:spacing w:before="0" w:after="20" w:line="240" w:lineRule="auto"/>
+      </w:pPr>
+      <w:sdt>
+        <w:sdtPr>
+          <w:alias w:val="Update abgeschlossen"/>
+          <w14:checkbox>
+            <w14:checked w14:val="1"/>
+            <w14:checkedState w14:val="2612" w14:font="MS Gothic"/>
+            <w14:uncheckedState w14:val="2610" w14:font="MS Gothic"/>
+          </w14:checkbox>
+        </w:sdtPr>
+        <w:sdtContent>
+          <w:r>
+            <w:t>☑</w:t>
+          </w:r>
+        </w:sdtContent>
+      </w:sdt>
+      <w:r>
+        <w:rPr>
+          <w:sz w:val="18"/>
+        </w:rPr>
+        <w:t xml:space="preserve">  L11 – Fotos einzeln herunterladen, Hauptbild bearbeiten und löschen</w:t>
+      </w:r>
+    </w:p>
+    <w:p>
+      <w:pPr>
+        <w:keepNext w:val="0"/>
+        <w:keepLines/>
+        <w:spacing w:before="0" w:after="20" w:line="240" w:lineRule="auto"/>
+      </w:pPr>
+      <w:sdt>
+        <w:sdtPr>
+          <w:alias w:val="Update abgeschlossen"/>
+          <w14:checkbox>
+            <w14:checked w14:val="1"/>
+            <w14:checkedState w14:val="2612" w14:font="MS Gothic"/>
+            <w14:uncheckedState w14:val="2610" w14:font="MS Gothic"/>
+          </w14:checkbox>
+        </w:sdtPr>
+        <w:sdtContent>
+          <w:r>
+            <w:t>☑</w:t>
+          </w:r>
+        </w:sdtContent>
+      </w:sdt>
+      <w:r>
+        <w:rPr>
+          <w:sz w:val="18"/>
+        </w:rPr>
+        <w:t xml:space="preserve">  L11 – Datenbank-Isolation, vorhandene Identitäten und Bestände erhalten</w:t>
+      </w:r>
+    </w:p>
+    <w:p>
+      <w:pPr>
+        <w:keepNext w:val="0"/>
+        <w:keepLines/>
+        <w:spacing w:before="0" w:after="20" w:line="240" w:lineRule="auto"/>
+      </w:pPr>
+      <w:sdt>
+        <w:sdtPr>
+          <w:alias w:val="Update abgeschlossen"/>
+          <w14:checkbox>
+            <w14:checked w14:val="1"/>
+            <w14:checkedState w14:val="2612" w14:font="MS Gothic"/>
+            <w14:uncheckedState w14:val="2610" w14:font="MS Gothic"/>
+          </w14:checkbox>
+        </w:sdtPr>
+        <w:sdtContent>
+          <w:r>
+            <w:t>☑</w:t>
+          </w:r>
+        </w:sdtContent>
+      </w:sdt>
+      <w:r>
+        <w:rPr>
+          <w:sz w:val="18"/>
+        </w:rPr>
+        <w:t xml:space="preserve">  L11 – L04–L11-Logik- und JavaScript-Syntaxprüfungen bestanden</w:t>
+      </w:r>
+    </w:p>
+    <w:p>
+      <w:pPr>
+        <w:keepNext w:val="0"/>
+        <w:keepLines/>
+        <w:spacing w:before="0" w:after="20" w:line="240" w:lineRule="auto"/>
+      </w:pPr>
+      <w:sdt>
+        <w:sdtPr>
+          <w:alias w:val="Update abgeschlossen"/>
+          <w14:checkbox>
+            <w14:checked w14:val="1"/>
+            <w14:checkedState w14:val="2612" w14:font="MS Gothic"/>
+            <w14:uncheckedState w14:val="2610" w14:font="MS Gothic"/>
+          </w14:checkbox>
+        </w:sdtPr>
+        <w:sdtContent>
+          <w:r>
+            <w:t>☑</w:t>
+          </w:r>
+        </w:sdtContent>
+      </w:sdt>
+      <w:r>
+        <w:rPr>
+          <w:sz w:val="18"/>
+        </w:rPr>
+        <w:t xml:space="preserve">  L11 – GitHub main veröffentlicht und Code-Dateien abgeglichen</w:t>
+      </w:r>
+    </w:p>
+    <w:p>
+      <w:pPr>
+        <w:keepNext w:val="0"/>
+        <w:keepLines/>
+        <w:spacing w:before="0" w:after="20" w:line="240" w:lineRule="auto"/>
+      </w:pPr>
+      <w:sdt>
+        <w:sdtPr>
+          <w:alias w:val="Update abgeschlossen"/>
+          <w14:checkbox>
+            <w14:checked w14:val="1"/>
+            <w14:checkedState w14:val="2612" w14:font="MS Gothic"/>
+            <w14:uncheckedState w14:val="2610" w14:font="MS Gothic"/>
+          </w14:checkbox>
+        </w:sdtPr>
+        <w:sdtContent>
+          <w:r>
+            <w:t>☑</w:t>
+          </w:r>
+        </w:sdtContent>
+      </w:sdt>
+      <w:r>
+        <w:rPr>
+          <w:sz w:val="18"/>
+        </w:rPr>
+        <w:t xml:space="preserve">  L11 – ZIP inklusive aktualisierter bauhaus.docx erstellt und geprüft</w:t>
+      </w:r>
+    </w:p>
+    <w:p>
+      <w:pPr>
+        <w:keepNext w:val="0"/>
+        <w:keepLines/>
+        <w:spacing w:before="0" w:after="20" w:line="240" w:lineRule="auto"/>
+      </w:pPr>
+      <w:sdt>
+        <w:sdtPr>
+          <w:alias w:val="Update abgeschlossen"/>
+          <w14:checkbox>
+            <w14:checked w14:val="0"/>
+            <w14:checkedState w14:val="2612" w14:font="MS Gothic"/>
+            <w14:uncheckedState w14:val="2610" w14:font="MS Gothic"/>
+          </w14:checkbox>
+        </w:sdtPr>
+        <w:sdtContent>
+          <w:r>
+            <w:t>☐</w:t>
+          </w:r>
+        </w:sdtContent>
+      </w:sdt>
+      <w:r>
+        <w:rPr>
+          <w:sz w:val="18"/>
+        </w:rPr>
+        <w:t xml:space="preserve">  L11 – Vollständiger Chrome-End-to-End-Test abgeschlossen</w:t>
+      </w:r>
+    </w:p>
+    <w:p>
+      <w:pPr>
+        <w:keepNext w:val="0"/>
+        <w:keepLines/>
+        <w:spacing w:before="0" w:after="20" w:line="240" w:lineRule="auto"/>
+      </w:pPr>
+      <w:sdt>
+        <w:sdtPr>
+          <w:alias w:val="Update abgeschlossen"/>
+          <w14:checkbox>
+            <w14:checked w14:val="0"/>
+            <w14:checkedState w14:val="2612" w14:font="MS Gothic"/>
+            <w14:uncheckedState w14:val="2610" w14:font="MS Gothic"/>
+          </w14:checkbox>
+        </w:sdtPr>
+        <w:sdtContent>
+          <w:r>
+            <w:t>☐</w:t>
+          </w:r>
+        </w:sdtContent>
+      </w:sdt>
+      <w:r>
+        <w:rPr>
+          <w:sz w:val="18"/>
+        </w:rPr>
+        <w:t xml:space="preserve">  L11 – Android-Kamera-/Galerie-/Offline-/Updateprüfung abgeschlossen</w:t>
       </w:r>
     </w:p>
     <w:p>

</xml_diff>

<commit_message>
L12: Dokumentation und Root-Checkliste auf identischen Stand bringen
</commit_message>
<xml_diff>
--- a/DOKUMENTATION/bauhaus.docx
+++ b/DOKUMENTATION/bauhaus.docx
@@ -28,7 +28,7 @@
         <w:jc w:val="center"/>
       </w:pPr>
       <w:r>
-        <w:t>Stand: 27. Oktober 2026   •   Basis: Mein Alltag V0.0.2   •   Aktuelle App-Version: V0.11.0 (L11)</w:t>
+        <w:t>Stand: 27. Oktober 2026   •   Basis: Mein Alltag V0.0.2   •   Aktuelle App-Version: V0.12.0 (L12)</w:t>
       </w:r>
     </w:p>
     <w:p>
@@ -90,7 +90,7 @@
     <w:p>
       <w:pPr/>
       <w:r>
-        <w:t>Abgeschlossen (Code und GitHub): 11 / 36 Updates   |   Offen: 25 / 36 Updates. L11 auf GitHub main in V0.11.0 veröffentlicht (Commit f11d7c29). Chrome-/Android-Praxistest weiterhin offen.</w:t>
+        <w:t>Abgeschlossen (Code und GitHub): 12 / 36 Updates   |   Offen: 24 / 36 Updates. L12 auf GitHub main als V0.12.0 veröffentlicht (Code-Commit ef13c460). Chrome-/Android-Praxistest weiterhin offen.</w:t>
       </w:r>
     </w:p>
     <w:p>
@@ -774,19 +774,19 @@
         <w:sdtPr>
           <w:alias w:val="Update abgeschlossen"/>
           <w14:checkbox>
-            <w14:checked w14:val="0"/>
+            <w14:checked w14:val="1"/>
             <w14:checkedState w14:val="2612" w14:font="MS Gothic"/>
             <w14:uncheckedState w14:val="2610" w14:font="MS Gothic"/>
           </w14:checkbox>
         </w:sdtPr>
         <w:sdtContent>
           <w:r>
-            <w:t>☐</w:t>
+            <w:t>☑</w:t>
           </w:r>
         </w:sdtContent>
       </w:sdt>
       <w:r>
-        <w:t xml:space="preserve">  L12  ·  Kategorien &amp; intelligente Organisation</w:t>
+        <w:t xml:space="preserve">  L12  ·  Größeres 3D-Regal &amp; echte Packungsbestände</w:t>
       </w:r>
     </w:p>
     <w:p>
@@ -797,10 +797,9 @@
         <w:rPr>
           <w:b/>
         </w:rPr>
-        <w:t xml:space="preserve">Umfang: </w:t>
-      </w:r>
-      <w:r>
-        <w:t>Freie Kategorien/Unterkategorien, Farben, Symbole, Tags, Vorlagen, Sammelzuordnung.</w:t>
+      </w:r>
+      <w:r>
+        <w:t>Umfang: Größere 3D-Raumansicht, Vollbild und Zoom; sichtbare symbolische Artikelpackungen auf belegten Regalen; Regal antippen zeigt Fachbestände, Fotos und angebrochene Packungen; nicht eingeräumte Artikel zuordnen; Packungsrestmengen korrekt erfassen.</w:t>
       </w:r>
     </w:p>
     <w:p>
@@ -811,10 +810,14 @@
         <w:rPr>
           <w:b/>
         </w:rPr>
-        <w:t xml:space="preserve">Abnahme: </w:t>
-      </w:r>
-      <w:r>
-        <w:t>Kategorie unabhängig vom Lagerort; keine verwaisten Artikel beim Umbenennen.</w:t>
+      </w:r>
+      <w:r>
+        <w:t>Abnahme: Reale Artikel erscheinen am richtigen Möbel/Fach und im Regal-Inventar; echte Mengen ohne Doppelzählung; freie Artikel des Raums sind erkennbar; Packung 100 Stk mit 37 Stk Rest zeigt nur 37 Stk realen Anfangsbestand.</w:t>
+      </w:r>
+    </w:p>
+    <w:p>
+      <w:r>
+        <w:t xml:space="preserve">  L13  ·  Kategorien, Suche, Filter &amp; Favoriten</w:t>
       </w:r>
     </w:p>
     <w:p>
@@ -838,7 +841,7 @@
         </w:sdtContent>
       </w:sdt>
       <w:r>
-        <w:t xml:space="preserve">  L13  ·  Suchen, Filter &amp; Favoriten</w:t>
+        <w:t>Umfang: Hierher verschoben aus dem ursprünglich geplanten L12: freie Kategorien/Unterkategorien, Symbole, Farben, Tags, Vorlagen und Sammelzuordnung. Außerdem Artikelsuche, Schreibvarianten, Sortierung und Favoriten.</w:t>
       </w:r>
     </w:p>
     <w:p>
@@ -849,10 +852,9 @@
         <w:rPr>
           <w:b/>
         </w:rPr>
-        <w:t xml:space="preserve">Umfang: </w:t>
-      </w:r>
-      <w:r>
-        <w:t>Artikelname, Hersteller, Nummer, Schreibvarianten, Kategorie, Zustand; Sortierung und Favoriten.</w:t>
+      </w:r>
+      <w:r>
+        <w:t>Abnahme: Kategorien unabhängig vom Lagerort, keine verwaisten Artikel beim Umbenennen; Suche/Filter und Favoriten reproduzierbar.</w:t>
       </w:r>
     </w:p>
     <w:p>
@@ -2080,6 +2082,69 @@
       <w:r/>
       <w:r>
         <w:t>Pro Update werden Prüfungen einzeln dokumentiert. Nicht ausgeführte Tests und noch nicht veröffentlichte GitHub-Stände bleiben offen.</w:t>
+      </w:r>
+    </w:p>
+    <w:p>
+      <w:r/>
+      <w:sdt>
+        <w:sdtPr>
+          <w:alias w:val="Update abgeschlossen"/>
+          <w14:checkbox>
+            <w14:checked w14:val="0"/>
+            <w14:checkedState w14:val="2612" w14:font="MS Gothic"/>
+            <w14:uncheckedState w14:val="2610" w14:font="MS Gothic"/>
+          </w14:checkbox>
+        </w:sdtPr>
+        <w:sdtContent>
+          <w:r>
+            <w:t>☐</w:t>
+          </w:r>
+        </w:sdtContent>
+      </w:sdt>
+      <w:r>
+        <w:t xml:space="preserve">  Programmcode/Syntax und Funktionslogik geprüft</w:t>
+      </w:r>
+    </w:p>
+    <w:p>
+      <w:r/>
+      <w:sdt>
+        <w:sdtPr>
+          <w:alias w:val="Update abgeschlossen"/>
+          <w14:checkbox>
+            <w14:checked w14:val="0"/>
+            <w14:checkedState w14:val="2612" w14:font="MS Gothic"/>
+            <w14:uncheckedState w14:val="2610" w14:font="MS Gothic"/>
+          </w14:checkbox>
+        </w:sdtPr>
+        <w:sdtContent>
+          <w:r>
+            <w:t>☐</w:t>
+          </w:r>
+        </w:sdtContent>
+      </w:sdt>
+      <w:r>
+        <w:t xml:space="preserve">  Regressionsprüfung: 5 Hauptmodule und Navigation funktionieren</w:t>
+      </w:r>
+    </w:p>
+    <w:p>
+      <w:r/>
+      <w:sdt>
+        <w:sdtPr>
+          <w:alias w:val="Update abgeschlossen"/>
+          <w14:checkbox>
+            <w14:checked w14:val="0"/>
+            <w14:checkedState w14:val="2612" w14:font="MS Gothic"/>
+            <w14:uncheckedState w14:val="2610" w14:font="MS Gothic"/>
+          </w14:checkbox>
+        </w:sdtPr>
+        <w:sdtContent>
+          <w:r>
+            <w:t>☐</w:t>
+          </w:r>
+        </w:sdtContent>
+      </w:sdt>
+      <w:r>
+        <w:t xml:space="preserve">  Lokale Speicherung und Datenbestand geprüft</w:t>
       </w:r>
     </w:p>
     <w:p>
@@ -2100,69 +2165,6 @@
         </w:sdtContent>
       </w:sdt>
       <w:r>
-        <w:t xml:space="preserve">  Programmcode/Syntax und Funktionslogik geprüft</w:t>
-      </w:r>
-    </w:p>
-    <w:p>
-      <w:r/>
-      <w:sdt>
-        <w:sdtPr>
-          <w:alias w:val="Update abgeschlossen"/>
-          <w14:checkbox>
-            <w14:checked w14:val="0"/>
-            <w14:checkedState w14:val="2612" w14:font="MS Gothic"/>
-            <w14:uncheckedState w14:val="2610" w14:font="MS Gothic"/>
-          </w14:checkbox>
-        </w:sdtPr>
-        <w:sdtContent>
-          <w:r>
-            <w:t>☐</w:t>
-          </w:r>
-        </w:sdtContent>
-      </w:sdt>
-      <w:r>
-        <w:t xml:space="preserve">  Regressionsprüfung: 5 Hauptmodule und Navigation funktionieren</w:t>
-      </w:r>
-    </w:p>
-    <w:p>
-      <w:r/>
-      <w:sdt>
-        <w:sdtPr>
-          <w:alias w:val="Update abgeschlossen"/>
-          <w14:checkbox>
-            <w14:checked w14:val="0"/>
-            <w14:checkedState w14:val="2612" w14:font="MS Gothic"/>
-            <w14:uncheckedState w14:val="2610" w14:font="MS Gothic"/>
-          </w14:checkbox>
-        </w:sdtPr>
-        <w:sdtContent>
-          <w:r>
-            <w:t>☐</w:t>
-          </w:r>
-        </w:sdtContent>
-      </w:sdt>
-      <w:r>
-        <w:t xml:space="preserve">  Lokale Speicherung und Datenbestand geprüft</w:t>
-      </w:r>
-    </w:p>
-    <w:p>
-      <w:r/>
-      <w:sdt>
-        <w:sdtPr>
-          <w:alias w:val="Update abgeschlossen"/>
-          <w14:checkbox>
-            <w14:checked w14:val="0"/>
-            <w14:checkedState w14:val="2612" w14:font="MS Gothic"/>
-            <w14:uncheckedState w14:val="2610" w14:font="MS Gothic"/>
-          </w14:checkbox>
-        </w:sdtPr>
-        <w:sdtContent>
-          <w:r>
-            <w:t>☐</w:t>
-          </w:r>
-        </w:sdtContent>
-      </w:sdt>
-      <w:r>
         <w:t xml:space="preserve">  PWA-Offline-Cache und Installationspfad geprüft</w:t>
       </w:r>
     </w:p>
@@ -2214,14 +2216,14 @@
         <w:sdtPr>
           <w:alias w:val="Update abgeschlossen"/>
           <w14:checkbox>
-            <w14:checked w14:val="1"/>
+            <w14:checked w14:val="0"/>
             <w14:checkedState w14:val="2612" w14:font="MS Gothic"/>
             <w14:uncheckedState w14:val="2610" w14:font="MS Gothic"/>
           </w14:checkbox>
         </w:sdtPr>
         <w:sdtContent>
           <w:r>
-            <w:t>☑</w:t>
+            <w:t>☐</w:t>
           </w:r>
         </w:sdtContent>
       </w:sdt>
@@ -2837,6 +2839,48 @@
           </w:p>
         </w:tc>
       </w:tr>
+      <w:tr>
+        <w:tc>
+          <w:tcPr>
+            <w:tcW w:type="dxa" w:w="2465"/>
+          </w:tcPr>
+          <w:p>
+            <w:r>
+              <w:t>L12</w:t>
+            </w:r>
+          </w:p>
+        </w:tc>
+        <w:tc>
+          <w:tcPr>
+            <w:tcW w:type="dxa" w:w="2465"/>
+          </w:tcPr>
+          <w:p>
+            <w:r>
+              <w:t>0.12.0</w:t>
+            </w:r>
+          </w:p>
+        </w:tc>
+        <w:tc>
+          <w:tcPr>
+            <w:tcW w:type="dxa" w:w="2465"/>
+          </w:tcPr>
+          <w:p>
+            <w:r>
+              <w:t>27.10.2026</w:t>
+            </w:r>
+          </w:p>
+        </w:tc>
+        <w:tc>
+          <w:tcPr>
+            <w:tcW w:type="dxa" w:w="2465"/>
+          </w:tcPr>
+          <w:p>
+            <w:r>
+              <w:t>GitHub: ef13c460 · Node L05–L12 PASS · Chrome/Android offen</w:t>
+            </w:r>
+          </w:p>
+        </w:tc>
+      </w:tr>
     </w:tbl>
     <w:p>
       <w:pPr>
@@ -3565,6 +3609,490 @@
     <w:p>
       <w:r>
         <w:t>Tests: L04–L10 Node- und JS-Syntaxprüfungen PASS. Canvas-Bildverarbeitung unter Chromium about:blank mit Originalbytes und WebP-Zielauflösung PASS. Die vollständige lokale Browsernavigation ist mit ERR_BLOCKED_BY_ADMINISTRATOR blockiert. Echte Android-Kamera-, Galerie-, IndexedDB-Wiederöffnungs-, Offline- und Update-Prüfung ist ausstehend; diese Punkte dürfen nicht als bestanden gelten.</w:t>
+      </w:r>
+    </w:p>
+    <w:p>
+      <w:pPr>
+        <w:pStyle w:val="Heading2"/>
+      </w:pPr>
+      <w:r>
+        <w:t>L12 · Veröffentlichung V0.12.0 / 3D-Regal und Packungen</w:t>
+      </w:r>
+    </w:p>
+    <w:p>
+      <w:r>
+        <w:t>GitHub main: Code-Commit ef13c460a1f3ef393b307e09410beca5d3c24212. Build L12 / Version 0.12.0; Service-Worker-Cache mein-alltag-v0-12-0. GitHub-Dateiabgleich für version.json, assets/app.js, sw.js, lagerhaus-shelf.js und lagerhaus-tracking.js durchgeführt.</w:t>
+      </w:r>
+    </w:p>
+    <w:p>
+      <w:r>
+        <w:t>Umsetzung: größere 3D-Raumansicht; Zoom +/-/Reset, Zwei-Finger-Pinch und Vollbild; schematische Packungssymbole nur bei Artikelbestand im Möbel/Fach; Fach-Inventar beim Tippen mit optionalem vorhandenen Hauptfoto, Mengen und Status voller/angebrochener Gebinde; Raumartikel ohne Regal sichtbar und freie Menge in ein Möbel/Fach buchbar. Reservierte Einzelgebinde weiter geschützt.</w:t>
+      </w:r>
+    </w:p>
+    <w:p>
+      <w:r>
+        <w:t>Gebinde: Bereits angebrochene Packungen erhalten Kapazität + reale Restmenge; wenn neu erfasst, wird nur der Rest als real vorhandene Menge gebucht. Bei Kennzeichnung existierender Ware wird nichts doppelt gebucht. Datenschema und Store-Namen bleiben unverändert.</w:t>
+      </w:r>
+    </w:p>
+    <w:p>
+      <w:r>
+        <w:t>Qualität: L05–L12-Logik-/Regressionstests PASS; alle Produktiv-JavaScript-Dateien syntaktisch geprüft; neue Offline-Assets vollständig. Browser-End-to-End scheiterte an Netzsperre (net::ERR_BLOCKED_BY_ADMINISTRATOR auf localhost). Android-Gerätetest für Touch-/Pinch-/Vollbild und tatsächliche Bestandsmigration noch offen. ZIP enthält keine lokalen persönlichen Artikel/Fotos.</w:t>
+      </w:r>
+    </w:p>
+    <w:p>
+      <w:pPr>
+        <w:pStyle w:val="Heading2"/>
+      </w:pPr>
+      <w:r>
+        <w:t>L12 · Einzelabnahme zum Abhaken</w:t>
+      </w:r>
+    </w:p>
+    <w:p>
+      <w:pPr>
+        <w:keepNext w:val="0"/>
+        <w:keepLines/>
+        <w:spacing w:before="0" w:after="20" w:line="240" w:lineRule="auto"/>
+      </w:pPr>
+      <w:sdt>
+        <w:sdtPr>
+          <w:alias w:val="Update abgeschlossen"/>
+          <w14:checkbox>
+            <w14:checked w14:val="1"/>
+            <w14:checkedState w14:val="2612" w14:font="MS Gothic"/>
+            <w14:uncheckedState w14:val="2610" w14:font="MS Gothic"/>
+          </w14:checkbox>
+        </w:sdtPr>
+        <w:sdtContent>
+          <w:r>
+            <w:t>☑</w:t>
+          </w:r>
+        </w:sdtContent>
+      </w:sdt>
+      <w:r>
+        <w:rPr>
+          <w:sz w:val="18"/>
+        </w:rPr>
+        <w:t xml:space="preserve">  L12 – 3D-Raum vergrößert und Zoom-Tasten/Reset implementiert</w:t>
+      </w:r>
+    </w:p>
+    <w:p>
+      <w:pPr>
+        <w:keepNext w:val="0"/>
+        <w:keepLines/>
+        <w:spacing w:before="0" w:after="20" w:line="240" w:lineRule="auto"/>
+      </w:pPr>
+      <w:sdt>
+        <w:sdtPr>
+          <w:alias w:val="Update abgeschlossen"/>
+          <w14:checkbox>
+            <w14:checked w14:val="1"/>
+            <w14:checkedState w14:val="2612" w14:font="MS Gothic"/>
+            <w14:uncheckedState w14:val="2610" w14:font="MS Gothic"/>
+          </w14:checkbox>
+        </w:sdtPr>
+        <w:sdtContent>
+          <w:r>
+            <w:t>☑</w:t>
+          </w:r>
+        </w:sdtContent>
+      </w:sdt>
+      <w:r>
+        <w:rPr>
+          <w:sz w:val="18"/>
+        </w:rPr>
+        <w:t xml:space="preserve">  L12 – Pinch-Zoom und Vollbildbedienung programmiert</w:t>
+      </w:r>
+    </w:p>
+    <w:p>
+      <w:pPr>
+        <w:keepNext w:val="0"/>
+        <w:keepLines/>
+        <w:spacing w:before="0" w:after="20" w:line="240" w:lineRule="auto"/>
+      </w:pPr>
+      <w:sdt>
+        <w:sdtPr>
+          <w:alias w:val="Update abgeschlossen"/>
+          <w14:checkbox>
+            <w14:checked w14:val="1"/>
+            <w14:checkedState w14:val="2612" w14:font="MS Gothic"/>
+            <w14:uncheckedState w14:val="2610" w14:font="MS Gothic"/>
+          </w14:checkbox>
+        </w:sdtPr>
+        <w:sdtContent>
+          <w:r>
+            <w:t>☑</w:t>
+          </w:r>
+        </w:sdtContent>
+      </w:sdt>
+      <w:r>
+        <w:rPr>
+          <w:sz w:val="18"/>
+        </w:rPr>
+        <w:t xml:space="preserve">  L12 – Artikelpakete aus echtem Standortbestand schematisch im Regal gezeichnet</w:t>
+      </w:r>
+    </w:p>
+    <w:p>
+      <w:pPr>
+        <w:keepNext w:val="0"/>
+        <w:keepLines/>
+        <w:spacing w:before="0" w:after="20" w:line="240" w:lineRule="auto"/>
+      </w:pPr>
+      <w:sdt>
+        <w:sdtPr>
+          <w:alias w:val="Update abgeschlossen"/>
+          <w14:checkbox>
+            <w14:checked w14:val="1"/>
+            <w14:checkedState w14:val="2612" w14:font="MS Gothic"/>
+            <w14:uncheckedState w14:val="2610" w14:font="MS Gothic"/>
+          </w14:checkbox>
+        </w:sdtPr>
+        <w:sdtContent>
+          <w:r>
+            <w:t>☑</w:t>
+          </w:r>
+        </w:sdtContent>
+      </w:sdt>
+      <w:r>
+        <w:rPr>
+          <w:sz w:val="18"/>
+        </w:rPr>
+        <w:t xml:space="preserve">  L12 – Regal öffnen zeigt echte Artikelpositionen pro Fach</w:t>
+      </w:r>
+    </w:p>
+    <w:p>
+      <w:pPr>
+        <w:keepNext w:val="0"/>
+        <w:keepLines/>
+        <w:spacing w:before="0" w:after="20" w:line="240" w:lineRule="auto"/>
+      </w:pPr>
+      <w:sdt>
+        <w:sdtPr>
+          <w:alias w:val="Update abgeschlossen"/>
+          <w14:checkbox>
+            <w14:checked w14:val="1"/>
+            <w14:checkedState w14:val="2612" w14:font="MS Gothic"/>
+            <w14:uncheckedState w14:val="2610" w14:font="MS Gothic"/>
+          </w14:checkbox>
+        </w:sdtPr>
+        <w:sdtContent>
+          <w:r>
+            <w:t>☑</w:t>
+          </w:r>
+        </w:sdtContent>
+      </w:sdt>
+      <w:r>
+        <w:rPr>
+          <w:sz w:val="18"/>
+        </w:rPr>
+        <w:t xml:space="preserve">  L12 – Optional vorhandenes Hauptfoto in Regal-Inventar verknüpft</w:t>
+      </w:r>
+    </w:p>
+    <w:p>
+      <w:pPr>
+        <w:keepNext w:val="0"/>
+        <w:keepLines/>
+        <w:spacing w:before="0" w:after="20" w:line="240" w:lineRule="auto"/>
+      </w:pPr>
+      <w:sdt>
+        <w:sdtPr>
+          <w:alias w:val="Update abgeschlossen"/>
+          <w14:checkbox>
+            <w14:checked w14:val="1"/>
+            <w14:checkedState w14:val="2612" w14:font="MS Gothic"/>
+            <w14:uncheckedState w14:val="2610" w14:font="MS Gothic"/>
+          </w14:checkbox>
+        </w:sdtPr>
+        <w:sdtContent>
+          <w:r>
+            <w:t>☑</w:t>
+          </w:r>
+        </w:sdtContent>
+      </w:sdt>
+      <w:r>
+        <w:rPr>
+          <w:sz w:val="18"/>
+        </w:rPr>
+        <w:t xml:space="preserve">  L12 – Voll/angebrochen und Restmenge pro Gebinde im Regal-Inventar angezeigt</w:t>
+      </w:r>
+    </w:p>
+    <w:p>
+      <w:pPr>
+        <w:keepNext w:val="0"/>
+        <w:keepLines/>
+        <w:spacing w:before="0" w:after="20" w:line="240" w:lineRule="auto"/>
+      </w:pPr>
+      <w:sdt>
+        <w:sdtPr>
+          <w:alias w:val="Update abgeschlossen"/>
+          <w14:checkbox>
+            <w14:checked w14:val="1"/>
+            <w14:checkedState w14:val="2612" w14:font="MS Gothic"/>
+            <w14:uncheckedState w14:val="2610" w14:font="MS Gothic"/>
+          </w14:checkbox>
+        </w:sdtPr>
+        <w:sdtContent>
+          <w:r>
+            <w:t>☑</w:t>
+          </w:r>
+        </w:sdtContent>
+      </w:sdt>
+      <w:r>
+        <w:rPr>
+          <w:sz w:val="18"/>
+        </w:rPr>
+        <w:t xml:space="preserve">  L12 – Noch nicht eingeräumte Raumartikel sichtbar</w:t>
+      </w:r>
+    </w:p>
+    <w:p>
+      <w:pPr>
+        <w:keepNext w:val="0"/>
+        <w:keepLines/>
+        <w:spacing w:before="0" w:after="20" w:line="240" w:lineRule="auto"/>
+      </w:pPr>
+      <w:sdt>
+        <w:sdtPr>
+          <w:alias w:val="Update abgeschlossen"/>
+          <w14:checkbox>
+            <w14:checked w14:val="1"/>
+            <w14:checkedState w14:val="2612" w14:font="MS Gothic"/>
+            <w14:uncheckedState w14:val="2610" w14:font="MS Gothic"/>
+          </w14:checkbox>
+        </w:sdtPr>
+        <w:sdtContent>
+          <w:r>
+            <w:t>☑</w:t>
+          </w:r>
+        </w:sdtContent>
+      </w:sdt>
+      <w:r>
+        <w:rPr>
+          <w:sz w:val="18"/>
+        </w:rPr>
+        <w:t xml:space="preserve">  L12 – Freie Mengen atomar einem Regal/Fach zuordnen; reservierte Gebinde geschützt</w:t>
+      </w:r>
+    </w:p>
+    <w:p>
+      <w:pPr>
+        <w:keepNext w:val="0"/>
+        <w:keepLines/>
+        <w:spacing w:before="0" w:after="20" w:line="240" w:lineRule="auto"/>
+      </w:pPr>
+      <w:sdt>
+        <w:sdtPr>
+          <w:alias w:val="Update abgeschlossen"/>
+          <w14:checkbox>
+            <w14:checked w14:val="1"/>
+            <w14:checkedState w14:val="2612" w14:font="MS Gothic"/>
+            <w14:uncheckedState w14:val="2610" w14:font="MS Gothic"/>
+          </w14:checkbox>
+        </w:sdtPr>
+        <w:sdtContent>
+          <w:r>
+            <w:t>☑</w:t>
+          </w:r>
+        </w:sdtContent>
+      </w:sdt>
+      <w:r>
+        <w:rPr>
+          <w:sz w:val="18"/>
+        </w:rPr>
+        <w:t xml:space="preserve">  L12 – Bereits angebrochene Packungen mit wirklicher Anfangsrestmenge erfassbar</w:t>
+      </w:r>
+    </w:p>
+    <w:p>
+      <w:pPr>
+        <w:keepNext w:val="0"/>
+        <w:keepLines/>
+        <w:spacing w:before="0" w:after="20" w:line="240" w:lineRule="auto"/>
+      </w:pPr>
+      <w:sdt>
+        <w:sdtPr>
+          <w:alias w:val="Update abgeschlossen"/>
+          <w14:checkbox>
+            <w14:checked w14:val="1"/>
+            <w14:checkedState w14:val="2612" w14:font="MS Gothic"/>
+            <w14:uncheckedState w14:val="2610" w14:font="MS Gothic"/>
+          </w14:checkbox>
+        </w:sdtPr>
+        <w:sdtContent>
+          <w:r>
+            <w:t>☑</w:t>
+          </w:r>
+        </w:sdtContent>
+      </w:sdt>
+      <w:r>
+        <w:rPr>
+          <w:sz w:val="18"/>
+        </w:rPr>
+        <w:t xml:space="preserve">  L12 – L05–L12-Regressions- und Produktiv-Syntaxprüfungen bestanden</w:t>
+      </w:r>
+    </w:p>
+    <w:p>
+      <w:pPr>
+        <w:keepNext w:val="0"/>
+        <w:keepLines/>
+        <w:spacing w:before="0" w:after="20" w:line="240" w:lineRule="auto"/>
+      </w:pPr>
+      <w:sdt>
+        <w:sdtPr>
+          <w:alias w:val="Update abgeschlossen"/>
+          <w14:checkbox>
+            <w14:checked w14:val="1"/>
+            <w14:checkedState w14:val="2612" w14:font="MS Gothic"/>
+            <w14:uncheckedState w14:val="2610" w14:font="MS Gothic"/>
+          </w14:checkbox>
+        </w:sdtPr>
+        <w:sdtContent>
+          <w:r>
+            <w:t>☑</w:t>
+          </w:r>
+        </w:sdtContent>
+      </w:sdt>
+      <w:r>
+        <w:rPr>
+          <w:sz w:val="18"/>
+        </w:rPr>
+        <w:t xml:space="preserve">  L12 – Versionsdatei, Service-Worker-Cache und Offline-Precache geprüft</w:t>
+      </w:r>
+    </w:p>
+    <w:p>
+      <w:pPr>
+        <w:keepNext w:val="0"/>
+        <w:keepLines/>
+        <w:spacing w:before="0" w:after="20" w:line="240" w:lineRule="auto"/>
+      </w:pPr>
+      <w:sdt>
+        <w:sdtPr>
+          <w:alias w:val="Update abgeschlossen"/>
+          <w14:checkbox>
+            <w14:checked w14:val="1"/>
+            <w14:checkedState w14:val="2612" w14:font="MS Gothic"/>
+            <w14:uncheckedState w14:val="2610" w14:font="MS Gothic"/>
+          </w14:checkbox>
+        </w:sdtPr>
+        <w:sdtContent>
+          <w:r>
+            <w:t>☑</w:t>
+          </w:r>
+        </w:sdtContent>
+      </w:sdt>
+      <w:r>
+        <w:rPr>
+          <w:sz w:val="18"/>
+        </w:rPr>
+        <w:t xml:space="preserve">  L12 – GitHub main veröffentlicht, fünf Dateien erneut abgeglichen</w:t>
+      </w:r>
+    </w:p>
+    <w:p>
+      <w:pPr>
+        <w:keepNext w:val="0"/>
+        <w:keepLines/>
+        <w:spacing w:before="0" w:after="20" w:line="240" w:lineRule="auto"/>
+      </w:pPr>
+      <w:sdt>
+        <w:sdtPr>
+          <w:alias w:val="Update abgeschlossen"/>
+          <w14:checkbox>
+            <w14:checked w14:val="1"/>
+            <w14:checkedState w14:val="2612" w14:font="MS Gothic"/>
+            <w14:uncheckedState w14:val="2610" w14:font="MS Gothic"/>
+          </w14:checkbox>
+        </w:sdtPr>
+        <w:sdtContent>
+          <w:r>
+            <w:t>☑</w:t>
+          </w:r>
+        </w:sdtContent>
+      </w:sdt>
+      <w:r>
+        <w:rPr>
+          <w:sz w:val="18"/>
+        </w:rPr>
+        <w:t xml:space="preserve">  L12 – ZIP mit aktualisierter bauhaus.docx erzeugt und Integrität geprüft</w:t>
+      </w:r>
+    </w:p>
+    <w:p>
+      <w:pPr>
+        <w:keepNext w:val="0"/>
+        <w:keepLines/>
+        <w:spacing w:before="0" w:after="20" w:line="240" w:lineRule="auto"/>
+      </w:pPr>
+      <w:sdt>
+        <w:sdtPr>
+          <w:alias w:val="Update abgeschlossen"/>
+          <w14:checkbox>
+            <w14:checked w14:val="0"/>
+            <w14:checkedState w14:val="2612" w14:font="MS Gothic"/>
+            <w14:uncheckedState w14:val="2610" w14:font="MS Gothic"/>
+          </w14:checkbox>
+        </w:sdtPr>
+        <w:sdtContent>
+          <w:r>
+            <w:t>☐</w:t>
+          </w:r>
+        </w:sdtContent>
+      </w:sdt>
+      <w:r>
+        <w:rPr>
+          <w:sz w:val="18"/>
+        </w:rPr>
+        <w:t xml:space="preserve">  L12 – Echter Android-Test: Regal antippen, Zwei-Finger-Zoom, Vollbild</w:t>
+      </w:r>
+    </w:p>
+    <w:p>
+      <w:pPr>
+        <w:keepNext w:val="0"/>
+        <w:keepLines/>
+        <w:spacing w:before="0" w:after="20" w:line="240" w:lineRule="auto"/>
+      </w:pPr>
+      <w:sdt>
+        <w:sdtPr>
+          <w:alias w:val="Update abgeschlossen"/>
+          <w14:checkbox>
+            <w14:checked w14:val="0"/>
+            <w14:checkedState w14:val="2612" w14:font="MS Gothic"/>
+            <w14:uncheckedState w14:val="2610" w14:font="MS Gothic"/>
+          </w14:checkbox>
+        </w:sdtPr>
+        <w:sdtContent>
+          <w:r>
+            <w:t>☐</w:t>
+          </w:r>
+        </w:sdtContent>
+      </w:sdt>
+      <w:r>
+        <w:rPr>
+          <w:sz w:val="18"/>
+        </w:rPr>
+        <w:t xml:space="preserve">  L12 – Browser-End-to-End-Test mit persistenter IndexedDB und Offlinebetrieb</w:t>
+      </w:r>
+    </w:p>
+    <w:p>
+      <w:pPr>
+        <w:keepNext w:val="0"/>
+        <w:keepLines/>
+        <w:spacing w:before="0" w:after="20" w:line="240" w:lineRule="auto"/>
+      </w:pPr>
+      <w:sdt>
+        <w:sdtPr>
+          <w:alias w:val="Update abgeschlossen"/>
+          <w14:checkbox>
+            <w14:checked w14:val="0"/>
+            <w14:checkedState w14:val="2612" w14:font="MS Gothic"/>
+            <w14:uncheckedState w14:val="2610" w14:font="MS Gothic"/>
+          </w14:checkbox>
+        </w:sdtPr>
+        <w:sdtContent>
+          <w:r>
+            <w:t>☐</w:t>
+          </w:r>
+        </w:sdtContent>
+      </w:sdt>
+      <w:r>
+        <w:rPr>
+          <w:sz w:val="18"/>
+        </w:rPr>
+        <w:t xml:space="preserve">  L12 – Installation/Cache-Update auf dem echten Android-Handy kontrolliert</w:t>
       </w:r>
     </w:p>
     <w:sectPr>

</xml_diff>

<commit_message>
L16: geprüfte Word-Mastercheckliste und vollständiges Abnahmeprotokoll
</commit_message>
<xml_diff>
--- a/DOKUMENTATION/bauhaus.docx
+++ b/DOKUMENTATION/bauhaus.docx
@@ -28,7 +28,7 @@
         <w:jc w:val="center"/>
       </w:pPr>
       <w:r>
-        <w:t>Stand: 27. Oktober 2026   •   Basis: Mein Alltag V0.0.2   •   Aktuelle App-Version: V0.12.0 (L12)</w:t>
+        <w:t>Stand: 27. Oktober 2026   •   Basis: Mein Alltag V0.0.2   •   Aktuelle App-Version: V0.13.0 (L13)</w:t>
       </w:r>
     </w:p>
     <w:p>
@@ -90,7 +90,7 @@
     <w:p>
       <w:pPr/>
       <w:r>
-        <w:t>Abgeschlossen (Code und GitHub): 12 / 36 Updates   |   Offen: 24 / 36 Updates. L12 auf GitHub main als V0.12.0 veröffentlicht (Code-Commit ef13c460). Chrome-/Android-Praxistest weiterhin offen.</w:t>
+        <w:t>Abgeschlossen (Code und GitHub): 13 / 36 Updates   |   Offen: 23 / 36 Updates. L13 V0.13.0 nach Node- und Syntaxprüfung auf GitHub main veröffentlicht; vollständig interaktiver Browser-/Android-Praxistest bleibt offen.</w:t>
       </w:r>
     </w:p>
     <w:p>
@@ -880,14 +880,14 @@
         <w:sdtPr>
           <w:alias w:val="Update abgeschlossen"/>
           <w14:checkbox>
-            <w14:checked w14:val="0"/>
+            <w14:checked w14:val="1"/>
             <w14:checkedState w14:val="2612" w14:font="MS Gothic"/>
             <w14:uncheckedState w14:val="2610" w14:font="MS Gothic"/>
           </w14:checkbox>
         </w:sdtPr>
         <w:sdtContent>
           <w:r>
-            <w:t>☐</w:t>
+            <w:t>☑</w:t>
           </w:r>
         </w:sdtContent>
       </w:sdt>
@@ -921,6 +921,18 @@
       </w:r>
       <w:r>
         <w:t>Richtiges Regal wird markiert; auch auf schmalen Android-Geräten bedienbar.</w:t>
+      </w:r>
+    </w:p>
+    <w:p>
+      <w:pPr/>
+      <w:r>
+        <w:t>Status L14: V0.14.0 – Lager-Navigator, Artikel-/Lagerortsuche, 3D-Direktziele und Fachmarkierung programmiert. L14-Logiktest, 12 ältere Regressionstests (Versionsvermerke aktualisiert), JS-Syntax und GitHub-Quellabgleich bestanden. Lokale Browser-End-to-End-Prüfung durch Chromium-Sicherheitsrichtlinie blockiert; echte Android-/Offline-Praxisprüfung weiterhin offen.</w:t>
+      </w:r>
+    </w:p>
+    <w:p>
+      <w:pPr/>
+      <w:r>
+        <w:t>GitHub main: https://github.com/Darkman0607/Mein-Alltag-/commit/ff3153a97b203b53b1f5d9b31c00b5863997ae07 · abgerufen: app.js V0.14.0, version.json V0.14.0 und zwei neue Offline-Module. Letzte Pakete der Mastercheckliste: L35 und L36; vor Beginn von L35 erfolgt eine gesonderte Meldung.</w:t>
       </w:r>
     </w:p>
     <w:p>
@@ -976,6 +988,11 @@
       </w:r>
     </w:p>
     <w:p>
+      <w:r>
+        <w:t>Status L15: V0.15.0 – Einzelgeräte-Serviceakten, optionale Hersteller-/Modelldaten, Kaufdatum, Betriebsstunden, manuelle Zeit-/Stundenintervalle, Wartungschecklisten, Bestätigung der letzten Wartung und daraus abgeleitete Fälligkeit. 14/14 Node-Tests bestanden (1 neu + 13 Regressionen); JS-Syntax bestanden. GitHub main 1be00c7e bestätigt, zentrale Quelldateien erneut abgerufen. Browser-E2E durch Chromium-Richtlinie blockiert; Android-/Offline-Praxistest offen.</w:t>
+      </w:r>
+    </w:p>
+    <w:p>
       <w:pPr>
         <w:pStyle w:val="Heading2"/>
       </w:pPr>
@@ -1025,6 +1042,14 @@
       </w:r>
       <w:r>
         <w:t>Service nachvollziehbar; als defekt gesperrtes Gerät nicht frei verfügbar.</w:t>
+      </w:r>
+    </w:p>
+    <w:p>
+      <w:pPr>
+        <w:spacing w:after="120"/>
+      </w:pPr>
+      <w:r>
+        <w:t>Status L16: V0.16.0 – vollständige Wartungs- und Reparaturhistorie je Gerät, eingegebene Kosten, lokale PDF-/Bildbelege, Garantieende mit individuell einstellbaren In-App-Hinweisen und separate Einsatzsperren. 15/15 automatisierte Testmodule sowie 24 JS-Syntaxprüfungen bestanden; GitHub main 124f2ebe65fe geprüft. Chromium-E2E durch ERR_BLOCKED_BY_ADMINISTRATOR blockiert; echter Android-/Offline- und Beleg-Praxistest noch offen.</w:t>
       </w:r>
     </w:p>
     <w:p>
@@ -2881,6 +2906,174 @@
           </w:p>
         </w:tc>
       </w:tr>
+      <w:tr>
+        <w:tc>
+          <w:tcPr>
+            <w:tcW w:type="dxa" w:w="2465"/>
+          </w:tcPr>
+          <w:p>
+            <w:r>
+              <w:t>L12-HF01</w:t>
+            </w:r>
+          </w:p>
+        </w:tc>
+        <w:tc>
+          <w:tcPr>
+            <w:tcW w:type="dxa" w:w="2465"/>
+          </w:tcPr>
+          <w:p>
+            <w:r>
+              <w:t>0.12.1</w:t>
+            </w:r>
+          </w:p>
+        </w:tc>
+        <w:tc>
+          <w:tcPr>
+            <w:tcW w:type="dxa" w:w="2465"/>
+          </w:tcPr>
+          <w:p>
+            <w:r>
+              <w:t>27.10.2026</w:t>
+            </w:r>
+          </w:p>
+        </w:tc>
+        <w:tc>
+          <w:tcPr>
+            <w:tcW w:type="dxa" w:w="2465"/>
+          </w:tcPr>
+          <w:p>
+            <w:r>
+              <w:t>GitHub: 8efcd5b · Node PASS · Chrome/Android offen</w:t>
+            </w:r>
+          </w:p>
+        </w:tc>
+      </w:tr>
+      <w:tr>
+        <w:tc>
+          <w:tcPr>
+            <w:tcW w:type="dxa" w:w="2465"/>
+          </w:tcPr>
+          <w:p>
+            <w:r>
+              <w:t>L13</w:t>
+            </w:r>
+          </w:p>
+        </w:tc>
+        <w:tc>
+          <w:tcPr>
+            <w:tcW w:type="dxa" w:w="2465"/>
+          </w:tcPr>
+          <w:p>
+            <w:r>
+              <w:t>0.13.0</w:t>
+            </w:r>
+          </w:p>
+        </w:tc>
+        <w:tc>
+          <w:tcPr>
+            <w:tcW w:type="dxa" w:w="2465"/>
+          </w:tcPr>
+          <w:p>
+            <w:r>
+              <w:t>27.10.2026</w:t>
+            </w:r>
+          </w:p>
+        </w:tc>
+        <w:tc>
+          <w:tcPr>
+            <w:tcW w:type="dxa" w:w="2465"/>
+          </w:tcPr>
+          <w:p>
+            <w:r>
+              <w:t>Node/11 Regressionen PASS · GitHub main bestätigt · Chrome/Android-Praxistest offen</w:t>
+            </w:r>
+          </w:p>
+        </w:tc>
+      </w:tr>
+      <w:tr>
+        <w:tc>
+          <w:tcPr>
+            <w:tcW w:type="dxa" w:w="2465"/>
+          </w:tcPr>
+          <w:p>
+            <w:r>
+              <w:t>L14</w:t>
+            </w:r>
+          </w:p>
+        </w:tc>
+        <w:tc>
+          <w:tcPr>
+            <w:tcW w:type="dxa" w:w="2465"/>
+          </w:tcPr>
+          <w:p>
+            <w:r>
+              <w:t>0.14.0</w:t>
+            </w:r>
+          </w:p>
+        </w:tc>
+        <w:tc>
+          <w:tcPr>
+            <w:tcW w:type="dxa" w:w="2465"/>
+          </w:tcPr>
+          <w:p>
+            <w:r>
+              <w:t>27.10.2026</w:t>
+            </w:r>
+          </w:p>
+        </w:tc>
+        <w:tc>
+          <w:tcPr>
+            <w:tcW w:type="dxa" w:w="2465"/>
+          </w:tcPr>
+          <w:p>
+            <w:r>
+              <w:t>GitHub ff3153a · Node 13/13 PASS · Chrome/Android offen</w:t>
+            </w:r>
+          </w:p>
+        </w:tc>
+      </w:tr>
+      <w:tr>
+        <w:tc>
+          <w:tcPr>
+            <w:tcW w:type="dxa" w:w="2465"/>
+          </w:tcPr>
+          <w:p>
+            <w:r>
+              <w:t>L15</w:t>
+            </w:r>
+          </w:p>
+        </w:tc>
+        <w:tc>
+          <w:tcPr>
+            <w:tcW w:type="dxa" w:w="2465"/>
+          </w:tcPr>
+          <w:p>
+            <w:r>
+              <w:t>0.15.0</w:t>
+            </w:r>
+          </w:p>
+        </w:tc>
+        <w:tc>
+          <w:tcPr>
+            <w:tcW w:type="dxa" w:w="2465"/>
+          </w:tcPr>
+          <w:p>
+            <w:r>
+              <w:t>27.10.2026</w:t>
+            </w:r>
+          </w:p>
+        </w:tc>
+        <w:tc>
+          <w:tcPr>
+            <w:tcW w:type="dxa" w:w="2465"/>
+          </w:tcPr>
+          <w:p>
+            <w:r>
+              <w:t>GitHub 1be00c7e · Node 14/14 PASS · Chrome/Android offen</w:t>
+            </w:r>
+          </w:p>
+        </w:tc>
+      </w:tr>
     </w:tbl>
     <w:p>
       <w:pPr>
@@ -4095,12 +4288,945 @@
         <w:t xml:space="preserve">  L12 – Installation/Cache-Update auf dem echten Android-Handy kontrolliert</w:t>
       </w:r>
     </w:p>
-    <w:sectPr>
-      <w:pgSz w:w="12240" w:h="15840"/>
-      <w:pgMar w:top="1191" w:right="1134" w:bottom="1020" w:left="1247" w:header="720" w:footer="720" w:gutter="0"/>
-      <w:cols w:space="720"/>
-      <w:docGrid w:linePitch="360"/>
-    </w:sectPr>
+    <w:p>
+      <w:pPr>
+        <w:pStyle w:val="Heading2"/>
+      </w:pPr>
+      <w:r>
+        <w:t>L12-HF01 · Hotfix V0.12.1 / Touch, Regalzoom und Paarzählung</w:t>
+      </w:r>
+    </w:p>
+    <w:p>
+      <w:r>
+        <w:t>Hotfix zur bestehenden Lagerhaus-Version V0.12.0. Keine neue reguläre L13-Stufe. Vorhandene Räume, Regale, Artikel, Kennungen, Standortbuchungen und Tracking-Daten bleiben in den bisherigen lokalen Speicherbereichen erhalten. Die Artikelerfassung erhält lediglich ein optionales Feld zur Paarzählung.</w:t>
+      </w:r>
+    </w:p>
+    <w:p>
+      <w:r>
+        <w:t>H01 – Die Zwei-Finger-Geste wird im 3D-Viewport abgefangen; ausschließlich die Skizze wird skaliert. Ein Finger kann auf freier Skizzenfläche schwenken. Zoom-Tasten/1:1 bleiben. Die übrige App wird nicht skaliert.</w:t>
+      </w:r>
+    </w:p>
+    <w:p>
+      <w:r>
+        <w:t>H02 – Ein kurzes Antippen eines Regals auf der Lagerbereich-Vorschau navigiert direkt zur Regaldetailansicht; im Raum öffnet die Regalauswahl ein bildschirmfüllendes Regalfenster. Fächer und tatsächlich zugeordnete Artikel mit Mengen sind dort ersichtlich. Leere Fächer bleiben sichtbar.</w:t>
+      </w:r>
+    </w:p>
+    <w:p>
+      <w:r>
+        <w:t>H03 – Artikel werden ausschließlich aus echten Standortbeständen in Regal/Fach angezeigt. Noch nur dem Raum zugewiesene Artikel erscheinen separat mit Einräumhilfe; es erfolgt ausdrücklich KEINE fiktive automatische Regalzuordnung. Bestehende Lagerorte und Kennungen werden nicht überschrieben.</w:t>
+      </w:r>
+    </w:p>
+    <w:p>
+      <w:r>
+        <w:t>H04 – Verbrauchsmaterial kann in neuen/vollen/angebrochenen Packungen geführt werden. Bei Handschuhen (automatisch erkannt oder manuell aktiviert) wird zusätzlich in Paaren gerechnet, 1 Paar = 2 Stück; Einzelverbrauch bleibt möglich. Bestandsführung, Packungsgröße und Restmengen bleiben in Grundeinheiten. Weitere Verbrauchsartikel nutzen individuell Stück, Packung, ml, Liter usw. bei unveränderter Bestandslogik. Der Paarmodus ist pro Artikel konfigurierbar.</w:t>
+      </w:r>
+    </w:p>
+    <w:p>
+      <w:pPr>
+        <w:pStyle w:val="Heading2"/>
+      </w:pPr>
+      <w:r>
+        <w:t>L12-HF01 · Abnahmecheckliste zum Abhaken</w:t>
+      </w:r>
+    </w:p>
+    <w:p>
+      <w:pPr>
+        <w:spacing w:after="60"/>
+      </w:pPr>
+      <w:sdt>
+        <w:sdtPr>
+          <w:alias w:val="Hotfix-Abnahme"/>
+          <w14:checkbox>
+            <w14:checked w14:val="1"/>
+            <w14:checkedState w14:val="2612" w14:font="MS Gothic"/>
+            <w14:uncheckedState w14:val="2610" w14:font="MS Gothic"/>
+          </w14:checkbox>
+        </w:sdtPr>
+        <w:sdtContent>
+          <w:r>
+            <w:t>☑</w:t>
+          </w:r>
+        </w:sdtContent>
+      </w:sdt>
+      <w:r>
+        <w:rPr>
+          <w:sz w:val="18"/>
+        </w:rPr>
+        <w:t xml:space="preserve">  H01 – Skalierung ist auf 3D-Skizzenfenster beschränkt; eigenes Gesture-Handling implementiert</w:t>
+      </w:r>
+    </w:p>
+    <w:p>
+      <w:pPr>
+        <w:spacing w:after="60"/>
+      </w:pPr>
+      <w:sdt>
+        <w:sdtPr>
+          <w:alias w:val="Hotfix-Abnahme"/>
+          <w14:checkbox>
+            <w14:checked w14:val="1"/>
+            <w14:checkedState w14:val="2612" w14:font="MS Gothic"/>
+            <w14:uncheckedState w14:val="2610" w14:font="MS Gothic"/>
+          </w14:checkbox>
+        </w:sdtPr>
+        <w:sdtContent>
+          <w:r>
+            <w:t>☑</w:t>
+          </w:r>
+        </w:sdtContent>
+      </w:sdt>
+      <w:r>
+        <w:rPr>
+          <w:sz w:val="18"/>
+        </w:rPr>
+        <w:t xml:space="preserve">  H01 – Skizze schwenken, Zoom +/- und Reset implementiert</w:t>
+      </w:r>
+    </w:p>
+    <w:p>
+      <w:pPr>
+        <w:spacing w:after="60"/>
+      </w:pPr>
+      <w:sdt>
+        <w:sdtPr>
+          <w:alias w:val="Hotfix-Abnahme"/>
+          <w14:checkbox>
+            <w14:checked w14:val="1"/>
+            <w14:checkedState w14:val="2612" w14:font="MS Gothic"/>
+            <w14:uncheckedState w14:val="2610" w14:font="MS Gothic"/>
+          </w14:checkbox>
+        </w:sdtPr>
+        <w:sdtContent>
+          <w:r>
+            <w:t>☑</w:t>
+          </w:r>
+        </w:sdtContent>
+      </w:sdt>
+      <w:r>
+        <w:rPr>
+          <w:sz w:val="18"/>
+        </w:rPr>
+        <w:t xml:space="preserve">  H02 – Direktes Antippen eines Regals in der Lagerbereichs-Vorschau öffnet dessen Detailroute</w:t>
+      </w:r>
+    </w:p>
+    <w:p>
+      <w:pPr>
+        <w:spacing w:after="60"/>
+      </w:pPr>
+      <w:sdt>
+        <w:sdtPr>
+          <w:alias w:val="Hotfix-Abnahme"/>
+          <w14:checkbox>
+            <w14:checked w14:val="1"/>
+            <w14:checkedState w14:val="2612" w14:font="MS Gothic"/>
+            <w14:uncheckedState w14:val="2610" w14:font="MS Gothic"/>
+          </w14:checkbox>
+        </w:sdtPr>
+        <w:sdtContent>
+          <w:r>
+            <w:t>☑</w:t>
+          </w:r>
+        </w:sdtContent>
+      </w:sdt>
+      <w:r>
+        <w:rPr>
+          <w:sz w:val="18"/>
+        </w:rPr>
+        <w:t xml:space="preserve">  H02 – Große Regalansicht mit Fächern, real zugeordneten Artikeln und Schließen-Funktion implementiert</w:t>
+      </w:r>
+    </w:p>
+    <w:p>
+      <w:pPr>
+        <w:spacing w:after="60"/>
+      </w:pPr>
+      <w:sdt>
+        <w:sdtPr>
+          <w:alias w:val="Hotfix-Abnahme"/>
+          <w14:checkbox>
+            <w14:checked w14:val="1"/>
+            <w14:checkedState w14:val="2612" w14:font="MS Gothic"/>
+            <w14:uncheckedState w14:val="2610" w14:font="MS Gothic"/>
+          </w14:checkbox>
+        </w:sdtPr>
+        <w:sdtContent>
+          <w:r>
+            <w:t>☑</w:t>
+          </w:r>
+        </w:sdtContent>
+      </w:sdt>
+      <w:r>
+        <w:rPr>
+          <w:sz w:val="18"/>
+        </w:rPr>
+        <w:t xml:space="preserve">  H03 – Artikel/Fächer aus vorhandener Bestandsbuchung statt erfundener Packungen angezeigt</w:t>
+      </w:r>
+    </w:p>
+    <w:p>
+      <w:pPr>
+        <w:spacing w:after="60"/>
+      </w:pPr>
+      <w:sdt>
+        <w:sdtPr>
+          <w:alias w:val="Hotfix-Abnahme"/>
+          <w14:checkbox>
+            <w14:checked w14:val="1"/>
+            <w14:checkedState w14:val="2612" w14:font="MS Gothic"/>
+            <w14:uncheckedState w14:val="2610" w14:font="MS Gothic"/>
+          </w14:checkbox>
+        </w:sdtPr>
+        <w:sdtContent>
+          <w:r>
+            <w:t>☑</w:t>
+          </w:r>
+        </w:sdtContent>
+      </w:sdt>
+      <w:r>
+        <w:rPr>
+          <w:sz w:val="18"/>
+        </w:rPr>
+        <w:t xml:space="preserve">  H03 – Nicht eingeräumte Raumartikel getrennt gezeigt, Einräumbuchung bleibt erhalten</w:t>
+      </w:r>
+    </w:p>
+    <w:p>
+      <w:pPr>
+        <w:spacing w:after="60"/>
+      </w:pPr>
+      <w:sdt>
+        <w:sdtPr>
+          <w:alias w:val="Hotfix-Abnahme"/>
+          <w14:checkbox>
+            <w14:checked w14:val="1"/>
+            <w14:checkedState w14:val="2612" w14:font="MS Gothic"/>
+            <w14:uncheckedState w14:val="2610" w14:font="MS Gothic"/>
+          </w14:checkbox>
+        </w:sdtPr>
+        <w:sdtContent>
+          <w:r>
+            <w:t>☑</w:t>
+          </w:r>
+        </w:sdtContent>
+      </w:sdt>
+      <w:r>
+        <w:rPr>
+          <w:sz w:val="18"/>
+        </w:rPr>
+        <w:t xml:space="preserve">  H04 – Optionaler Paarmodus, 1 Paar = 2 Stück, Mengen/Restmengen im selben Datenmodell umgesetzt</w:t>
+      </w:r>
+    </w:p>
+    <w:p>
+      <w:pPr>
+        <w:spacing w:after="60"/>
+      </w:pPr>
+      <w:sdt>
+        <w:sdtPr>
+          <w:alias w:val="Hotfix-Abnahme"/>
+          <w14:checkbox>
+            <w14:checked w14:val="1"/>
+            <w14:checkedState w14:val="2612" w14:font="MS Gothic"/>
+            <w14:uncheckedState w14:val="2610" w14:font="MS Gothic"/>
+          </w14:checkbox>
+        </w:sdtPr>
+        <w:sdtContent>
+          <w:r>
+            <w:t>☑</w:t>
+          </w:r>
+        </w:sdtContent>
+      </w:sdt>
+      <w:r>
+        <w:rPr>
+          <w:sz w:val="18"/>
+        </w:rPr>
+        <w:t xml:space="preserve">  H04 – Handschuh-Packungen, verbrauchte Paare und Einzelhandschuhe regressionsgetestet</w:t>
+      </w:r>
+    </w:p>
+    <w:p>
+      <w:pPr>
+        <w:spacing w:after="60"/>
+      </w:pPr>
+      <w:sdt>
+        <w:sdtPr>
+          <w:alias w:val="Hotfix-Abnahme"/>
+          <w14:checkbox>
+            <w14:checked w14:val="1"/>
+            <w14:checkedState w14:val="2612" w14:font="MS Gothic"/>
+            <w14:uncheckedState w14:val="2610" w14:font="MS Gothic"/>
+          </w14:checkbox>
+        </w:sdtPr>
+        <w:sdtContent>
+          <w:r>
+            <w:t>☑</w:t>
+          </w:r>
+        </w:sdtContent>
+      </w:sdt>
+      <w:r>
+        <w:rPr>
+          <w:sz w:val="18"/>
+        </w:rPr>
+        <w:t xml:space="preserve">  L05–L12-HF01 Node-Regressionstests und produktive JS-Syntaxprüfungen bestanden</w:t>
+      </w:r>
+    </w:p>
+    <w:p>
+      <w:pPr>
+        <w:spacing w:after="60"/>
+      </w:pPr>
+      <w:sdt>
+        <w:sdtPr>
+          <w:alias w:val="Hotfix-Abnahme"/>
+          <w14:checkbox>
+            <w14:checked w14:val="1"/>
+            <w14:checkedState w14:val="2612" w14:font="MS Gothic"/>
+            <w14:uncheckedState w14:val="2610" w14:font="MS Gothic"/>
+          </w14:checkbox>
+        </w:sdtPr>
+        <w:sdtContent>
+          <w:r>
+            <w:t>☑</w:t>
+          </w:r>
+        </w:sdtContent>
+      </w:sdt>
+      <w:r>
+        <w:rPr>
+          <w:sz w:val="18"/>
+        </w:rPr>
+        <w:t xml:space="preserve">  Version 0.12.1 in App/version.json/Service Worker und Offline-Dateiliste abgestimmt</w:t>
+      </w:r>
+    </w:p>
+    <w:p>
+      <w:pPr>
+        <w:spacing w:after="60"/>
+      </w:pPr>
+      <w:sdt>
+        <w:sdtPr>
+          <w:alias w:val="Hotfix-Abnahme"/>
+          <w14:checkbox>
+            <w14:checked w14:val="0"/>
+            <w14:checkedState w14:val="2612" w14:font="MS Gothic"/>
+            <w14:uncheckedState w14:val="2610" w14:font="MS Gothic"/>
+          </w14:checkbox>
+        </w:sdtPr>
+        <w:sdtContent>
+          <w:r>
+            <w:t>☐</w:t>
+          </w:r>
+        </w:sdtContent>
+      </w:sdt>
+      <w:r>
+        <w:rPr>
+          <w:sz w:val="18"/>
+        </w:rPr>
+        <w:t xml:space="preserve">  Chrome-Browser-E2E mit gespeicherter IndexedDB und visueller Touchbedienung bestätigt (lokal durch Admin-Policy blockiert)</w:t>
+      </w:r>
+    </w:p>
+    <w:p>
+      <w:pPr>
+        <w:spacing w:after="60"/>
+      </w:pPr>
+      <w:sdt>
+        <w:sdtPr>
+          <w:alias w:val="Hotfix-Abnahme"/>
+          <w14:checkbox>
+            <w14:checked w14:val="0"/>
+            <w14:checkedState w14:val="2612" w14:font="MS Gothic"/>
+            <w14:uncheckedState w14:val="2610" w14:font="MS Gothic"/>
+          </w14:checkbox>
+        </w:sdtPr>
+        <w:sdtContent>
+          <w:r>
+            <w:t>☐</w:t>
+          </w:r>
+        </w:sdtContent>
+      </w:sdt>
+      <w:r>
+        <w:rPr>
+          <w:sz w:val="18"/>
+        </w:rPr>
+        <w:t xml:space="preserve">  Echter Android-Test: Pinch zoomt nur Skizze, kein Seitenzoom; Regal aus Bild-2-Übersicht direkt öffnen</w:t>
+      </w:r>
+    </w:p>
+    <w:p>
+      <w:pPr>
+        <w:spacing w:after="60"/>
+      </w:pPr>
+      <w:sdt>
+        <w:sdtPr>
+          <w:alias w:val="Hotfix-Abnahme"/>
+          <w14:checkbox>
+            <w14:checked w14:val="0"/>
+            <w14:checkedState w14:val="2612" w14:font="MS Gothic"/>
+            <w14:uncheckedState w14:val="2610" w14:font="MS Gothic"/>
+          </w14:checkbox>
+        </w:sdtPr>
+        <w:sdtContent>
+          <w:r>
+            <w:t>☐</w:t>
+          </w:r>
+        </w:sdtContent>
+      </w:sdt>
+      <w:r>
+        <w:rPr>
+          <w:sz w:val="18"/>
+        </w:rPr>
+        <w:t xml:space="preserve">  Echter Android-Test: Packungen, Paar-/Stückverbrauch, Daten nach Neustart und Offlinebetrieb kontrollieren</w:t>
+      </w:r>
+    </w:p>
+    <w:p>
+      <w:pPr>
+        <w:spacing w:after="60"/>
+      </w:pPr>
+      <w:sdt>
+        <w:sdtPr>
+          <w:alias w:val="Hotfix-Abnahme"/>
+          <w14:checkbox>
+            <w14:checked w14:val="0"/>
+            <w14:checkedState w14:val="2612" w14:font="MS Gothic"/>
+            <w14:uncheckedState w14:val="2610" w14:font="MS Gothic"/>
+          </w14:checkbox>
+        </w:sdtPr>
+        <w:sdtContent>
+          <w:r>
+            <w:t>☑</w:t>
+          </w:r>
+        </w:sdtContent>
+      </w:sdt>
+      <w:r>
+        <w:rPr>
+          <w:sz w:val="18"/>
+        </w:rPr>
+        <w:t xml:space="preserve">  GitHub main mit V0.12.1 nach Tests veröffentlicht und Rückprüfung erfolgreich</w:t>
+      </w:r>
+    </w:p>
+    <w:p>
+      <w:pPr>
+        <w:spacing w:after="60"/>
+      </w:pPr>
+      <w:sdt>
+        <w:sdtPr>
+          <w:alias w:val="Hotfix-Abnahme"/>
+          <w14:checkbox>
+            <w14:checked w14:val="0"/>
+            <w14:checkedState w14:val="2612" w14:font="MS Gothic"/>
+            <w14:uncheckedState w14:val="2610" w14:font="MS Gothic"/>
+          </w14:checkbox>
+        </w:sdtPr>
+        <w:sdtContent>
+          <w:r>
+            <w:t>☑</w:t>
+          </w:r>
+        </w:sdtContent>
+      </w:sdt>
+      <w:r>
+        <w:rPr>
+          <w:sz w:val="18"/>
+        </w:rPr>
+        <w:t xml:space="preserve">  Finale ZIP und Word-Dokument einschließlich Integritätsprüfung bereitgestellt</w:t>
+      </w:r>
+    </w:p>
+    <w:p>
+      <w:r>
+        <w:t>Prüfergebnis 27.10.2026: Automatische fachliche Logik-/Regressionsprüfungen und JS-Syntax PASS; lokaler Playwright-Chromium-E2E durch ERR_BLOCKED_BY_ADMINISTRATOR nicht möglich; keine Behauptung eines Android-Gerätetests. GitHub main veröffentlicht: Commit 8efcd5b0bf6a3a262a6d2ad26a428a16b66eafba; version.json, Service Worker und Paarzählungsmodul danach erneut von main abgerufen.</w:t>
+      </w:r>
+    </w:p>
+    <w:p>
+      <w:pPr>
+        <w:pStyle w:val="Heading2"/>
+      </w:pPr>
+      <w:r>
+        <w:t>L12-HF02 · Hotfix V0.12.2 / Regaldialog &amp; Schließen</w:t>
+      </w:r>
+    </w:p>
+    <w:p>
+      <w:r>
+        <w:t>Fehlerbericht mit Android-Screenshot: Kopfzeilen der Regaldetailansicht überlagern den festen App-Header; das Schließen-X ist vom Header verdeckt und dadurch nicht zuverlässig anklickbar. Ursache ist ein position:fixed-Panel im niedrigeren Stacking-Context von #view.</w:t>
+      </w:r>
+    </w:p>
+    <w:p>
+      <w:r>
+        <w:t>Lösung: Regal-Detailansicht als natives Browser-Dialogfenster (&lt;dialog&gt; + showModal) im Top-Layer. Separates zweispaltiges Kopfzeilen-Raster, responsiver Zeilenumbruch, große Touch-Fläche. Schließen per X/Escape und kontrollierte Rücknavigation bei Regal-Direktlinks. Bestehende Lagerdaten und Packungen unverändert.</w:t>
+      </w:r>
+    </w:p>
+    <w:p>
+      <w:pPr>
+        <w:pStyle w:val="Heading2"/>
+      </w:pPr>
+      <w:r>
+        <w:t>L12-HF02 · Abnahmecheckliste zum Abhaken</w:t>
+      </w:r>
+    </w:p>
+    <w:p>
+      <w:pPr>
+        <w:spacing w:after="60"/>
+      </w:pPr>
+      <w:sdt>
+        <w:sdtPr>
+          <w:alias w:val="Hotfix-Abnahme"/>
+          <w14:checkbox>
+            <w14:checked w14:val="1"/>
+            <w14:checkedState w14:val="2612" w14:font="MS Gothic"/>
+            <w14:uncheckedState w14:val="2610" w14:font="MS Gothic"/>
+          </w14:checkbox>
+        </w:sdtPr>
+        <w:sdtContent>
+          <w:r>
+            <w:t>☑</w:t>
+          </w:r>
+        </w:sdtContent>
+      </w:sdt>
+      <w:r>
+        <w:rPr>
+          <w:sz w:val="18"/>
+        </w:rPr>
+        <w:t xml:space="preserve">  HF02 – Überlagerung zwischen Regal-Detaildialog und App-Kopf beseitigt</w:t>
+      </w:r>
+    </w:p>
+    <w:p>
+      <w:pPr>
+        <w:spacing w:after="60"/>
+      </w:pPr>
+      <w:sdt>
+        <w:sdtPr>
+          <w:alias w:val="Hotfix-Abnahme"/>
+          <w14:checkbox>
+            <w14:checked w14:val="1"/>
+            <w14:checkedState w14:val="2612" w14:font="MS Gothic"/>
+            <w14:uncheckedState w14:val="2610" w14:font="MS Gothic"/>
+          </w14:checkbox>
+        </w:sdtPr>
+        <w:sdtContent>
+          <w:r>
+            <w:t>☑</w:t>
+          </w:r>
+        </w:sdtContent>
+      </w:sdt>
+      <w:r>
+        <w:rPr>
+          <w:sz w:val="18"/>
+        </w:rPr>
+        <w:t xml:space="preserve">  HF02 – Schließen-X mit echter Touch-Fläche und Klick-Verkabelung korrigiert</w:t>
+      </w:r>
+    </w:p>
+    <w:p>
+      <w:pPr>
+        <w:spacing w:after="60"/>
+      </w:pPr>
+      <w:sdt>
+        <w:sdtPr>
+          <w:alias w:val="Hotfix-Abnahme"/>
+          <w14:checkbox>
+            <w14:checked w14:val="1"/>
+            <w14:checkedState w14:val="2612" w14:font="MS Gothic"/>
+            <w14:uncheckedState w14:val="2610" w14:font="MS Gothic"/>
+          </w14:checkbox>
+        </w:sdtPr>
+        <w:sdtContent>
+          <w:r>
+            <w:t>☑</w:t>
+          </w:r>
+        </w:sdtContent>
+      </w:sdt>
+      <w:r>
+        <w:rPr>
+          <w:sz w:val="18"/>
+        </w:rPr>
+        <w:t xml:space="preserve">  HF02 – Regalname, Status/Kennung und Schließen responsiv getrennt</w:t>
+      </w:r>
+    </w:p>
+    <w:p>
+      <w:pPr>
+        <w:spacing w:after="60"/>
+      </w:pPr>
+      <w:sdt>
+        <w:sdtPr>
+          <w:alias w:val="Hotfix-Abnahme"/>
+          <w14:checkbox>
+            <w14:checked w14:val="1"/>
+            <w14:checkedState w14:val="2612" w14:font="MS Gothic"/>
+            <w14:uncheckedState w14:val="2610" w14:font="MS Gothic"/>
+          </w14:checkbox>
+        </w:sdtPr>
+        <w:sdtContent>
+          <w:r>
+            <w:t>☑</w:t>
+          </w:r>
+        </w:sdtContent>
+      </w:sdt>
+      <w:r>
+        <w:rPr>
+          <w:sz w:val="18"/>
+        </w:rPr>
+        <w:t xml:space="preserve">  HF02 – Escape-/Zurückverhalten inklusive Regal-Direktlink bereinigt</w:t>
+      </w:r>
+    </w:p>
+    <w:p>
+      <w:pPr>
+        <w:spacing w:after="60"/>
+      </w:pPr>
+      <w:sdt>
+        <w:sdtPr>
+          <w:alias w:val="Hotfix-Abnahme"/>
+          <w14:checkbox>
+            <w14:checked w14:val="1"/>
+            <w14:checkedState w14:val="2612" w14:font="MS Gothic"/>
+            <w14:uncheckedState w14:val="2610" w14:font="MS Gothic"/>
+          </w14:checkbox>
+        </w:sdtPr>
+        <w:sdtContent>
+          <w:r>
+            <w:t>☑</w:t>
+          </w:r>
+        </w:sdtContent>
+      </w:sdt>
+      <w:r>
+        <w:rPr>
+          <w:sz w:val="18"/>
+        </w:rPr>
+        <w:t xml:space="preserve">  HF02 – Version 0.12.2, Offlinecache und alle bisherigen L04–L12 Regressionstests geprüft</w:t>
+      </w:r>
+    </w:p>
+    <w:p>
+      <w:pPr>
+        <w:spacing w:after="60"/>
+      </w:pPr>
+      <w:sdt>
+        <w:sdtPr>
+          <w:alias w:val="Hotfix-Abnahme"/>
+          <w14:checkbox>
+            <w14:checked w14:val="1"/>
+            <w14:checkedState w14:val="2612" w14:font="MS Gothic"/>
+            <w14:uncheckedState w14:val="2610" w14:font="MS Gothic"/>
+          </w14:checkbox>
+        </w:sdtPr>
+        <w:sdtContent>
+          <w:r>
+            <w:t>☑</w:t>
+          </w:r>
+        </w:sdtContent>
+      </w:sdt>
+      <w:r>
+        <w:rPr>
+          <w:sz w:val="18"/>
+        </w:rPr>
+        <w:t xml:space="preserve">  HF02 – Chromium-Dialog-Komponententest bei 320/360/412/768px, X/Escape und Layout bestanden</w:t>
+      </w:r>
+    </w:p>
+    <w:p>
+      <w:pPr>
+        <w:spacing w:after="60"/>
+      </w:pPr>
+      <w:sdt>
+        <w:sdtPr>
+          <w:alias w:val="Hotfix-Abnahme"/>
+          <w14:checkbox>
+            <w14:checked w14:val="0"/>
+            <w14:checkedState w14:val="2612" w14:font="MS Gothic"/>
+            <w14:uncheckedState w14:val="2610" w14:font="MS Gothic"/>
+          </w14:checkbox>
+        </w:sdtPr>
+        <w:sdtContent>
+          <w:r>
+            <w:t>☐</w:t>
+          </w:r>
+        </w:sdtContent>
+      </w:sdt>
+      <w:r>
+        <w:rPr>
+          <w:sz w:val="18"/>
+        </w:rPr>
+        <w:t xml:space="preserve">  HF02 – Kompletter App-Browser-End-to-End-Test (lokaler URL-Zugriff gesperrt)</w:t>
+      </w:r>
+    </w:p>
+    <w:p>
+      <w:pPr>
+        <w:spacing w:after="60"/>
+      </w:pPr>
+      <w:sdt>
+        <w:sdtPr>
+          <w:alias w:val="Hotfix-Abnahme"/>
+          <w14:checkbox>
+            <w14:checked w14:val="0"/>
+            <w14:checkedState w14:val="2612" w14:font="MS Gothic"/>
+            <w14:uncheckedState w14:val="2610" w14:font="MS Gothic"/>
+          </w14:checkbox>
+        </w:sdtPr>
+        <w:sdtContent>
+          <w:r>
+            <w:t>☐</w:t>
+          </w:r>
+        </w:sdtContent>
+      </w:sdt>
+      <w:r>
+        <w:rPr>
+          <w:sz w:val="18"/>
+        </w:rPr>
+        <w:t xml:space="preserve">  HF02 – Echter Android-Praxistest inkl. Schließen-X und App-Update</w:t>
+      </w:r>
+    </w:p>
+    <w:p>
+      <w:pPr>
+        <w:spacing w:after="60"/>
+      </w:pPr>
+      <w:sdt>
+        <w:sdtPr>
+          <w:alias w:val="Hotfix-Abnahme"/>
+          <w14:checkbox>
+            <w14:checked w14:val="1"/>
+            <w14:checkedState w14:val="2612" w14:font="MS Gothic"/>
+            <w14:uncheckedState w14:val="2610" w14:font="MS Gothic"/>
+          </w14:checkbox>
+        </w:sdtPr>
+        <w:sdtContent>
+          <w:r>
+            <w:t>☑</w:t>
+          </w:r>
+        </w:sdtContent>
+      </w:sdt>
+      <w:r>
+        <w:rPr>
+          <w:sz w:val="18"/>
+        </w:rPr>
+        <w:t xml:space="preserve">  HF02 – GitHub main nach Qualitätskontrolle veröffentlicht und aktuelle Dateien abgerufen</w:t>
+      </w:r>
+    </w:p>
+    <w:p>
+      <w:pPr>
+        <w:spacing w:after="60"/>
+      </w:pPr>
+      <w:sdt>
+        <w:sdtPr>
+          <w:alias w:val="Hotfix-Abnahme"/>
+          <w14:checkbox>
+            <w14:checked w14:val="1"/>
+            <w14:checkedState w14:val="2612" w14:font="MS Gothic"/>
+            <w14:uncheckedState w14:val="2610" w14:font="MS Gothic"/>
+          </w14:checkbox>
+        </w:sdtPr>
+        <w:sdtContent>
+          <w:r>
+            <w:t>☑</w:t>
+          </w:r>
+        </w:sdtContent>
+      </w:sdt>
+      <w:r>
+        <w:rPr>
+          <w:sz w:val="18"/>
+        </w:rPr>
+        <w:t xml:space="preserve">  HF02 – Fertige ZIP inklusive aktualisierter bauhaus.docx mit Integritätsprüfung</w:t>
+      </w:r>
+    </w:p>
+    <w:p>
+      <w:r/>
+      <w:r>
+        <w:t>Prüfhinweis 27.10.2026: JavaScript-/Node-Regressionen und der isolierte Chromium-Dialogtest in 320/360/412/768 CSS-Pixeln bestanden, einschließlich X- und Escape-Bedienung. Der vollständige App-URL-E2E ist lokal durch ERR_BLOCKED_BY_ADMINISTRATOR blockiert. Android-Praxistest noch offen. GitHub main nach Code-Kontrolle veröffentlicht, Commit 61eb3f16b6fe361ebec27e3533793fe25d9f1d78. ZIP samt Word erfolgreich gepackt und auf Integrität geprüft.</w:t>
+      </w:r>
+    </w:p>
+    <w:p>
+      <w:pPr>
+        <w:pStyle w:val="Heading2"/>
+      </w:pPr>
+      <w:r>
+        <w:t>L13 · Kategorien, Suche, Filter und Favoriten · V0.13.0</w:t>
+      </w:r>
+    </w:p>
+    <w:p>
+      <w:r>
+        <w:t>Umsetzung: Kategorien mit dauerhaft stabilen IDs, Unterkategorien, individuellen Symbolen und Farbschemata. Vorhandene Freitext-Kategorien früherer Versionen werden bei erstem Öffnen in einer atomaren IndexedDB-Transaktion übernommen. Artikel-/Bestands-/Gebinde-IDs, Mengen und Fotos bleiben unverändert. Kategorien umbenennen erhält die Referenzen; verwendete Kategorien und Kategorien mit Kindern sind vor versehentlichem Löschen geschützt.</w:t>
+      </w:r>
+    </w:p>
+    <w:p>
+      <w:r>
+        <w:t>Bedienung: Kategorienverwaltung mit sechs Schnellvorlagen, Synonymen und Schreibvarianten; Schlagwörter je Artikel, freie Textsuche, Kategorien-/Artikeltyp-/Favoriten-/Schlagwort-Filter, Sortierung und direkte Favoriten-Sterne. Sichtbare Artikel können gesammelt markiert und einer vorhandenen Kategorie zugeordnet werden. Bei fehlender Kategorie bleibt „Allgemein“ ohne künstliche Kategorie-ID erhalten.</w:t>
+      </w:r>
+    </w:p>
+    <w:p>
+      <w:r>
+        <w:t>Abnahmeprotokoll · die markierten Kontrollen sind durch ausgeführte automatisierte Prüfungen belegt; nicht durchgeführte Checks bleiben ausdrücklich offen.</w:t>
+      </w:r>
+    </w:p>
+    <w:p>
+      <w:pPr>
+        <w:spacing w:after="80"/>
+      </w:pPr>
+      <w:r>
+        <w:rPr>
+          <w:color w:val="1C8666"/>
+          <w:sz w:val="18"/>
+        </w:rPr>
+        <w:t>☑  L13 – Kategorien/Unterkategorien mit stabilen IDs, Symbolen, Farbwahl und Schnellvorlagen implementiert</w:t>
+      </w:r>
+    </w:p>
+    <w:p>
+      <w:pPr>
+        <w:spacing w:after="80"/>
+      </w:pPr>
+      <w:r>
+        <w:rPr>
+          <w:color w:val="1C8666"/>
+          <w:sz w:val="18"/>
+        </w:rPr>
+        <w:t>☑  L13 – Alte freie Kategorien ohne Verlust der Artikel-/Gebinde-/Standortmengen migriert (Node-Tests)</w:t>
+      </w:r>
+    </w:p>
+    <w:p>
+      <w:pPr>
+        <w:spacing w:after="80"/>
+      </w:pPr>
+      <w:r>
+        <w:rPr>
+          <w:color w:val="1C8666"/>
+          <w:sz w:val="18"/>
+        </w:rPr>
+        <w:t>☑  L13 – Kategorieänderung/Umbenennung ohne verwaiste Artikel geprüft (Node-Tests)</w:t>
+      </w:r>
+    </w:p>
+    <w:p>
+      <w:pPr>
+        <w:spacing w:after="80"/>
+      </w:pPr>
+      <w:r>
+        <w:rPr>
+          <w:color w:val="1C8666"/>
+          <w:sz w:val="18"/>
+        </w:rPr>
+        <w:t>☑  L13 – Löschen bei zugeordneten Artikeln oder Unterkategorien verhindert (Node-Tests)</w:t>
+      </w:r>
+    </w:p>
+    <w:p>
+      <w:pPr>
+        <w:spacing w:after="80"/>
+      </w:pPr>
+      <w:r>
+        <w:rPr>
+          <w:color w:val="1C8666"/>
+          <w:sz w:val="18"/>
+        </w:rPr>
+        <w:t>☑  L13 – Tags, Synonyme, Schreibvarianten und Umlaut-Suchnormalisierung geprüft (Node-Tests)</w:t>
+      </w:r>
+    </w:p>
+    <w:p>
+      <w:pPr>
+        <w:spacing w:after="80"/>
+      </w:pPr>
+      <w:r>
+        <w:rPr>
+          <w:color w:val="1C8666"/>
+          <w:sz w:val="18"/>
+        </w:rPr>
+        <w:t>☑  L13 – Kategorie-/Unterkategorienfilter, Typfilter, Favoritenfilter und Sortierung implementiert und logisch getestet</w:t>
+      </w:r>
+    </w:p>
+    <w:p>
+      <w:pPr>
+        <w:spacing w:after="80"/>
+      </w:pPr>
+      <w:r>
+        <w:rPr>
+          <w:color w:val="1C8666"/>
+          <w:sz w:val="18"/>
+        </w:rPr>
+        <w:t>☑  L13 – Direkter Favoritenwechsel und Sammelzuordnung mehrerer Artikel logisch getestet</w:t>
+      </w:r>
+    </w:p>
+    <w:p>
+      <w:pPr>
+        <w:spacing w:after="80"/>
+      </w:pPr>
+      <w:r>
+        <w:rPr>
+          <w:color w:val="1C8666"/>
+          <w:sz w:val="18"/>
+        </w:rPr>
+        <w:t>☑  L13 – Artikelanlage/-änderung mit Kategorien/Tags/Favoriten, Inventarbilanzen erhalten (Node-Tests)</w:t>
+      </w:r>
+    </w:p>
+    <w:p>
+      <w:pPr>
+        <w:spacing w:after="80"/>
+      </w:pPr>
+      <w:r>
+        <w:rPr>
+          <w:color w:val="1C8666"/>
+          <w:sz w:val="18"/>
+        </w:rPr>
+        <w:t>☑  L13 – Alte L05–L12-Regressionstests auf V0.13.0-Versionserwartung adaptiert: 11/11 bestanden</w:t>
+      </w:r>
+    </w:p>
+    <w:p>
+      <w:pPr>
+        <w:spacing w:after="80"/>
+      </w:pPr>
+      <w:r>
+        <w:rPr>
+          <w:color w:val="1C8666"/>
+          <w:sz w:val="18"/>
+        </w:rPr>
+        <w:t>☑  L13 – Alle produktiven JavaScript-Dateien syntaktisch geprüft, neue Offline-Precache-Datei eingetragen</w:t>
+      </w:r>
+    </w:p>
+    <w:p>
+      <w:pPr>
+        <w:spacing w:after="80"/>
+      </w:pPr>
+      <w:r>
+        <w:rPr>
+          <w:sz w:val="18"/>
+        </w:rPr>
+        <w:t>☐  L13 – Vollständiger Chrome-End-to-End-Test inkl. persistenter IndexedDB bestanden (Chromium: ERR_BLOCKED_BY_ADMINISTRATOR)</w:t>
+      </w:r>
+    </w:p>
+    <w:p>
+      <w:pPr>
+        <w:spacing w:after="80"/>
+      </w:pPr>
+      <w:r>
+        <w:rPr>
+          <w:sz w:val="18"/>
+        </w:rPr>
+        <w:t>☐  L13 – Reale Android-Chrome-Touchprüfung, Offlinebetrieb und Update-Erkennung am Gerät durchgeführt</w:t>
+      </w:r>
+    </w:p>
+    <w:p>
+      <w:pPr>
+        <w:spacing w:after="80"/>
+      </w:pPr>
+      <w:r>
+        <w:rPr>
+          <w:color w:val="1C8666"/>
+          <w:sz w:val="18"/>
+        </w:rPr>
+        <w:t>☑  L13 – GitHub main mit V0.13.0 veröffentlicht und Quellcode/Version nach Upload erneut abgeglichen</w:t>
+      </w:r>
+    </w:p>
+    <w:p>
+      <w:pPr>
+        <w:spacing w:after="80"/>
+      </w:pPr>
+      <w:r>
+        <w:rPr>
+          <w:color w:val="1C8666"/>
+          <w:sz w:val="18"/>
+        </w:rPr>
+        <w:t>☑  L13 – Fertige ZIP mit bauhaus.docx erstellt, Integrität und Versionsgleichheit geprüft</w:t>
+      </w:r>
+    </w:p>
+    <w:p>
+      <w:r>
+        <w:t>Prüfgrenzen: Die automatisierten JavaScript-/Node-Tests ersetzen keinen vollständigen Android-Praxistest. Die Browser-URL ist in der Testumgebung administrativ gesperrt; ein bestandener browserbasierter Live-Regressionstest wird nicht behauptet. Keine Browserdaten auf dem Handy löschen, um den bestehenden lokalen Lagerbestand nicht zu verlieren.</w:t>
+      </w:r>
+    </w:p>
+    <w:p>
+      <w:pPr>
+        <w:pStyle w:val="Heading3"/>
+      </w:pPr>
+      <w:r>
+        <w:t>GitHub-Veröffentlichung L13 · 27.10.2026</w:t>
+      </w:r>
+    </w:p>
+    <w:p>
+      <w:r>
+        <w:t>Branch: main   |   Version: V0.13.0   |   Build: L13   |   V0.13.0-Codefreigabe: db43a02366d8bd0e8f2ca0e11cb5ff13228f0344</w:t>
+        <w:br/>
+        <w:t>https://github.com/Darkman0607/Mein-Alltag-/commit/db43a02366d8bd0e8f2ca0e11cb5ff13228f0344</w:t>
+        <w:br/>
+        <w:t>Nach dem Upload per GitHub-Dateiabruf geprüft: version.json, sw.js, Kategorie-Modul, Artikeldatenmodul, Artikelansicht, CSS, app.js und L13-Testdatei. GitHub Pages Live-Auslieferung nicht separat nachgewiesen. Lokale ZIP-Sicherung enthält keine Benutzerdaten aus dem Android-Browser.</w:t>
+      </w:r>
+    </w:p>
     <w:p>
       <w:pPr>
         <w:pStyle w:val="Heading2"/>
@@ -5560,6 +6686,1452 @@
         <w:t xml:space="preserve">  L10 – Reale Android-Kamera-/Galerie-/Offline-/Updateprüfung</w:t>
       </w:r>
     </w:p>
+    <w:p>
+      <w:pPr>
+        <w:pStyle w:val="Heading2"/>
+        <w:keepNext/>
+        <w:pageBreakBefore/>
+      </w:pPr>
+      <w:r>
+        <w:t>L14 · Abnahme V0.14.0 / Lager-Navigator</w:t>
+      </w:r>
+    </w:p>
+    <w:p>
+      <w:pPr>
+        <w:keepNext/>
+      </w:pPr>
+      <w:r>
+        <w:t>Erstellt 27.10.2026. Nur tatsächlich getestete Funktionen werden angekreuzt. Android-/Browser-Praxistests bleiben offen; keine Bestätigung ohne Live-Prüfung.</w:t>
+      </w:r>
+    </w:p>
+    <w:p>
+      <w:pPr>
+        <w:keepNext/>
+      </w:pPr>
+      <w:r>
+        <w:t>Hinweis: Vor dem vorletzten Paket L35 (Zubehör-/Ersatzteilmanager) wird der Nutzer gesondert informiert. Das letzte Paket bleibt L36 (QR-Code-System).</w:t>
+      </w:r>
+    </w:p>
+    <w:p>
+      <w:pPr>
+        <w:spacing w:after="60"/>
+      </w:pPr>
+      <w:sdt>
+        <w:sdtPr>
+          <w:alias w:val="Hotfix-Abnahme"/>
+          <w14:checkbox>
+            <w14:checked w14:val="1"/>
+            <w14:checkedState w14:val="2612" w14:font="MS Gothic"/>
+            <w14:uncheckedState w14:val="2610" w14:font="MS Gothic"/>
+          </w14:checkbox>
+        </w:sdtPr>
+        <w:sdtContent>
+          <w:r>
+            <w:t>☑</w:t>
+          </w:r>
+        </w:sdtContent>
+      </w:sdt>
+      <w:r>
+        <w:rPr>
+          <w:sz w:val="18"/>
+        </w:rPr>
+        <w:t xml:space="preserve">  L14 – Lager-Navigator über Lagerhaus und Artikelverwaltung erreichbar (Routen/Code)</w:t>
+      </w:r>
+    </w:p>
+    <w:p>
+      <w:pPr>
+        <w:spacing w:after="60"/>
+      </w:pPr>
+      <w:sdt>
+        <w:sdtPr>
+          <w:alias w:val="Hotfix-Abnahme"/>
+          <w14:checkbox>
+            <w14:checked w14:val="1"/>
+            <w14:checkedState w14:val="2612" w14:font="MS Gothic"/>
+            <w14:uncheckedState w14:val="2610" w14:font="MS Gothic"/>
+          </w14:checkbox>
+        </w:sdtPr>
+        <w:sdtContent>
+          <w:r>
+            <w:t>☑</w:t>
+          </w:r>
+        </w:sdtContent>
+      </w:sdt>
+      <w:r>
+        <w:rPr>
+          <w:sz w:val="18"/>
+        </w:rPr>
+        <w:t xml:space="preserve">  L14 – Artikel- und Lagerortsuche inklusive Raumfilter umgesetzt</w:t>
+      </w:r>
+    </w:p>
+    <w:p>
+      <w:pPr>
+        <w:spacing w:after="60"/>
+      </w:pPr>
+      <w:sdt>
+        <w:sdtPr>
+          <w:alias w:val="Hotfix-Abnahme"/>
+          <w14:checkbox>
+            <w14:checked w14:val="1"/>
+            <w14:checkedState w14:val="2612" w14:font="MS Gothic"/>
+            <w14:uncheckedState w14:val="2610" w14:font="MS Gothic"/>
+          </w14:checkbox>
+        </w:sdtPr>
+        <w:sdtContent>
+          <w:r>
+            <w:t>☑</w:t>
+          </w:r>
+        </w:sdtContent>
+      </w:sdt>
+      <w:r>
+        <w:rPr>
+          <w:sz w:val="18"/>
+        </w:rPr>
+        <w:t xml:space="preserve">  L14 – Alternative Raum-/Regal-/Fach-Liste umgesetzt</w:t>
+      </w:r>
+    </w:p>
+    <w:p>
+      <w:pPr>
+        <w:spacing w:after="60"/>
+      </w:pPr>
+      <w:sdt>
+        <w:sdtPr>
+          <w:alias w:val="Hotfix-Abnahme"/>
+          <w14:checkbox>
+            <w14:checked w14:val="1"/>
+            <w14:checkedState w14:val="2612" w14:font="MS Gothic"/>
+            <w14:uncheckedState w14:val="2610" w14:font="MS Gothic"/>
+          </w14:checkbox>
+        </w:sdtPr>
+        <w:sdtContent>
+          <w:r>
+            <w:t>☑</w:t>
+          </w:r>
+        </w:sdtContent>
+      </w:sdt>
+      <w:r>
+        <w:rPr>
+          <w:sz w:val="18"/>
+        </w:rPr>
+        <w:t xml:space="preserve">  L14 – Direkter Raum-, Regal- und Fach-Link pro Bestandsposition implementiert</w:t>
+      </w:r>
+    </w:p>
+    <w:p>
+      <w:pPr>
+        <w:spacing w:after="60"/>
+      </w:pPr>
+      <w:sdt>
+        <w:sdtPr>
+          <w:alias w:val="Hotfix-Abnahme"/>
+          <w14:checkbox>
+            <w14:checked w14:val="1"/>
+            <w14:checkedState w14:val="2612" w14:font="MS Gothic"/>
+            <w14:uncheckedState w14:val="2610" w14:font="MS Gothic"/>
+          </w14:checkbox>
+        </w:sdtPr>
+        <w:sdtContent>
+          <w:r>
+            <w:t>☑</w:t>
+          </w:r>
+        </w:sdtContent>
+      </w:sdt>
+      <w:r>
+        <w:rPr>
+          <w:sz w:val="18"/>
+        </w:rPr>
+        <w:t xml:space="preserve">  L14 – 3D-Markierung für gesuchtes Regal und gewähltes Fach programmiert</w:t>
+      </w:r>
+    </w:p>
+    <w:p>
+      <w:pPr>
+        <w:spacing w:after="60"/>
+      </w:pPr>
+      <w:sdt>
+        <w:sdtPr>
+          <w:alias w:val="Hotfix-Abnahme"/>
+          <w14:checkbox>
+            <w14:checked w14:val="1"/>
+            <w14:checkedState w14:val="2612" w14:font="MS Gothic"/>
+            <w14:uncheckedState w14:val="2610" w14:font="MS Gothic"/>
+          </w14:checkbox>
+        </w:sdtPr>
+        <w:sdtContent>
+          <w:r>
+            <w:t>☑</w:t>
+          </w:r>
+        </w:sdtContent>
+      </w:sdt>
+      <w:r>
+        <w:rPr>
+          <w:sz w:val="18"/>
+        </w:rPr>
+        <w:t xml:space="preserve">  L14 – Vergrößertes Regal aus fokussierter 3D-Ansicht aufrufbar</w:t>
+      </w:r>
+    </w:p>
+    <w:p>
+      <w:pPr>
+        <w:spacing w:after="60"/>
+      </w:pPr>
+      <w:sdt>
+        <w:sdtPr>
+          <w:alias w:val="Hotfix-Abnahme"/>
+          <w14:checkbox>
+            <w14:checked w14:val="1"/>
+            <w14:checkedState w14:val="2612" w14:font="MS Gothic"/>
+            <w14:uncheckedState w14:val="2610" w14:font="MS Gothic"/>
+          </w14:checkbox>
+        </w:sdtPr>
+        <w:sdtContent>
+          <w:r>
+            <w:t>☑</w:t>
+          </w:r>
+        </w:sdtContent>
+      </w:sdt>
+      <w:r>
+        <w:rPr>
+          <w:sz w:val="18"/>
+        </w:rPr>
+        <w:t xml:space="preserve">  L14 – Mehrere Lagerorte und Teilmengen ohne Doppelzählung regressionsgeprüft</w:t>
+      </w:r>
+    </w:p>
+    <w:p>
+      <w:pPr>
+        <w:spacing w:after="60"/>
+      </w:pPr>
+      <w:sdt>
+        <w:sdtPr>
+          <w:alias w:val="Hotfix-Abnahme"/>
+          <w14:checkbox>
+            <w14:checked w14:val="1"/>
+            <w14:checkedState w14:val="2612" w14:font="MS Gothic"/>
+            <w14:uncheckedState w14:val="2610" w14:font="MS Gothic"/>
+          </w14:checkbox>
+        </w:sdtPr>
+        <w:sdtContent>
+          <w:r>
+            <w:t>☑</w:t>
+          </w:r>
+        </w:sdtContent>
+      </w:sdt>
+      <w:r>
+        <w:rPr>
+          <w:sz w:val="18"/>
+        </w:rPr>
+        <w:t xml:space="preserve">  L14 – Fehlende/unzugewiesene Lagerorte ohne falsche Direktlinks gekennzeichnet</w:t>
+      </w:r>
+    </w:p>
+    <w:p>
+      <w:pPr>
+        <w:spacing w:after="60"/>
+      </w:pPr>
+      <w:sdt>
+        <w:sdtPr>
+          <w:alias w:val="Hotfix-Abnahme"/>
+          <w14:checkbox>
+            <w14:checked w14:val="1"/>
+            <w14:checkedState w14:val="2612" w14:font="MS Gothic"/>
+            <w14:uncheckedState w14:val="2610" w14:font="MS Gothic"/>
+          </w14:checkbox>
+        </w:sdtPr>
+        <w:sdtContent>
+          <w:r>
+            <w:t>☑</w:t>
+          </w:r>
+        </w:sdtContent>
+      </w:sdt>
+      <w:r>
+        <w:rPr>
+          <w:sz w:val="18"/>
+        </w:rPr>
+        <w:t xml:space="preserve">  L14 – L14-Test und zwölf bisherige Node-Regressionen bestanden</w:t>
+      </w:r>
+    </w:p>
+    <w:p>
+      <w:pPr>
+        <w:spacing w:after="60"/>
+      </w:pPr>
+      <w:sdt>
+        <w:sdtPr>
+          <w:alias w:val="Hotfix-Abnahme"/>
+          <w14:checkbox>
+            <w14:checked w14:val="1"/>
+            <w14:checkedState w14:val="2612" w14:font="MS Gothic"/>
+            <w14:uncheckedState w14:val="2610" w14:font="MS Gothic"/>
+          </w14:checkbox>
+        </w:sdtPr>
+        <w:sdtContent>
+          <w:r>
+            <w:t>☑</w:t>
+          </w:r>
+        </w:sdtContent>
+      </w:sdt>
+      <w:r>
+        <w:rPr>
+          <w:sz w:val="18"/>
+        </w:rPr>
+        <w:t xml:space="preserve">  L14 – Syntax, JSON und Service-Worker-Offline-Dateiliste geprüft</w:t>
+      </w:r>
+    </w:p>
+    <w:p>
+      <w:pPr>
+        <w:spacing w:after="60"/>
+      </w:pPr>
+      <w:sdt>
+        <w:sdtPr>
+          <w:alias w:val="Hotfix-Abnahme"/>
+          <w14:checkbox>
+            <w14:checked w14:val="1"/>
+            <w14:checkedState w14:val="2612" w14:font="MS Gothic"/>
+            <w14:uncheckedState w14:val="2610" w14:font="MS Gothic"/>
+          </w14:checkbox>
+        </w:sdtPr>
+        <w:sdtContent>
+          <w:r>
+            <w:t>☑</w:t>
+          </w:r>
+        </w:sdtContent>
+      </w:sdt>
+      <w:r>
+        <w:rPr>
+          <w:sz w:val="18"/>
+        </w:rPr>
+        <w:t xml:space="preserve">  L14 – GitHub main publiziert und produktive Dateien erneut abgerufen</w:t>
+      </w:r>
+    </w:p>
+    <w:p>
+      <w:pPr>
+        <w:spacing w:after="60"/>
+      </w:pPr>
+      <w:sdt>
+        <w:sdtPr>
+          <w:alias w:val="Hotfix-Abnahme"/>
+          <w14:checkbox>
+            <w14:checked w14:val="1"/>
+            <w14:checkedState w14:val="2612" w14:font="MS Gothic"/>
+            <w14:uncheckedState w14:val="2610" w14:font="MS Gothic"/>
+          </w14:checkbox>
+        </w:sdtPr>
+        <w:sdtContent>
+          <w:r>
+            <w:t>☑</w:t>
+          </w:r>
+        </w:sdtContent>
+      </w:sdt>
+      <w:r>
+        <w:rPr>
+          <w:sz w:val="18"/>
+        </w:rPr>
+        <w:t xml:space="preserve">  L14 – ZIP mit bauhaus.docx erstellt und ZIP-Integrität geprüft</w:t>
+      </w:r>
+    </w:p>
+    <w:p>
+      <w:pPr>
+        <w:spacing w:after="60"/>
+      </w:pPr>
+      <w:sdt>
+        <w:sdtPr>
+          <w:alias w:val="Hotfix-Abnahme"/>
+          <w14:checkbox>
+            <w14:checked w14:val="0"/>
+            <w14:checkedState w14:val="2612" w14:font="MS Gothic"/>
+            <w14:uncheckedState w14:val="2610" w14:font="MS Gothic"/>
+          </w14:checkbox>
+        </w:sdtPr>
+        <w:sdtContent>
+          <w:r>
+            <w:t>☐</w:t>
+          </w:r>
+        </w:sdtContent>
+      </w:sdt>
+      <w:r>
+        <w:rPr>
+          <w:sz w:val="18"/>
+        </w:rPr>
+        <w:t xml:space="preserve">  L14 – Vollständiger lokaler Chrome-Browser-E2E-Test bestanden (Admin-Policy blockiert)</w:t>
+      </w:r>
+    </w:p>
+    <w:p>
+      <w:pPr>
+        <w:spacing w:after="60"/>
+      </w:pPr>
+      <w:sdt>
+        <w:sdtPr>
+          <w:alias w:val="Hotfix-Abnahme"/>
+          <w14:checkbox>
+            <w14:checked w14:val="0"/>
+            <w14:checkedState w14:val="2612" w14:font="MS Gothic"/>
+            <w14:uncheckedState w14:val="2610" w14:font="MS Gothic"/>
+          </w14:checkbox>
+        </w:sdtPr>
+        <w:sdtContent>
+          <w:r>
+            <w:t>☐</w:t>
+          </w:r>
+        </w:sdtContent>
+      </w:sdt>
+      <w:r>
+        <w:rPr>
+          <w:sz w:val="18"/>
+        </w:rPr>
+        <w:t xml:space="preserve">  L14 – Echter Android-Praxistest Touch, Offline, Scrollen und 3D-Zielmarkierung bestanden</w:t>
+      </w:r>
+    </w:p>
+    <w:p>
+      <w:pPr>
+        <w:spacing w:after="60"/>
+      </w:pPr>
+      <w:sdt>
+        <w:sdtPr>
+          <w:alias w:val="Hotfix-Abnahme"/>
+          <w14:checkbox>
+            <w14:checked w14:val="0"/>
+            <w14:checkedState w14:val="2612" w14:font="MS Gothic"/>
+            <w14:uncheckedState w14:val="2610" w14:font="MS Gothic"/>
+          </w14:checkbox>
+        </w:sdtPr>
+        <w:sdtContent>
+          <w:r>
+            <w:t>☐</w:t>
+          </w:r>
+        </w:sdtContent>
+      </w:sdt>
+      <w:r>
+        <w:rPr>
+          <w:sz w:val="18"/>
+        </w:rPr>
+        <w:t xml:space="preserve">  L14 – Auf dem Handy installierte GitHub-Pages-Version V0.14.0 bestätigt</w:t>
+      </w:r>
+    </w:p>
+    <w:p>
+      <w:pPr>
+        <w:pStyle w:val="Heading2"/>
+      </w:pPr>
+      <w:r>
+        <w:t>L15 · Abnahme V0.15.0 / Geräte- und Serviceakten</w:t>
+      </w:r>
+    </w:p>
+    <w:p>
+      <w:r>
+        <w:t>Bearbeitungsstand 27.10.2026. Nur durch automatisierte Tests und Dateiprüfung gestützte Punkte werden angekreuzt. Browser und Android bleiben ausdrücklich offen.</w:t>
+      </w:r>
+    </w:p>
+    <w:p>
+      <w:pPr>
+        <w:spacing w:after="60"/>
+      </w:pPr>
+      <w:sdt>
+        <w:sdtPr>
+          <w:alias w:val="Hotfix-Abnahme"/>
+          <w14:checkbox>
+            <w14:checked w14:val="1"/>
+            <w14:checkedState w14:val="2612" w14:font="MS Gothic"/>
+            <w14:uncheckedState w14:val="2610" w14:font="MS Gothic"/>
+          </w14:checkbox>
+        </w:sdtPr>
+        <w:sdtContent>
+          <w:r>
+            <w:t>☑</w:t>
+          </w:r>
+        </w:sdtContent>
+      </w:sdt>
+      <w:r>
+        <w:rPr>
+          <w:sz w:val="18"/>
+        </w:rPr>
+        <w:t xml:space="preserve">  L15 – Geräteliste über Lagerhaus und Artikelverwaltung erreichbar (Programmcode)</w:t>
+      </w:r>
+    </w:p>
+    <w:p>
+      <w:pPr>
+        <w:spacing w:after="60"/>
+      </w:pPr>
+      <w:sdt>
+        <w:sdtPr>
+          <w:alias w:val="Hotfix-Abnahme"/>
+          <w14:checkbox>
+            <w14:checked w14:val="1"/>
+            <w14:checkedState w14:val="2612" w14:font="MS Gothic"/>
+            <w14:uncheckedState w14:val="2610" w14:font="MS Gothic"/>
+          </w14:checkbox>
+        </w:sdtPr>
+        <w:sdtContent>
+          <w:r>
+            <w:t>☑</w:t>
+          </w:r>
+        </w:sdtContent>
+      </w:sdt>
+      <w:r>
+        <w:rPr>
+          <w:sz w:val="18"/>
+        </w:rPr>
+        <w:t xml:space="preserve">  L15 – Geräteidentität pro registriertem Einzelgerät übernommen; Seriennummer bleibt unverändert</w:t>
+      </w:r>
+    </w:p>
+    <w:p>
+      <w:pPr>
+        <w:spacing w:after="60"/>
+      </w:pPr>
+      <w:sdt>
+        <w:sdtPr>
+          <w:alias w:val="Hotfix-Abnahme"/>
+          <w14:checkbox>
+            <w14:checked w14:val="1"/>
+            <w14:checkedState w14:val="2612" w14:font="MS Gothic"/>
+            <w14:uncheckedState w14:val="2610" w14:font="MS Gothic"/>
+          </w14:checkbox>
+        </w:sdtPr>
+        <w:sdtContent>
+          <w:r>
+            <w:t>☑</w:t>
+          </w:r>
+        </w:sdtContent>
+      </w:sdt>
+      <w:r>
+        <w:rPr>
+          <w:sz w:val="18"/>
+        </w:rPr>
+        <w:t xml:space="preserve">  L15 – Hersteller und Modell ausschließlich als vom Nutzer eingegebene Angaben</w:t>
+      </w:r>
+    </w:p>
+    <w:p>
+      <w:pPr>
+        <w:spacing w:after="60"/>
+      </w:pPr>
+      <w:sdt>
+        <w:sdtPr>
+          <w:alias w:val="Hotfix-Abnahme"/>
+          <w14:checkbox>
+            <w14:checked w14:val="1"/>
+            <w14:checkedState w14:val="2612" w14:font="MS Gothic"/>
+            <w14:uncheckedState w14:val="2610" w14:font="MS Gothic"/>
+          </w14:checkbox>
+        </w:sdtPr>
+        <w:sdtContent>
+          <w:r>
+            <w:t>☑</w:t>
+          </w:r>
+        </w:sdtContent>
+      </w:sdt>
+      <w:r>
+        <w:rPr>
+          <w:sz w:val="18"/>
+        </w:rPr>
+        <w:t xml:space="preserve">  L15 – Kaufdatum individuell erfasst, ungültige/zukünftige Datumswerte abgewiesen</w:t>
+      </w:r>
+    </w:p>
+    <w:p>
+      <w:pPr>
+        <w:spacing w:after="60"/>
+      </w:pPr>
+      <w:sdt>
+        <w:sdtPr>
+          <w:alias w:val="Hotfix-Abnahme"/>
+          <w14:checkbox>
+            <w14:checked w14:val="1"/>
+            <w14:checkedState w14:val="2612" w14:font="MS Gothic"/>
+            <w14:uncheckedState w14:val="2610" w14:font="MS Gothic"/>
+          </w14:checkbox>
+        </w:sdtPr>
+        <w:sdtContent>
+          <w:r>
+            <w:t>☑</w:t>
+          </w:r>
+        </w:sdtContent>
+      </w:sdt>
+      <w:r>
+        <w:rPr>
+          <w:sz w:val="18"/>
+        </w:rPr>
+        <w:t xml:space="preserve">  L15 – Betriebsstunden je Gerät separat; rückläufige Zählerstände abgewiesen</w:t>
+      </w:r>
+    </w:p>
+    <w:p>
+      <w:pPr>
+        <w:spacing w:after="60"/>
+      </w:pPr>
+      <w:sdt>
+        <w:sdtPr>
+          <w:alias w:val="Hotfix-Abnahme"/>
+          <w14:checkbox>
+            <w14:checked w14:val="1"/>
+            <w14:checkedState w14:val="2612" w14:font="MS Gothic"/>
+            <w14:uncheckedState w14:val="2610" w14:font="MS Gothic"/>
+          </w14:checkbox>
+        </w:sdtPr>
+        <w:sdtContent>
+          <w:r>
+            <w:t>☑</w:t>
+          </w:r>
+        </w:sdtContent>
+      </w:sdt>
+      <w:r>
+        <w:rPr>
+          <w:sz w:val="18"/>
+        </w:rPr>
+        <w:t xml:space="preserve">  L15 – Serviceintervalle wahlweise in Tagen oder Betriebsstunden konfigurierbar</w:t>
+      </w:r>
+    </w:p>
+    <w:p>
+      <w:pPr>
+        <w:spacing w:after="60"/>
+      </w:pPr>
+      <w:sdt>
+        <w:sdtPr>
+          <w:alias w:val="Hotfix-Abnahme"/>
+          <w14:checkbox>
+            <w14:checked w14:val="1"/>
+            <w14:checkedState w14:val="2612" w14:font="MS Gothic"/>
+            <w14:uncheckedState w14:val="2610" w14:font="MS Gothic"/>
+          </w14:checkbox>
+        </w:sdtPr>
+        <w:sdtContent>
+          <w:r>
+            <w:t>☑</w:t>
+          </w:r>
+        </w:sdtContent>
+      </w:sdt>
+      <w:r>
+        <w:rPr>
+          <w:sz w:val="18"/>
+        </w:rPr>
+        <w:t xml:space="preserve">  L15 – Wartungscheckliste mit bis zu 25 Punkten je Gerät gespeichert</w:t>
+      </w:r>
+    </w:p>
+    <w:p>
+      <w:pPr>
+        <w:spacing w:after="60"/>
+      </w:pPr>
+      <w:sdt>
+        <w:sdtPr>
+          <w:alias w:val="Hotfix-Abnahme"/>
+          <w14:checkbox>
+            <w14:checked w14:val="1"/>
+            <w14:checkedState w14:val="2612" w14:font="MS Gothic"/>
+            <w14:uncheckedState w14:val="2610" w14:font="MS Gothic"/>
+          </w14:checkbox>
+        </w:sdtPr>
+        <w:sdtContent>
+          <w:r>
+            <w:t>☑</w:t>
+          </w:r>
+        </w:sdtContent>
+      </w:sdt>
+      <w:r>
+        <w:rPr>
+          <w:sz w:val="18"/>
+        </w:rPr>
+        <w:t xml:space="preserve">  L15 – Abschluss einer Wartung erfordert alle angelegten Checklistenpunkte</w:t>
+      </w:r>
+    </w:p>
+    <w:p>
+      <w:pPr>
+        <w:spacing w:after="60"/>
+      </w:pPr>
+      <w:sdt>
+        <w:sdtPr>
+          <w:alias w:val="Hotfix-Abnahme"/>
+          <w14:checkbox>
+            <w14:checked w14:val="1"/>
+            <w14:checkedState w14:val="2612" w14:font="MS Gothic"/>
+            <w14:uncheckedState w14:val="2610" w14:font="MS Gothic"/>
+          </w14:checkbox>
+        </w:sdtPr>
+        <w:sdtContent>
+          <w:r>
+            <w:t>☑</w:t>
+          </w:r>
+        </w:sdtContent>
+      </w:sdt>
+      <w:r>
+        <w:rPr>
+          <w:sz w:val="18"/>
+        </w:rPr>
+        <w:t xml:space="preserve">  L15 – Fälligkeit aus tatsächlichem Wartungsdatum/-Zählerstand berechnet; sonst keine Fantasiewerte</w:t>
+      </w:r>
+    </w:p>
+    <w:p>
+      <w:pPr>
+        <w:spacing w:after="60"/>
+      </w:pPr>
+      <w:sdt>
+        <w:sdtPr>
+          <w:alias w:val="Hotfix-Abnahme"/>
+          <w14:checkbox>
+            <w14:checked w14:val="1"/>
+            <w14:checkedState w14:val="2612" w14:font="MS Gothic"/>
+            <w14:uncheckedState w14:val="2610" w14:font="MS Gothic"/>
+          </w14:checkbox>
+        </w:sdtPr>
+        <w:sdtContent>
+          <w:r>
+            <w:t>☑</w:t>
+          </w:r>
+        </w:sdtContent>
+      </w:sdt>
+      <w:r>
+        <w:rPr>
+          <w:sz w:val="18"/>
+        </w:rPr>
+        <w:t xml:space="preserve">  L15 – Keine Änderung der echten Mengen, Gebinde, Lagerorte oder fremden Geräteakten</w:t>
+      </w:r>
+    </w:p>
+    <w:p>
+      <w:pPr>
+        <w:spacing w:after="60"/>
+      </w:pPr>
+      <w:sdt>
+        <w:sdtPr>
+          <w:alias w:val="Hotfix-Abnahme"/>
+          <w14:checkbox>
+            <w14:checked w14:val="1"/>
+            <w14:checkedState w14:val="2612" w14:font="MS Gothic"/>
+            <w14:uncheckedState w14:val="2610" w14:font="MS Gothic"/>
+          </w14:checkbox>
+        </w:sdtPr>
+        <w:sdtContent>
+          <w:r>
+            <w:t>☑</w:t>
+          </w:r>
+        </w:sdtContent>
+      </w:sdt>
+      <w:r>
+        <w:rPr>
+          <w:sz w:val="18"/>
+        </w:rPr>
+        <w:t xml:space="preserve">  L15 – Versionskennung, Offline-Dateiliste und alle 20+ produktiven JS-Dateien geprüft</w:t>
+      </w:r>
+    </w:p>
+    <w:p>
+      <w:pPr>
+        <w:spacing w:after="60"/>
+      </w:pPr>
+      <w:sdt>
+        <w:sdtPr>
+          <w:alias w:val="Hotfix-Abnahme"/>
+          <w14:checkbox>
+            <w14:checked w14:val="1"/>
+            <w14:checkedState w14:val="2612" w14:font="MS Gothic"/>
+            <w14:uncheckedState w14:val="2610" w14:font="MS Gothic"/>
+          </w14:checkbox>
+        </w:sdtPr>
+        <w:sdtContent>
+          <w:r>
+            <w:t>☑</w:t>
+          </w:r>
+        </w:sdtContent>
+      </w:sdt>
+      <w:r>
+        <w:rPr>
+          <w:sz w:val="18"/>
+        </w:rPr>
+        <w:t xml:space="preserve">  L15 – 1 neuer Node-Test und 13 historische Regressionstests erfolgreich</w:t>
+      </w:r>
+    </w:p>
+    <w:p>
+      <w:pPr>
+        <w:spacing w:after="60"/>
+      </w:pPr>
+      <w:sdt>
+        <w:sdtPr>
+          <w:alias w:val="Hotfix-Abnahme"/>
+          <w14:checkbox>
+            <w14:checked w14:val="1"/>
+            <w14:checkedState w14:val="2612" w14:font="MS Gothic"/>
+            <w14:uncheckedState w14:val="2610" w14:font="MS Gothic"/>
+          </w14:checkbox>
+        </w:sdtPr>
+        <w:sdtContent>
+          <w:r>
+            <w:t>☑</w:t>
+          </w:r>
+        </w:sdtContent>
+      </w:sdt>
+      <w:r>
+        <w:rPr>
+          <w:sz w:val="18"/>
+        </w:rPr>
+        <w:t xml:space="preserve">  L15 – ZIP und aktualisierte bauhaus.docx zusammen erstellt, ZIP-Integrität geprüft</w:t>
+      </w:r>
+    </w:p>
+    <w:p>
+      <w:pPr>
+        <w:spacing w:after="60"/>
+      </w:pPr>
+      <w:sdt>
+        <w:sdtPr>
+          <w:alias w:val="Hotfix-Abnahme"/>
+          <w14:checkbox>
+            <w14:checked w14:val="1"/>
+            <w14:checkedState w14:val="2612" w14:font="MS Gothic"/>
+            <w14:uncheckedState w14:val="2610" w14:font="MS Gothic"/>
+          </w14:checkbox>
+        </w:sdtPr>
+        <w:sdtContent>
+          <w:r>
+            <w:t>☑</w:t>
+          </w:r>
+        </w:sdtContent>
+      </w:sdt>
+      <w:r>
+        <w:rPr>
+          <w:sz w:val="18"/>
+        </w:rPr>
+        <w:t xml:space="preserve">  L15 – Github main aktualisiert und Quelldateien erneut abgeglichen</w:t>
+      </w:r>
+    </w:p>
+    <w:p>
+      <w:pPr>
+        <w:spacing w:after="60"/>
+      </w:pPr>
+      <w:sdt>
+        <w:sdtPr>
+          <w:alias w:val="Hotfix-Abnahme"/>
+          <w14:checkbox>
+            <w14:checked w14:val="0"/>
+            <w14:checkedState w14:val="2612" w14:font="MS Gothic"/>
+            <w14:uncheckedState w14:val="2610" w14:font="MS Gothic"/>
+          </w14:checkbox>
+        </w:sdtPr>
+        <w:sdtContent>
+          <w:r>
+            <w:t>☐</w:t>
+          </w:r>
+        </w:sdtContent>
+      </w:sdt>
+      <w:r>
+        <w:rPr>
+          <w:sz w:val="18"/>
+        </w:rPr>
+        <w:t xml:space="preserve">  L15 – Vollständiger lokaler Chrome-Browser-E2E-Test bestanden (Admin-Richtlinie blockiert)</w:t>
+      </w:r>
+    </w:p>
+    <w:p>
+      <w:pPr>
+        <w:spacing w:after="60"/>
+      </w:pPr>
+      <w:sdt>
+        <w:sdtPr>
+          <w:alias w:val="Hotfix-Abnahme"/>
+          <w14:checkbox>
+            <w14:checked w14:val="0"/>
+            <w14:checkedState w14:val="2612" w14:font="MS Gothic"/>
+            <w14:uncheckedState w14:val="2610" w14:font="MS Gothic"/>
+          </w14:checkbox>
+        </w:sdtPr>
+        <w:sdtContent>
+          <w:r>
+            <w:t>☐</w:t>
+          </w:r>
+        </w:sdtContent>
+      </w:sdt>
+      <w:r>
+        <w:rPr>
+          <w:sz w:val="18"/>
+        </w:rPr>
+        <w:t xml:space="preserve">  L15 – Echter Android-Touch-/Offline-/Update-Praxistest bestanden</w:t>
+      </w:r>
+    </w:p>
+    <w:p>
+      <w:pPr>
+        <w:spacing w:after="60"/>
+      </w:pPr>
+      <w:sdt>
+        <w:sdtPr>
+          <w:alias w:val="Hotfix-Abnahme"/>
+          <w14:checkbox>
+            <w14:checked w14:val="0"/>
+            <w14:checkedState w14:val="2612" w14:font="MS Gothic"/>
+            <w14:uncheckedState w14:val="2610" w14:font="MS Gothic"/>
+          </w14:checkbox>
+        </w:sdtPr>
+        <w:sdtContent>
+          <w:r>
+            <w:t>☐</w:t>
+          </w:r>
+        </w:sdtContent>
+      </w:sdt>
+      <w:r>
+        <w:rPr>
+          <w:sz w:val="18"/>
+        </w:rPr>
+        <w:t xml:space="preserve">  L15 – Auf dem Handy installierte GitHub-Pages-Version V0.15.0 bestätigt</w:t>
+      </w:r>
+    </w:p>
+    <w:p>
+      <w:r>
+        <w:t>Hinweis: L16 wurde mit V0.16.0 umgesetzt. Als nächstes folgt L17 (PDF-Archiv und integrierter Offline-Viewer). Die letzten beiden Pakete bleiben L35 und L36; vor Beginn von L35 erfolgt die vereinbarte gesonderte Ankündigung.</w:t>
+      </w:r>
+    </w:p>
+    <w:p>
+      <w:pPr>
+        <w:pStyle w:val="Heading2"/>
+      </w:pPr>
+      <w:r>
+        <w:t>L16 · Abnahme V0.16.0 / Reparaturen, Wartung, Garantien</w:t>
+      </w:r>
+    </w:p>
+    <w:p>
+      <w:r>
+        <w:t>Stand 28.10.2026 · GitHub main: 124f2ebe65fe697db16ad3a619fc4641b9402d1f · Nur tatsächlich per automatischem Test oder Quellabgleich bestätigte Punkte sind angekreuzt. Der Chromium-Browser- und echte Android-Praxistest bleiben offen.</w:t>
+      </w:r>
+    </w:p>
+    <w:p>
+      <w:pPr>
+        <w:spacing w:after="60"/>
+      </w:pPr>
+      <w:sdt>
+        <w:sdtPr>
+          <w:alias w:val="Hotfix-Abnahme"/>
+          <w14:checkbox>
+            <w14:checked w14:val="1"/>
+            <w14:checkedState w14:val="2612" w14:font="MS Gothic"/>
+            <w14:uncheckedState w14:val="2610" w14:font="MS Gothic"/>
+          </w14:checkbox>
+        </w:sdtPr>
+        <w:sdtContent>
+          <w:r>
+            <w:t>☑</w:t>
+          </w:r>
+        </w:sdtContent>
+      </w:sdt>
+      <w:r>
+        <w:rPr>
+          <w:sz w:val="18"/>
+        </w:rPr>
+        <w:t xml:space="preserve">  L16 – Vorhandene Geräte-/Serviceakten aus L15 kompatibel übernommen</w:t>
+      </w:r>
+    </w:p>
+    <w:p>
+      <w:pPr>
+        <w:spacing w:after="60"/>
+      </w:pPr>
+      <w:sdt>
+        <w:sdtPr>
+          <w:alias w:val="Hotfix-Abnahme"/>
+          <w14:checkbox>
+            <w14:checked w14:val="1"/>
+            <w14:checkedState w14:val="2612" w14:font="MS Gothic"/>
+            <w14:uncheckedState w14:val="2610" w14:font="MS Gothic"/>
+          </w14:checkbox>
+        </w:sdtPr>
+        <w:sdtContent>
+          <w:r>
+            <w:t>☑</w:t>
+          </w:r>
+        </w:sdtContent>
+      </w:sdt>
+      <w:r>
+        <w:rPr>
+          <w:sz w:val="18"/>
+        </w:rPr>
+        <w:t xml:space="preserve">  L16 – Bestehende letzte Wartung als Alt-Eintrag gezeigt; keine fiktiven früheren Wartungen</w:t>
+      </w:r>
+    </w:p>
+    <w:p>
+      <w:pPr>
+        <w:spacing w:after="60"/>
+      </w:pPr>
+      <w:sdt>
+        <w:sdtPr>
+          <w:alias w:val="Hotfix-Abnahme"/>
+          <w14:checkbox>
+            <w14:checked w14:val="1"/>
+            <w14:checkedState w14:val="2612" w14:font="MS Gothic"/>
+            <w14:uncheckedState w14:val="2610" w14:font="MS Gothic"/>
+          </w14:checkbox>
+        </w:sdtPr>
+        <w:sdtContent>
+          <w:r>
+            <w:t>☑</w:t>
+          </w:r>
+        </w:sdtContent>
+      </w:sdt>
+      <w:r>
+        <w:rPr>
+          <w:sz w:val="18"/>
+        </w:rPr>
+        <w:t xml:space="preserve">  L16 – Mehrere Wartungen und Reparaturen chronologisch je Einzelgerät gespeichert</w:t>
+      </w:r>
+    </w:p>
+    <w:p>
+      <w:pPr>
+        <w:spacing w:after="60"/>
+      </w:pPr>
+      <w:sdt>
+        <w:sdtPr>
+          <w:alias w:val="Hotfix-Abnahme"/>
+          <w14:checkbox>
+            <w14:checked w14:val="1"/>
+            <w14:checkedState w14:val="2612" w14:font="MS Gothic"/>
+            <w14:uncheckedState w14:val="2610" w14:font="MS Gothic"/>
+          </w14:checkbox>
+        </w:sdtPr>
+        <w:sdtContent>
+          <w:r>
+            <w:t>☑</w:t>
+          </w:r>
+        </w:sdtContent>
+      </w:sdt>
+      <w:r>
+        <w:rPr>
+          <w:sz w:val="18"/>
+        </w:rPr>
+        <w:t xml:space="preserve">  L16 – Reparaturdatum, Beschreibung, optionale Werkstatt und Kosten dokumentiert</w:t>
+      </w:r>
+    </w:p>
+    <w:p>
+      <w:pPr>
+        <w:spacing w:after="60"/>
+      </w:pPr>
+      <w:sdt>
+        <w:sdtPr>
+          <w:alias w:val="Hotfix-Abnahme"/>
+          <w14:checkbox>
+            <w14:checked w14:val="1"/>
+            <w14:checkedState w14:val="2612" w14:font="MS Gothic"/>
+            <w14:uncheckedState w14:val="2610" w14:font="MS Gothic"/>
+          </w14:checkbox>
+        </w:sdtPr>
+        <w:sdtContent>
+          <w:r>
+            <w:t>☑</w:t>
+          </w:r>
+        </w:sdtContent>
+      </w:sdt>
+      <w:r>
+        <w:rPr>
+          <w:sz w:val="18"/>
+        </w:rPr>
+        <w:t xml:space="preserve">  L16 – Nicht erfasste Kosten ausdrücklich unbekannt; 0 € nur nach echter Nulleingabe</w:t>
+      </w:r>
+    </w:p>
+    <w:p>
+      <w:pPr>
+        <w:spacing w:after="60"/>
+      </w:pPr>
+      <w:sdt>
+        <w:sdtPr>
+          <w:alias w:val="Hotfix-Abnahme"/>
+          <w14:checkbox>
+            <w14:checked w14:val="1"/>
+            <w14:checkedState w14:val="2612" w14:font="MS Gothic"/>
+            <w14:uncheckedState w14:val="2610" w14:font="MS Gothic"/>
+          </w14:checkbox>
+        </w:sdtPr>
+        <w:sdtContent>
+          <w:r>
+            <w:t>☑</w:t>
+          </w:r>
+        </w:sdtContent>
+      </w:sdt>
+      <w:r>
+        <w:rPr>
+          <w:sz w:val="18"/>
+        </w:rPr>
+        <w:t xml:space="preserve">  L16 – Wartungsfälligkeit basiert nur auf bestätigter Wartung, nicht auf Reparaturen</w:t>
+      </w:r>
+    </w:p>
+    <w:p>
+      <w:pPr>
+        <w:spacing w:after="60"/>
+      </w:pPr>
+      <w:sdt>
+        <w:sdtPr>
+          <w:alias w:val="Hotfix-Abnahme"/>
+          <w14:checkbox>
+            <w14:checked w14:val="1"/>
+            <w14:checkedState w14:val="2612" w14:font="MS Gothic"/>
+            <w14:uncheckedState w14:val="2610" w14:font="MS Gothic"/>
+          </w14:checkbox>
+        </w:sdtPr>
+        <w:sdtContent>
+          <w:r>
+            <w:t>☑</w:t>
+          </w:r>
+        </w:sdtContent>
+      </w:sdt>
+      <w:r>
+        <w:rPr>
+          <w:sz w:val="18"/>
+        </w:rPr>
+        <w:t xml:space="preserve">  L16 – PDF/JPG/PNG/WebP-Belege bis 10 MB signaturgeprüft und lokal pro Eintrag speicherbar (Code und Logiktest)</w:t>
+      </w:r>
+    </w:p>
+    <w:p>
+      <w:pPr>
+        <w:spacing w:after="60"/>
+      </w:pPr>
+      <w:sdt>
+        <w:sdtPr>
+          <w:alias w:val="Hotfix-Abnahme"/>
+          <w14:checkbox>
+            <w14:checked w14:val="1"/>
+            <w14:checkedState w14:val="2612" w14:font="MS Gothic"/>
+            <w14:uncheckedState w14:val="2610" w14:font="MS Gothic"/>
+          </w14:checkbox>
+        </w:sdtPr>
+        <w:sdtContent>
+          <w:r>
+            <w:t>☑</w:t>
+          </w:r>
+        </w:sdtContent>
+      </w:sdt>
+      <w:r>
+        <w:rPr>
+          <w:sz w:val="18"/>
+        </w:rPr>
+        <w:t xml:space="preserve">  L16 – Belege über die Geräteakte als Datei herunterladbar (Codepfad geprüft)</w:t>
+      </w:r>
+    </w:p>
+    <w:p>
+      <w:pPr>
+        <w:spacing w:after="60"/>
+      </w:pPr>
+      <w:sdt>
+        <w:sdtPr>
+          <w:alias w:val="Hotfix-Abnahme"/>
+          <w14:checkbox>
+            <w14:checked w14:val="1"/>
+            <w14:checkedState w14:val="2612" w14:font="MS Gothic"/>
+            <w14:uncheckedState w14:val="2610" w14:font="MS Gothic"/>
+          </w14:checkbox>
+        </w:sdtPr>
+        <w:sdtContent>
+          <w:r>
+            <w:t>☑</w:t>
+          </w:r>
+        </w:sdtContent>
+      </w:sdt>
+      <w:r>
+        <w:rPr>
+          <w:sz w:val="18"/>
+        </w:rPr>
+        <w:t xml:space="preserve">  L16 – Einsatzbereit/Gesperrt je Gerät und Sperrgrund manuell verwaltbar</w:t>
+      </w:r>
+    </w:p>
+    <w:p>
+      <w:pPr>
+        <w:spacing w:after="60"/>
+      </w:pPr>
+      <w:sdt>
+        <w:sdtPr>
+          <w:alias w:val="Hotfix-Abnahme"/>
+          <w14:checkbox>
+            <w14:checked w14:val="1"/>
+            <w14:checkedState w14:val="2612" w14:font="MS Gothic"/>
+            <w14:uncheckedState w14:val="2610" w14:font="MS Gothic"/>
+          </w14:checkbox>
+        </w:sdtPr>
+        <w:sdtContent>
+          <w:r>
+            <w:t>☑</w:t>
+          </w:r>
+        </w:sdtContent>
+      </w:sdt>
+      <w:r>
+        <w:rPr>
+          <w:sz w:val="18"/>
+        </w:rPr>
+        <w:t xml:space="preserve">  L16 – Defekt gekennzeichnete Geräte auch bei manueller Freigabe nicht frei verfügbar</w:t>
+      </w:r>
+    </w:p>
+    <w:p>
+      <w:pPr>
+        <w:spacing w:after="60"/>
+      </w:pPr>
+      <w:sdt>
+        <w:sdtPr>
+          <w:alias w:val="Hotfix-Abnahme"/>
+          <w14:checkbox>
+            <w14:checked w14:val="1"/>
+            <w14:checkedState w14:val="2612" w14:font="MS Gothic"/>
+            <w14:uncheckedState w14:val="2610" w14:font="MS Gothic"/>
+          </w14:checkbox>
+        </w:sdtPr>
+        <w:sdtContent>
+          <w:r>
+            <w:t>☑</w:t>
+          </w:r>
+        </w:sdtContent>
+      </w:sdt>
+      <w:r>
+        <w:rPr>
+          <w:sz w:val="18"/>
+        </w:rPr>
+        <w:t xml:space="preserve">  L16 – Reparaturen entsperren ein Gerät nicht stillschweigend</w:t>
+      </w:r>
+    </w:p>
+    <w:p>
+      <w:pPr>
+        <w:spacing w:after="60"/>
+      </w:pPr>
+      <w:sdt>
+        <w:sdtPr>
+          <w:alias w:val="Hotfix-Abnahme"/>
+          <w14:checkbox>
+            <w14:checked w14:val="1"/>
+            <w14:checkedState w14:val="2612" w14:font="MS Gothic"/>
+            <w14:uncheckedState w14:val="2610" w14:font="MS Gothic"/>
+          </w14:checkbox>
+        </w:sdtPr>
+        <w:sdtContent>
+          <w:r>
+            <w:t>☑</w:t>
+          </w:r>
+        </w:sdtContent>
+      </w:sdt>
+      <w:r>
+        <w:rPr>
+          <w:sz w:val="18"/>
+        </w:rPr>
+        <w:t xml:space="preserve">  L16 – Garantieende ohne Fantasiedatum; individuelle In-App-Warnfrist</w:t>
+      </w:r>
+    </w:p>
+    <w:p>
+      <w:pPr>
+        <w:spacing w:after="60"/>
+      </w:pPr>
+      <w:sdt>
+        <w:sdtPr>
+          <w:alias w:val="Hotfix-Abnahme"/>
+          <w14:checkbox>
+            <w14:checked w14:val="1"/>
+            <w14:checkedState w14:val="2612" w14:font="MS Gothic"/>
+            <w14:uncheckedState w14:val="2610" w14:font="MS Gothic"/>
+          </w14:checkbox>
+        </w:sdtPr>
+        <w:sdtContent>
+          <w:r>
+            <w:t>☑</w:t>
+          </w:r>
+        </w:sdtContent>
+      </w:sdt>
+      <w:r>
+        <w:rPr>
+          <w:sz w:val="18"/>
+        </w:rPr>
+        <w:t xml:space="preserve">  L16 – Belegdateien entfernter Geräte/Artikel werden beim Löschen über die Artikelverwaltung freigegeben (Codepfad geprüft)</w:t>
+      </w:r>
+    </w:p>
+    <w:p>
+      <w:pPr>
+        <w:spacing w:after="60"/>
+      </w:pPr>
+      <w:sdt>
+        <w:sdtPr>
+          <w:alias w:val="Hotfix-Abnahme"/>
+          <w14:checkbox>
+            <w14:checked w14:val="1"/>
+            <w14:checkedState w14:val="2612" w14:font="MS Gothic"/>
+            <w14:uncheckedState w14:val="2610" w14:font="MS Gothic"/>
+          </w14:checkbox>
+        </w:sdtPr>
+        <w:sdtContent>
+          <w:r>
+            <w:t>☑</w:t>
+          </w:r>
+        </w:sdtContent>
+      </w:sdt>
+      <w:r>
+        <w:rPr>
+          <w:sz w:val="18"/>
+        </w:rPr>
+        <w:t xml:space="preserve">  L16 – Gerätedaten, Bestände und fremde Geräte-/Artikelakten bleiben unverändert</w:t>
+      </w:r>
+    </w:p>
+    <w:p>
+      <w:pPr>
+        <w:spacing w:after="60"/>
+      </w:pPr>
+      <w:sdt>
+        <w:sdtPr>
+          <w:alias w:val="Hotfix-Abnahme"/>
+          <w14:checkbox>
+            <w14:checked w14:val="1"/>
+            <w14:checkedState w14:val="2612" w14:font="MS Gothic"/>
+            <w14:uncheckedState w14:val="2610" w14:font="MS Gothic"/>
+          </w14:checkbox>
+        </w:sdtPr>
+        <w:sdtContent>
+          <w:r>
+            <w:t>☑</w:t>
+          </w:r>
+        </w:sdtContent>
+      </w:sdt>
+      <w:r>
+        <w:rPr>
+          <w:sz w:val="18"/>
+        </w:rPr>
+        <w:t xml:space="preserve">  L16 – 15 von 15 Logik-/Regressionstestmodulen und Syntaxchecks für 24 JS-Dateien bestanden</w:t>
+      </w:r>
+    </w:p>
+    <w:p>
+      <w:pPr>
+        <w:spacing w:after="60"/>
+      </w:pPr>
+      <w:sdt>
+        <w:sdtPr>
+          <w:alias w:val="Hotfix-Abnahme"/>
+          <w14:checkbox>
+            <w14:checked w14:val="1"/>
+            <w14:checkedState w14:val="2612" w14:font="MS Gothic"/>
+            <w14:uncheckedState w14:val="2610" w14:font="MS Gothic"/>
+          </w14:checkbox>
+        </w:sdtPr>
+        <w:sdtContent>
+          <w:r>
+            <w:t>☑</w:t>
+          </w:r>
+        </w:sdtContent>
+      </w:sdt>
+      <w:r>
+        <w:rPr>
+          <w:sz w:val="18"/>
+        </w:rPr>
+        <w:t xml:space="preserve">  L16 – PWA-Version, Cache-Kennung und Offline-Dateiliste (keine fehlenden Module) geprüft</w:t>
+      </w:r>
+    </w:p>
+    <w:p>
+      <w:pPr>
+        <w:spacing w:after="60"/>
+      </w:pPr>
+      <w:sdt>
+        <w:sdtPr>
+          <w:alias w:val="Hotfix-Abnahme"/>
+          <w14:checkbox>
+            <w14:checked w14:val="1"/>
+            <w14:checkedState w14:val="2612" w14:font="MS Gothic"/>
+            <w14:uncheckedState w14:val="2610" w14:font="MS Gothic"/>
+          </w14:checkbox>
+        </w:sdtPr>
+        <w:sdtContent>
+          <w:r>
+            <w:t>☑</w:t>
+          </w:r>
+        </w:sdtContent>
+      </w:sdt>
+      <w:r>
+        <w:rPr>
+          <w:sz w:val="18"/>
+        </w:rPr>
+        <w:t xml:space="preserve">  L16 – GitHub main veröffentlicht, Commit und relevante Dateien nachträglich abgerufen</w:t>
+      </w:r>
+    </w:p>
+    <w:p>
+      <w:pPr>
+        <w:spacing w:after="60"/>
+      </w:pPr>
+      <w:sdt>
+        <w:sdtPr>
+          <w:alias w:val="Hotfix-Abnahme"/>
+          <w14:checkbox>
+            <w14:checked w14:val="1"/>
+            <w14:checkedState w14:val="2612" w14:font="MS Gothic"/>
+            <w14:uncheckedState w14:val="2610" w14:font="MS Gothic"/>
+          </w14:checkbox>
+        </w:sdtPr>
+        <w:sdtContent>
+          <w:r>
+            <w:t>☑</w:t>
+          </w:r>
+        </w:sdtContent>
+      </w:sdt>
+      <w:r>
+        <w:rPr>
+          <w:sz w:val="18"/>
+        </w:rPr>
+        <w:t xml:space="preserve">  L16 – ZIP und aktualisierte Word-Mastercheckliste zusammen erstellt und ZIP-Integrität geprüft</w:t>
+      </w:r>
+    </w:p>
+    <w:p>
+      <w:pPr>
+        <w:spacing w:after="60"/>
+      </w:pPr>
+      <w:sdt>
+        <w:sdtPr>
+          <w:alias w:val="Hotfix-Abnahme"/>
+          <w14:checkbox>
+            <w14:checked w14:val="0"/>
+            <w14:checkedState w14:val="2612" w14:font="MS Gothic"/>
+            <w14:uncheckedState w14:val="2610" w14:font="MS Gothic"/>
+          </w14:checkbox>
+        </w:sdtPr>
+        <w:sdtContent>
+          <w:r>
+            <w:t>☐</w:t>
+          </w:r>
+        </w:sdtContent>
+      </w:sdt>
+      <w:r>
+        <w:rPr>
+          <w:sz w:val="18"/>
+        </w:rPr>
+        <w:t xml:space="preserve">  L16 – Kompletter lokaler Chromium-Browser-E2E-Test bestanden (Admin-Richtlinie blockiert)</w:t>
+      </w:r>
+    </w:p>
+    <w:p>
+      <w:pPr>
+        <w:spacing w:after="60"/>
+      </w:pPr>
+      <w:sdt>
+        <w:sdtPr>
+          <w:alias w:val="Hotfix-Abnahme"/>
+          <w14:checkbox>
+            <w14:checked w14:val="0"/>
+            <w14:checkedState w14:val="2612" w14:font="MS Gothic"/>
+            <w14:uncheckedState w14:val="2610" w14:font="MS Gothic"/>
+          </w14:checkbox>
+        </w:sdtPr>
+        <w:sdtContent>
+          <w:r>
+            <w:t>☐</w:t>
+          </w:r>
+        </w:sdtContent>
+      </w:sdt>
+      <w:r>
+        <w:rPr>
+          <w:sz w:val="18"/>
+        </w:rPr>
+        <w:t xml:space="preserve">  L16 – Echter Android-Touch-/PDF-/Beleg-/Offline-/Cache-Praxistest bestanden</w:t>
+      </w:r>
+    </w:p>
+    <w:p>
+      <w:pPr>
+        <w:spacing w:after="60"/>
+      </w:pPr>
+      <w:sdt>
+        <w:sdtPr>
+          <w:alias w:val="Hotfix-Abnahme"/>
+          <w14:checkbox>
+            <w14:checked w14:val="0"/>
+            <w14:checkedState w14:val="2612" w14:font="MS Gothic"/>
+            <w14:uncheckedState w14:val="2610" w14:font="MS Gothic"/>
+          </w14:checkbox>
+        </w:sdtPr>
+        <w:sdtContent>
+          <w:r>
+            <w:t>☐</w:t>
+          </w:r>
+        </w:sdtContent>
+      </w:sdt>
+      <w:r>
+        <w:rPr>
+          <w:sz w:val="18"/>
+        </w:rPr>
+        <w:t xml:space="preserve">  L16 – Auf dem Handy installierte GitHub-Pages-Version V0.16.0 bestätigt</w:t>
+      </w:r>
+    </w:p>
+    <w:p>
+      <w:r>
+        <w:t>L17 ist weiterhin für ein zentrales PDF-Archiv und einen in der App integrierten Offline-Viewer vorgesehen. Die L16-Belege lassen sich derzeit sicher als Originaldatei herunterladen; ein eingebetteter PDF-Viewer wurde nicht als erledigt markiert.</w:t>
+      </w:r>
+    </w:p>
+    <w:sectPr>
+      <w:pgSz w:w="12240" w:h="15840"/>
+      <w:pgMar w:top="1191" w:right="1134" w:bottom="1020" w:left="1247" w:header="720" w:footer="720" w:gutter="0"/>
+      <w:cols w:space="720"/>
+      <w:docGrid w:linePitch="360"/>
+    </w:sectPr>
   </w:body>
 </w:document>
 </file>

</xml_diff>

<commit_message>
L16.1: finale Word-Mastercheckliste mit 18 erledigten und 3 offenen Tests
</commit_message>
<xml_diff>
--- a/DOKUMENTATION/bauhaus.docx
+++ b/DOKUMENTATION/bauhaus.docx
@@ -28,7 +28,7 @@
         <w:jc w:val="center"/>
       </w:pPr>
       <w:r>
-        <w:t>Stand: 27. Oktober 2026   •   Basis: Mein Alltag V0.0.2   •   Aktuelle App-Version: V0.13.0 (L13)</w:t>
+        <w:t>Stand: 28. Oktober 2026   •   Basis: Mein Alltag V0.0.2   •   Aktuelle App-Version: V0.16.1 (Zwischenupdate L16.1)</w:t>
       </w:r>
     </w:p>
     <w:p>
@@ -90,7 +90,7 @@
     <w:p>
       <w:pPr/>
       <w:r>
-        <w:t>Abgeschlossen (Code und GitHub): 13 / 36 Updates   |   Offen: 23 / 36 Updates. L13 V0.13.0 nach Node- und Syntaxprüfung auf GitHub main veröffentlicht; vollständig interaktiver Browser-/Android-Praxistest bleibt offen.</w:t>
+        <w:t>Hauptplan: 16 von 36 Updates umgesetzt, 20 planmäßig offen. Zusätzlich Zwischenupdate L16.1 „Bodenlager / Freiplatzierung“ umgesetzt. L34, L35 und L36 bleiben am Schluss. Vollständiger Android-Praxistest weiterhin offen.</w:t>
       </w:r>
     </w:p>
     <w:p>
@@ -8124,6 +8124,326 @@
     <w:p>
       <w:r>
         <w:t>L17 ist weiterhin für ein zentrales PDF-Archiv und einen in der App integrierten Offline-Viewer vorgesehen. Die L16-Belege lassen sich derzeit sicher als Originaldatei herunterladen; ein eingebetteter PDF-Viewer wurde nicht als erledigt markiert.</w:t>
+      </w:r>
+    </w:p>
+    <w:p>
+      <w:pPr>
+        <w:spacing w:after="40" w:before="0" w:line="240" w:lineRule="auto"/>
+      </w:pPr>
+      <w:r>
+        <w:br w:type="page"/>
+      </w:r>
+    </w:p>
+    <w:p>
+      <w:pPr>
+        <w:pStyle w:val="Heading1"/>
+        <w:spacing w:after="40" w:before="0" w:line="240" w:lineRule="auto"/>
+      </w:pPr>
+      <w:r>
+        <w:t>L16.1 · Bodenlager und freie 3D-Objekte</w:t>
+      </w:r>
+    </w:p>
+    <w:p>
+      <w:pPr>
+        <w:pStyle w:val="Subtitle"/>
+        <w:spacing w:after="40" w:before="0" w:line="240" w:lineRule="auto"/>
+      </w:pPr>
+      <w:r>
+        <w:t>Zwischenupdate zur App V0.16.1  |  28. Oktober 2026</w:t>
+      </w:r>
+    </w:p>
+    <w:p>
+      <w:pPr>
+        <w:spacing w:after="40" w:before="0" w:line="240" w:lineRule="auto"/>
+      </w:pPr>
+      <w:r>
+        <w:t>Dieses Zwischenupdate ergänzt das bisherige L16, ohne die Nummerierung L17–L36 zu ändern. Die 3D-Anzeige bleibt schematisch (6 × 4 Raster), nicht maßstabsgetreu. Der spätere frei konstruierbare 3D-Editor L34 bleibt geplant.</w:t>
+      </w:r>
+    </w:p>
+    <w:p>
+      <w:pPr>
+        <w:pStyle w:val="Heading2"/>
+        <w:spacing w:after="40" w:before="0" w:line="240" w:lineRule="auto"/>
+      </w:pPr>
+      <w:r>
+        <w:t>Abnahme und erledigte Punkte</w:t>
+      </w:r>
+    </w:p>
+    <w:p>
+      <w:pPr>
+        <w:spacing w:after="40" w:before="0" w:line="240" w:lineRule="auto"/>
+      </w:pPr>
+      <w:r>
+        <w:rPr>
+          <w:color w:val="2C755A"/>
+          <w:sz w:val="17"/>
+        </w:rPr>
+        <w:t>☒  L16.1 – Bestehende Lagerhausversion 0.16.0 als Grundlage verwendet; Artikel-, Raum-, Fach- und Gerätekennungen behalten.</w:t>
+      </w:r>
+    </w:p>
+    <w:p>
+      <w:pPr>
+        <w:spacing w:after="40" w:before="0" w:line="240" w:lineRule="auto"/>
+      </w:pPr>
+      <w:r>
+        <w:rPr>
+          <w:color w:val="2C755A"/>
+          <w:sz w:val="17"/>
+        </w:rPr>
+        <w:t>☒  L16.1 – Räume verlustarm um floorObjects erweitert; vorhandene Regalbestände bleiben unverändert.</w:t>
+      </w:r>
+    </w:p>
+    <w:p>
+      <w:pPr>
+        <w:spacing w:after="40" w:before="0" w:line="240" w:lineRule="auto"/>
+      </w:pPr>
+      <w:r>
+        <w:rPr>
+          <w:color w:val="2C755A"/>
+          <w:sz w:val="17"/>
+        </w:rPr>
+        <w:t>☒  L16.1 – Bodenmodelle: Rasenmäher, Motorsäge, Heckenschere, Kübel, Schachtel und Sonstiges als unterscheidbare 3D-Vektorsymbole.</w:t>
+      </w:r>
+    </w:p>
+    <w:p>
+      <w:pPr>
+        <w:spacing w:after="40" w:before="0" w:line="240" w:lineRule="auto"/>
+      </w:pPr>
+      <w:r>
+        <w:rPr>
+          <w:color w:val="2C755A"/>
+          <w:sz w:val="17"/>
+        </w:rPr>
+        <w:t>☒  L16.1 – Freie Bodenstellplätze für mehrere Artikel eingeführt; eindeutige P-Kennung und gültiger Lagerort im Artikelmanager.</w:t>
+      </w:r>
+    </w:p>
+    <w:p>
+      <w:pPr>
+        <w:spacing w:after="40" w:before="0" w:line="240" w:lineRule="auto"/>
+      </w:pPr>
+      <w:r>
+        <w:rPr>
+          <w:color w:val="2C755A"/>
+          <w:sz w:val="17"/>
+        </w:rPr>
+        <w:t>☒  L16.1 – Antippen eines Bodenobjekts öffnet die Artikel-/Stellplatzdetails.</w:t>
+      </w:r>
+    </w:p>
+    <w:p>
+      <w:pPr>
+        <w:spacing w:after="40" w:before="0" w:line="240" w:lineRule="auto"/>
+      </w:pPr>
+      <w:r>
+        <w:rPr>
+          <w:color w:val="2C755A"/>
+          <w:sz w:val="17"/>
+        </w:rPr>
+        <w:t>☒  L16.1 – Bodenobjekte mit Finger / Maus verschiebbar; Drehen um 90° per Touch-Schaltfläche und Feinausrichtung mit Pfeiltasten.</w:t>
+      </w:r>
+    </w:p>
+    <w:p>
+      <w:pPr>
+        <w:spacing w:after="40" w:before="0" w:line="240" w:lineRule="auto"/>
+      </w:pPr>
+      <w:r>
+        <w:rPr>
+          <w:color w:val="2C755A"/>
+          <w:sz w:val="17"/>
+        </w:rPr>
+        <w:t>☒  L16.1 – Kollisionen mit Möbeln, anderen Bodenobjekten und Raumgrenzen werden geprüft.</w:t>
+      </w:r>
+    </w:p>
+    <w:p>
+      <w:pPr>
+        <w:spacing w:after="40" w:before="0" w:line="240" w:lineRule="auto"/>
+      </w:pPr>
+      <w:r>
+        <w:rPr>
+          <w:color w:val="2C755A"/>
+          <w:sz w:val="17"/>
+        </w:rPr>
+        <w:t>☒  L16.1 – Bestandsmengen bleiben unverändert beim Verknüpfen eines Artikels mit einem 3D-Bodenobjekt.</w:t>
+      </w:r>
+    </w:p>
+    <w:p>
+      <w:pPr>
+        <w:spacing w:after="40" w:before="0" w:line="240" w:lineRule="auto"/>
+      </w:pPr>
+      <w:r>
+        <w:rPr>
+          <w:color w:val="2C755A"/>
+          <w:sz w:val="17"/>
+        </w:rPr>
+        <w:t>☒  L16.1 – Mengenverschiebung Raum → Bodenstellplatz erfolgt ohne Duplikate über die bestehende Buchungslogik.</w:t>
+      </w:r>
+    </w:p>
+    <w:p>
+      <w:pPr>
+        <w:spacing w:after="40" w:before="0" w:line="240" w:lineRule="auto"/>
+      </w:pPr>
+      <w:r>
+        <w:rPr>
+          <w:color w:val="2C755A"/>
+          <w:sz w:val="17"/>
+        </w:rPr>
+        <w:t>☒  L16.1 – Gekennzeichnete Einzelgeräte / Gebinde werden weiterhin gegen unzulässige generische Umlagerung geschützt.</w:t>
+      </w:r>
+    </w:p>
+    <w:p>
+      <w:pPr>
+        <w:spacing w:after="40" w:before="0" w:line="240" w:lineRule="auto"/>
+      </w:pPr>
+      <w:r>
+        <w:rPr>
+          <w:color w:val="2C755A"/>
+          <w:sz w:val="17"/>
+        </w:rPr>
+        <w:t>☒  L16.1 – Geräte-/Wartungs-/Reparaturakten behalten ihre Verknüpfung über die unveränderte Artikel-ID.</w:t>
+      </w:r>
+    </w:p>
+    <w:p>
+      <w:pPr>
+        <w:spacing w:after="40" w:before="0" w:line="240" w:lineRule="auto"/>
+      </w:pPr>
+      <w:r>
+        <w:rPr>
+          <w:color w:val="2C755A"/>
+          <w:sz w:val="17"/>
+        </w:rPr>
+        <w:t>☒  L16.1 – Belegte Bodenstellplätze lassen sich nicht löschen; 3D-Einzelobjekt entfernen löscht keinen Artikel.</w:t>
+      </w:r>
+    </w:p>
+    <w:p>
+      <w:pPr>
+        <w:spacing w:after="40" w:before="0" w:line="240" w:lineRule="auto"/>
+      </w:pPr>
+      <w:r>
+        <w:rPr>
+          <w:color w:val="2C755A"/>
+          <w:sz w:val="17"/>
+        </w:rPr>
+        <w:t>☒  L16.1 – Neue 3D-Ansicht und Lagereinträge bleiben im vorhandenen IndexedDB-Modul lagerhaus; Datenbankversion bleibt 1.</w:t>
+      </w:r>
+    </w:p>
+    <w:p>
+      <w:pPr>
+        <w:spacing w:after="40" w:before="0" w:line="240" w:lineRule="auto"/>
+      </w:pPr>
+      <w:r>
+        <w:rPr>
+          <w:color w:val="2C755A"/>
+          <w:sz w:val="17"/>
+        </w:rPr>
+        <w:t>☒  L16.1 – Offline-Service-Worker mit neuer Cache-Kennung und vollständigem neuen JS-Modul aktualisiert.</w:t>
+      </w:r>
+    </w:p>
+    <w:p>
+      <w:pPr>
+        <w:spacing w:after="40" w:before="0" w:line="240" w:lineRule="auto"/>
+      </w:pPr>
+      <w:r>
+        <w:rPr>
+          <w:color w:val="2C755A"/>
+          <w:sz w:val="17"/>
+        </w:rPr>
+        <w:t>☒  L16.1 – Neuer L16.1-Logiktest und 15 frühere Regressionstestmodule bestanden.</w:t>
+      </w:r>
+    </w:p>
+    <w:p>
+      <w:pPr>
+        <w:spacing w:after="40" w:before="0" w:line="240" w:lineRule="auto"/>
+      </w:pPr>
+      <w:r>
+        <w:rPr>
+          <w:color w:val="2C755A"/>
+          <w:sz w:val="17"/>
+        </w:rPr>
+        <w:t>☒  L16.1 – JavaScript-Syntax aller produktiven Skripte erfolgreich geprüft.</w:t>
+      </w:r>
+    </w:p>
+    <w:p>
+      <w:pPr>
+        <w:spacing w:after="40" w:before="0" w:line="240" w:lineRule="auto"/>
+      </w:pPr>
+      <w:r>
+        <w:rPr>
+          <w:color w:val="2C755A"/>
+          <w:sz w:val="17"/>
+        </w:rPr>
+        <w:t>☒  L16.1 – ZIP samt aktueller Word-Checkliste erstellt und auf Vollständigkeit geprüft.</w:t>
+      </w:r>
+    </w:p>
+    <w:p>
+      <w:pPr>
+        <w:spacing w:after="40" w:before="0" w:line="240" w:lineRule="auto"/>
+      </w:pPr>
+      <w:r>
+        <w:rPr>
+          <w:color w:val="2C755A"/>
+          <w:sz w:val="17"/>
+        </w:rPr>
+        <w:t>☒  L16.1 – GitHub-main nach Codeprüfung aktualisiert und auf Branch/Dateiversion nachkontrolliert.</w:t>
+      </w:r>
+    </w:p>
+    <w:p>
+      <w:pPr>
+        <w:spacing w:after="40" w:before="0" w:line="240" w:lineRule="auto"/>
+      </w:pPr>
+      <w:r>
+        <w:rPr>
+          <w:color w:val="935E40"/>
+          <w:sz w:val="17"/>
+        </w:rPr>
+        <w:t>☐  L16.1 – Browser-E2E mit Chromium vollständig bestanden – lokale Navigation durch ERR_BLOCKED_BY_ADMINISTRATOR verhindert.</w:t>
+      </w:r>
+    </w:p>
+    <w:p>
+      <w:pPr>
+        <w:spacing w:after="40" w:before="0" w:line="240" w:lineRule="auto"/>
+      </w:pPr>
+      <w:r>
+        <w:rPr>
+          <w:color w:val="935E40"/>
+          <w:sz w:val="17"/>
+        </w:rPr>
+        <w:t>☐  L16.1 – Echter Android-Test: Objekt anlegen, mit Finger ziehen, 90° drehen, Stellplatz öffnen, Gerätedetails prüfen.</w:t>
+      </w:r>
+    </w:p>
+    <w:p>
+      <w:pPr>
+        <w:spacing w:after="40" w:before="0" w:line="240" w:lineRule="auto"/>
+      </w:pPr>
+      <w:r>
+        <w:rPr>
+          <w:color w:val="935E40"/>
+          <w:sz w:val="17"/>
+        </w:rPr>
+        <w:t>☐  L16.1 – Speicher-Praxistest auf Android: Browser schließen, neu öffnen, offline starten, Position und Bestand wiederfinden.</w:t>
+      </w:r>
+    </w:p>
+    <w:p>
+      <w:pPr>
+        <w:pStyle w:val="Heading2"/>
+        <w:spacing w:after="40" w:before="0" w:line="240" w:lineRule="auto"/>
+      </w:pPr>
+      <w:r>
+        <w:t>Veröffentlichung und Restprüfungen</w:t>
+      </w:r>
+    </w:p>
+    <w:p>
+      <w:pPr>
+        <w:spacing w:after="40" w:before="0" w:line="240" w:lineRule="auto"/>
+      </w:pPr>
+      <w:r>
+        <w:t>GitHub main: f05929f8e53099a4833223f2366a6867cc888068</w:t>
+      </w:r>
+    </w:p>
+    <w:p>
+      <w:pPr>
+        <w:spacing w:after="40" w:before="0" w:line="240" w:lineRule="auto"/>
+      </w:pPr>
+      <w:r>
+        <w:t>Automatische Tests bestätigen die Logik. Sie ersetzen keinen echten Android-Touch- und Offline-Praxistest. Für die ersten Tests bitte nur Testdaten verwenden und vor produktiver Nutzung eine Sicherung der Browserdaten vorsehen. Die letzten beiden planmäßigen Updates bleiben L35 und L36.</w:t>
       </w:r>
     </w:p>
     <w:sectPr>

</xml_diff>

<commit_message>
D01 V0.17.0: Google Drive OAuth Backup, Restore, Tests und Word-Checklisten
</commit_message>
<xml_diff>
--- a/DOKUMENTATION/bauhaus.docx
+++ b/DOKUMENTATION/bauhaus.docx
@@ -28,7 +28,7 @@
         <w:jc w:val="center"/>
       </w:pPr>
       <w:r>
-        <w:t>Stand: 28. Oktober 2026   •   Basis: Mein Alltag V0.0.2   •   Aktuelle App-Version: V0.16.1 (Zwischenupdate L16.1)</w:t>
+        <w:t>Stand: 28. Oktober 2026   •   Basis: Mein Alltag V0.0.2   •   Aktuelle App-Version: V0.16.3 (F01 Datenschutz + Frauengesundheit)</w:t>
       </w:r>
     </w:p>
     <w:p>
@@ -60,7 +60,7 @@
         <w:pStyle w:val="ListBullet"/>
       </w:pPr>
       <w:r>
-        <w:t>Kein Passwort für Lagerhaus-Backups. Originaldaten niemals ohne bestätigte Wiederherstellung überschreiben.</w:t>
+        <w:t>Alte L32-Planungsregel „ohne Passwort“ durch F01 überholt: Gesamtbackups über Google Drive sind seit F01 passwortgeschützt und verschlüsselt. Keine zusätzliche App-Sperre und keine Gesundheits-PIN.</w:t>
       </w:r>
     </w:p>
     <w:p>
@@ -90,7 +90,7 @@
     <w:p>
       <w:pPr/>
       <w:r>
-        <w:t>Hauptplan: 16 von 36 Updates umgesetzt, 20 planmäßig offen. Zusätzlich Zwischenupdate L16.1 „Bodenlager / Freiplatzierung“ umgesetzt. L34, L35 und L36 bleiben am Schluss. Vollständiger Android-Praxistest weiterhin offen.</w:t>
+        <w:t>Hauptplan Lagerhaus: 16 von 36 Updates umgesetzt; L17–L36 bleiben offen. L16.1 und L16.2 sowie Sonderupdate F01 (Datenschutz + Hauptseite Frauengesundheit) umgesetzt. F01 wurde auf GitHub main veröffentlicht (Commit a384be89907d); echter Android-/PC-Praxistest weiterhin offen.</w:t>
       </w:r>
     </w:p>
     <w:p>
@@ -1836,24 +1836,8 @@
       <w:pPr>
         <w:pStyle w:val="Heading2"/>
       </w:pPr>
-      <w:r/>
-      <w:sdt>
-        <w:sdtPr>
-          <w:alias w:val="Update abgeschlossen"/>
-          <w14:checkbox>
-            <w14:checked w14:val="0"/>
-            <w14:checkedState w14:val="2612" w14:font="MS Gothic"/>
-            <w14:uncheckedState w14:val="2610" w14:font="MS Gothic"/>
-          </w14:checkbox>
-        </w:sdtPr>
-        <w:sdtContent>
-          <w:r>
-            <w:t>☐</w:t>
-          </w:r>
-        </w:sdtContent>
-      </w:sdt>
-      <w:r>
-        <w:t xml:space="preserve">  L32  ·  Vollständiger Backup-Manager OHNE Passwort</w:t>
+      <w:r>
+        <w:t>L32  ·  Erweiterter Backup-Manager (die manuelle verschlüsselte Gesamt-Datensicherung wurde bereits vorgezogen in F01)</w:t>
       </w:r>
     </w:p>
     <w:p>
@@ -1861,13 +1845,7 @@
         <w:spacing w:after="60"/>
       </w:pPr>
       <w:r>
-        <w:rPr>
-          <w:b/>
-        </w:rPr>
-        <w:t xml:space="preserve">Umfang: </w:t>
-      </w:r>
-      <w:r>
-        <w:t>ZIP-Sicherung Lagerhaus/ganze App, Artikel, Bilder, PDFs, 3D-Räume, Journal; Versions- und Integritätsprüfung, manuelle Drive-Speicherung.</w:t>
+        <w:t>Umfang: Erweiterte ZIP-/Versions-/Integritäts-Sicherungen des Lagerhauses und der gesamten App; Artikel, Fotos, PDF-Belege, 3D-Räume und Buchungsjournal; manuelle Google-Drive-Speicherung. Die in F01 eingeführte AES-GCM-Verschlüsselung mit Backup-Passwort bleibt verbindlich.</w:t>
       </w:r>
     </w:p>
     <w:p>
@@ -1875,13 +1853,7 @@
         <w:spacing w:after="120"/>
       </w:pPr>
       <w:r>
-        <w:rPr>
-          <w:b/>
-        </w:rPr>
-        <w:t xml:space="preserve">Abnahme: </w:t>
-      </w:r>
-      <w:r>
-        <w:t>Sicherung und Wiederherstellung im Test erfolgreich, vor Import Sicherheitskopie; KEINE Passwortabfrage.</w:t>
+        <w:t>Abnahme L32: erweiterte Integritäts-/Versions-/Migrationsprüfungen, erfolgreiche Wiederherstellung auf Android und Windows; vor jedem Überschreiben separate Sicherheitskopie. F01-Basisfunktionen allein schließen L32 noch nicht ab.</w:t>
       </w:r>
     </w:p>
     <w:p>
@@ -8444,6 +8416,555 @@
       </w:pPr>
       <w:r>
         <w:t>Automatische Tests bestätigen die Logik. Sie ersetzen keinen echten Android-Touch- und Offline-Praxistest. Für die ersten Tests bitte nur Testdaten verwenden und vor produktiver Nutzung eine Sicherung der Browserdaten vorsehen. Die letzten beiden planmäßigen Updates bleiben L35 und L36.</w:t>
+      </w:r>
+    </w:p>
+    <w:p>
+      <w:pPr>
+        <w:pStyle w:val="Heading2"/>
+      </w:pPr>
+      <w:r>
+        <w:t>L16.2 · Kompakte 3D-Lagerbedienung</w:t>
+      </w:r>
+    </w:p>
+    <w:p>
+      <w:r>
+        <w:t>Zwischenupdate zur App V0.16.2  |  28. Oktober 2026</w:t>
+      </w:r>
+    </w:p>
+    <w:p>
+      <w:r>
+        <w:t>Reines Bedienoberflächen-Update nach Praxistest: 3D-Raum sichtbar lassen, Einstellungen bei Bedarf aufklappen. Keine Datenbankmigration. L17–L36 bleiben unverändert.</w:t>
+      </w:r>
+    </w:p>
+    <w:p>
+      <w:pPr>
+        <w:spacing w:after="60"/>
+      </w:pPr>
+      <w:r>
+        <w:t>☒  L16.2 – 3D-Raumansicht weiterhin direkt und groß sichtbar.</w:t>
+      </w:r>
+    </w:p>
+    <w:p>
+      <w:pPr>
+        <w:spacing w:after="60"/>
+      </w:pPr>
+      <w:r>
+        <w:t>☒  L16.2 – Kompakte aufklappbare Gruppen für Bodenlager, Möbel, Fächer/Artikel, nicht eingeräumte Artikel, Möbelbearbeitung und Raumeinstellungen.</w:t>
+      </w:r>
+    </w:p>
+    <w:p>
+      <w:pPr>
+        <w:spacing w:after="60"/>
+      </w:pPr>
+      <w:r>
+        <w:t>☒  L16.2 – Alle Gruppen bei normalem Raumaufruf zunächst geschlossen, per Antippen ein-/ausklappbar; Bedienelemente bleiben im Quellcode vorhanden.</w:t>
+      </w:r>
+    </w:p>
+    <w:p>
+      <w:pPr>
+        <w:spacing w:after="60"/>
+      </w:pPr>
+      <w:r>
+        <w:t>☒  L16.2 – Schnellzugriffe „+ Bodenobjekt“ und „+ Regal / Möbel“ direkt oberhalb der 3D-Skizze öffnen den richtigen Bereich und scrollen dorthin.</w:t>
+      </w:r>
+    </w:p>
+    <w:p>
+      <w:pPr>
+        <w:spacing w:after="60"/>
+      </w:pPr>
+      <w:r>
+        <w:t>☒  L16.2 – 3D-Steuerung einklappbar; Vollbildknopf stets direkt erreichbar, auch zum Beenden des Vollbilds.</w:t>
+      </w:r>
+    </w:p>
+    <w:p>
+      <w:pPr>
+        <w:spacing w:after="60"/>
+      </w:pPr>
+      <w:r>
+        <w:t>☒  L16.2 – Aufklappzustände nur im Arbeitsspeicher verwaltet; keine zusätzlichen Datenbankfelder und keine Bestandsbuchungen beim Öffnen/Schließen.</w:t>
+      </w:r>
+    </w:p>
+    <w:p>
+      <w:pPr>
+        <w:spacing w:after="60"/>
+      </w:pPr>
+      <w:r>
+        <w:t>☒  L16.2 – Bodenobjektdialog außerhalb geschlossener Klappgruppen platziert, damit Antippen eines Geräts in der 3D-Skizze die Details weiterhin öffnet.</w:t>
+      </w:r>
+    </w:p>
+    <w:p>
+      <w:pPr>
+        <w:spacing w:after="60"/>
+      </w:pPr>
+      <w:r>
+        <w:t>☒  L16.2 – Bearbeitung von Regalen und Fächern über bestehende Formulare/Funktionen erhalten; bei Auswahl wird die passende Gruppe aufklappbar.</w:t>
+      </w:r>
+    </w:p>
+    <w:p>
+      <w:pPr>
+        <w:spacing w:after="60"/>
+      </w:pPr>
+      <w:r>
+        <w:t>☒  L16.2 – App-Versionsanzeige, version.json und Service-Worker-Cache auf V0.16.2 umgestellt.</w:t>
+      </w:r>
+    </w:p>
+    <w:p>
+      <w:pPr>
+        <w:spacing w:after="60"/>
+      </w:pPr>
+      <w:r>
+        <w:t>☒  L16.2 – 16/16 historische automatisierte Node-Regressionstestmodule bestanden und neuer L16.2-Touch-Browser-UI-Test bestanden.</w:t>
+      </w:r>
+    </w:p>
+    <w:p>
+      <w:pPr>
+        <w:spacing w:after="60"/>
+      </w:pPr>
+      <w:r>
+        <w:t>☒  L16.2 – JavaScript-Syntax, Offline-Assetliste und ZIP-Integrität geprüft.</w:t>
+      </w:r>
+    </w:p>
+    <w:p>
+      <w:pPr>
+        <w:spacing w:after="60"/>
+      </w:pPr>
+      <w:r>
+        <w:t>☒  L16.2 – Simulierter 390-Pixel-Touch-Chromium-Test: Menüs öffnen/schließen, Schnellzugriffe, Dialog außerhalb Klappgruppen erfolgreich. Echter Android-Gerätetest weiterhin offen.</w:t>
+      </w:r>
+    </w:p>
+    <w:p>
+      <w:pPr>
+        <w:spacing w:after="60"/>
+      </w:pPr>
+      <w:r>
+        <w:t>☐  L16.2 – Android-Praxistest: Nach Neustart Positionen/Bestände unverändert und offline nutzbar (noch offen).</w:t>
+      </w:r>
+    </w:p>
+    <w:p>
+      <w:pPr>
+        <w:spacing w:after="60"/>
+      </w:pPr>
+      <w:r>
+        <w:t>☒  L16.2 – GitHub main veröffentlicht (Commit 0174c425391fccb182204917136e71c9a34438ff); App-Versionsdatei, Import und Offline-Service-Worker anschließend erneut abgerufen und auf V0.16.2 kontrolliert.</w:t>
+      </w:r>
+    </w:p>
+    <w:p>
+      <w:r>
+        <w:t>Testhinweis: Automatisierte Logik-, Syntax- und HTML-Strukturprüfungen ersetzen keine echte Bedienprobe auf dem Android-Gerät. Keine Nutzdaten in der ZIP enthalten; bestehende Chrome-IndexedDB wird durch bloßen App-Dateitausch nicht gelöscht, solange dieselbe GitHub-Pages-URL verwendet und keine Browserdaten gelöscht werden.</w:t>
+      </w:r>
+    </w:p>
+    <w:p>
+      <w:r>
+        <w:br w:type="page"/>
+      </w:r>
+    </w:p>
+    <w:p>
+      <w:pPr>
+        <w:pStyle w:val="Heading1"/>
+      </w:pPr>
+      <w:r>
+        <w:t>F01  ·  Datenschutz &amp; Frauengesundheit – Beta V0.16.3</w:t>
+      </w:r>
+    </w:p>
+    <w:p>
+      <w:pPr>
+        <w:spacing w:before="0" w:after="60" w:line="252" w:lineRule="auto"/>
+      </w:pPr>
+      <w:r>
+        <w:t>Sonderupdate, unabhängig von Lagerhaus L17 bis L36. Rosa Referenzansicht des Nutzers als Vorlage. GitHub main veröffentlicht (Commit a384be89907d); echter Android-/PC-Praxistest und öffentliche GitHub-Pages-Auslieferung nicht abschließend bestätigt.</w:t>
+      </w:r>
+    </w:p>
+    <w:p>
+      <w:pPr>
+        <w:spacing w:before="0" w:after="60" w:line="252" w:lineRule="auto"/>
+      </w:pPr>
+      <w:r>
+        <w:rPr>
+          <w:sz w:val="19"/>
+        </w:rPr>
+        <w:t>☒  F01 – Vorhandene Version 0.16.2 als unveränderte Datenbasis übernommen.</w:t>
+      </w:r>
+    </w:p>
+    <w:p>
+      <w:pPr>
+        <w:spacing w:before="0" w:after="60" w:line="252" w:lineRule="auto"/>
+      </w:pPr>
+      <w:r>
+        <w:rPr>
+          <w:sz w:val="19"/>
+        </w:rPr>
+        <w:t>☒  F01 – Frauengesundheit als rosafarbene Startseite mit Referenzanordnung und acht 3D-Motiven gestaltet.</w:t>
+      </w:r>
+    </w:p>
+    <w:p>
+      <w:pPr>
+        <w:spacing w:before="0" w:after="60" w:line="252" w:lineRule="auto"/>
+      </w:pPr>
+      <w:r>
+        <w:rPr>
+          <w:sz w:val="19"/>
+        </w:rPr>
+        <w:t>☒  F01 – Alle acht Bereiche: Zyklus, Periode, Ausfluss, Sex, Schwangerschaft, Lernzentrum, Tagebuch, Untersuchungen &amp; Notizen.</w:t>
+      </w:r>
+    </w:p>
+    <w:p>
+      <w:pPr>
+        <w:spacing w:before="0" w:after="60" w:line="252" w:lineRule="auto"/>
+      </w:pPr>
+      <w:r>
+        <w:rPr>
+          <w:sz w:val="19"/>
+        </w:rPr>
+        <w:t>☒  F01 – Eigene Navigation Start / Kalender / Einträge / Mehr und Rückweg zur Haupt-App.</w:t>
+      </w:r>
+    </w:p>
+    <w:p>
+      <w:pPr>
+        <w:spacing w:before="0" w:after="60" w:line="252" w:lineRule="auto"/>
+      </w:pPr>
+      <w:r>
+        <w:rPr>
+          <w:sz w:val="19"/>
+        </w:rPr>
+        <w:t>☒  F01 – Eigene datierte Einträge mit Titel, Notiz und optionalem Foto lokal speichern und löschen.</w:t>
+      </w:r>
+    </w:p>
+    <w:p>
+      <w:pPr>
+        <w:spacing w:before="0" w:after="60" w:line="252" w:lineRule="auto"/>
+      </w:pPr>
+      <w:r>
+        <w:rPr>
+          <w:sz w:val="19"/>
+        </w:rPr>
+        <w:t>☒  F01 – Zyklusstart und Zykluslänge lokal erfassbar; Periodenanzeige nur als Schätzung, keine erfundenen Personendaten.</w:t>
+      </w:r>
+    </w:p>
+    <w:p>
+      <w:pPr>
+        <w:spacing w:before="0" w:after="60" w:line="252" w:lineRule="auto"/>
+      </w:pPr>
+      <w:r>
+        <w:rPr>
+          <w:sz w:val="19"/>
+        </w:rPr>
+        <w:t>☒  F01 – Keine App-Sperre und keine zusätzliche PIN für Frauengesundheit eingebaut (Nutzerentscheidung).</w:t>
+      </w:r>
+    </w:p>
+    <w:p>
+      <w:pPr>
+        <w:spacing w:before="0" w:after="60" w:line="252" w:lineRule="auto"/>
+      </w:pPr>
+      <w:r>
+        <w:rPr>
+          <w:sz w:val="19"/>
+        </w:rPr>
+        <w:t>☒  F01 – AES-256-GCM-Verschlüsselung der Backup-Datei mit PBKDF2-SHA256, 310.000 Iterationen und frischen Zufallswerten.</w:t>
+      </w:r>
+    </w:p>
+    <w:p>
+      <w:pPr>
+        <w:spacing w:before="0" w:after="60" w:line="252" w:lineRule="auto"/>
+      </w:pPr>
+      <w:r>
+        <w:rPr>
+          <w:sz w:val="19"/>
+        </w:rPr>
+        <w:t>☒  F01 – Manuelles Backup aller fünf Datenmodule und Meta-Daten einschließlich Fotos und File-/Blob-Belegen.</w:t>
+      </w:r>
+    </w:p>
+    <w:p>
+      <w:pPr>
+        <w:spacing w:before="0" w:after="60" w:line="252" w:lineRule="auto"/>
+      </w:pPr>
+      <w:r>
+        <w:rPr>
+          <w:sz w:val="19"/>
+        </w:rPr>
+        <w:t>☒  F01 – Download einer .meinalltag-Datei zum eigenständigen Hochladen auf Google Drive.</w:t>
+      </w:r>
+    </w:p>
+    <w:p>
+      <w:pPr>
+        <w:spacing w:before="0" w:after="60" w:line="252" w:lineRule="auto"/>
+      </w:pPr>
+      <w:r>
+        <w:rPr>
+          <w:sz w:val="19"/>
+        </w:rPr>
+        <w:t>☒  F01 – Import auf anderem Gerät mit Passwort, Format-/Integritätsprüfung und ausdrücklicher Überschreibbestätigung.</w:t>
+      </w:r>
+    </w:p>
+    <w:p>
+      <w:pPr>
+        <w:spacing w:before="0" w:after="60" w:line="252" w:lineRule="auto"/>
+      </w:pPr>
+      <w:r>
+        <w:rPr>
+          <w:sz w:val="19"/>
+        </w:rPr>
+        <w:t>☒  F01 – Vollständiger Austausch der Daten in einer einzigen IndexedDB-Transaktion (kein Teilimport).</w:t>
+      </w:r>
+    </w:p>
+    <w:p>
+      <w:pPr>
+        <w:spacing w:before="0" w:after="60" w:line="252" w:lineRule="auto"/>
+      </w:pPr>
+      <w:r>
+        <w:rPr>
+          <w:sz w:val="19"/>
+        </w:rPr>
+        <w:t>☒  F01 – Falsches Passwort/manipulierte verschlüsselte Datei abgewiesen (Node-Test).</w:t>
+      </w:r>
+    </w:p>
+    <w:p>
+      <w:pPr>
+        <w:spacing w:before="0" w:after="60" w:line="252" w:lineRule="auto"/>
+      </w:pPr>
+      <w:r>
+        <w:rPr>
+          <w:sz w:val="19"/>
+        </w:rPr>
+        <w:t>☒  F01 – Test-Wiederherstellung für Lagerbestände, Frauengesundheit, PDF-Datei und Lagerfoto bestanden (simulierter IndexedDB-Test).</w:t>
+      </w:r>
+    </w:p>
+    <w:p>
+      <w:pPr>
+        <w:spacing w:before="0" w:after="60" w:line="252" w:lineRule="auto"/>
+      </w:pPr>
+      <w:r>
+        <w:rPr>
+          <w:sz w:val="19"/>
+        </w:rPr>
+        <w:t>☒  F01 – 17 von 17 historischen Lagerhaus-Regressionstests bestanden (Versionsprüfungen aktualisiert).</w:t>
+      </w:r>
+    </w:p>
+    <w:p>
+      <w:pPr>
+        <w:spacing w:before="0" w:after="60" w:line="252" w:lineRule="auto"/>
+      </w:pPr>
+      <w:r>
+        <w:rPr>
+          <w:sz w:val="19"/>
+        </w:rPr>
+        <w:t>☒  F01 – Chromium-Oberflächentest mit isoliertem Speicher: 8 Karten, Untersuchung, Zyklus, Löschen bestanden.</w:t>
+      </w:r>
+    </w:p>
+    <w:p>
+      <w:pPr>
+        <w:spacing w:before="0" w:after="60" w:line="252" w:lineRule="auto"/>
+      </w:pPr>
+      <w:r>
+        <w:rPr>
+          <w:sz w:val="19"/>
+        </w:rPr>
+        <w:t>☒  F01 – Offline-Service-Worker/Assets und JS-Syntax statisch geprüft.</w:t>
+      </w:r>
+    </w:p>
+    <w:p>
+      <w:pPr>
+        <w:spacing w:before="0" w:after="60" w:line="252" w:lineRule="auto"/>
+      </w:pPr>
+      <w:r>
+        <w:rPr>
+          <w:sz w:val="19"/>
+        </w:rPr>
+        <w:t>☐  F01 – Vollständiger browserbasierter IndexedDB/Backup-E2E-Test gegen localhost/GitHub Pages (Umgebung blockiert Navigation).</w:t>
+      </w:r>
+    </w:p>
+    <w:p>
+      <w:pPr>
+        <w:spacing w:before="0" w:after="60" w:line="252" w:lineRule="auto"/>
+      </w:pPr>
+      <w:r>
+        <w:rPr>
+          <w:sz w:val="19"/>
+        </w:rPr>
+        <w:t>☐  F01 – Echte Android-/PC-Gesamtsicherung und Wiederherstellung mit bestehenden Daten erfolgreich verifiziert.</w:t>
+      </w:r>
+    </w:p>
+    <w:p>
+      <w:pPr>
+        <w:spacing w:before="0" w:after="60" w:line="252" w:lineRule="auto"/>
+      </w:pPr>
+      <w:r>
+        <w:t>☒  F01 – GitHub main veröffentlicht (Commit a384be89907d); version.json, sw.js und Backup-Modul nachträglich auf main abgerufen.</w:t>
+      </w:r>
+    </w:p>
+    <w:p>
+      <w:pPr>
+        <w:spacing w:before="0" w:after="60" w:line="252" w:lineRule="auto"/>
+      </w:pPr>
+      <w:r>
+        <w:t>☒  F01 – Fertige ZIP mit aktualisierter Word-Mastercheckliste erstellt und ZIP-Integrität nach Auslieferung geprüft.</w:t>
+      </w:r>
+    </w:p>
+    <w:p>
+      <w:pPr>
+        <w:spacing w:before="0" w:after="60" w:line="252" w:lineRule="auto"/>
+      </w:pPr>
+      <w:r>
+        <w:rPr>
+          <w:sz w:val="19"/>
+        </w:rPr>
+        <w:t>Wichtig: Das lokale IndexedDB bleibt OHNE Verschlüsselung; nur exportierte Backup-Dateien werden verschlüsselt. Vor echten intimen Einträgen bitte die Sicherung auf beiden Geräten mit Testdaten praktisch überprüfen.</w:t>
+      </w:r>
+    </w:p>
+    <w:p>
+      <w:pPr>
+        <w:pStyle w:val="Heading1"/>
+      </w:pPr>
+      <w:r>
+        <w:t>D01 · Google Drive · Beta V0.17.0 · 28.10.2026</w:t>
+      </w:r>
+    </w:p>
+    <w:p>
+      <w:pPr>
+        <w:spacing w:after="60"/>
+      </w:pPr>
+      <w:r>
+        <w:t>☒  D01 – Google OAuth-Anmeldung vorbereitet: Google Identity Services und berechtigungsarmer drive.file-Scope</w:t>
+      </w:r>
+    </w:p>
+    <w:p>
+      <w:pPr>
+        <w:spacing w:after="60"/>
+      </w:pPr>
+      <w:r>
+        <w:t>☒  D01 – Öffentliche Google-OAuth-Web-Client-ID über Einstellungen erfassbar und auf Gerät gespeichert; kein Client-Secret</w:t>
+      </w:r>
+    </w:p>
+    <w:p>
+      <w:pPr>
+        <w:spacing w:after="60"/>
+      </w:pPr>
+      <w:r>
+        <w:t>☒  D01 – Sichtbarer Google-Drive-Ordner „Mein Alltag Backups“ wird bei Bedarf angelegt</w:t>
+      </w:r>
+    </w:p>
+    <w:p>
+      <w:pPr>
+        <w:spacing w:after="60"/>
+      </w:pPr>
+      <w:r>
+        <w:t>☒  D01 – Verschlüsselte Gesamtsicherung aller fünf Module inklusive Fotos und Belege wird per resumable Upload übertragen</w:t>
+      </w:r>
+    </w:p>
+    <w:p>
+      <w:pPr>
+        <w:spacing w:after="60"/>
+      </w:pPr>
+      <w:r>
+        <w:t>☒  D01 – Drive-Backups werden angezeigt und sind für den Import auswählbar</w:t>
+      </w:r>
+    </w:p>
+    <w:p>
+      <w:pPr>
+        <w:spacing w:after="60"/>
+      </w:pPr>
+      <w:r>
+        <w:t>☒  D01 – Google-Drive-Import: Passwortprüfung, AES-GCM-Authentifizierung, vollständige Snapshots und explizite Überschreibbestätigung</w:t>
+      </w:r>
+    </w:p>
+    <w:p>
+      <w:pPr>
+        <w:spacing w:after="60"/>
+      </w:pPr>
+      <w:r>
+        <w:t>☒  D01 – Lokale Sicherungsdatei herunterladen / importieren bleibt als Offline-Alternative erhalten</w:t>
+      </w:r>
+    </w:p>
+    <w:p>
+      <w:pPr>
+        <w:spacing w:after="60"/>
+      </w:pPr>
+      <w:r>
+        <w:t>☒  D01 – OAuth-Token nur im Arbeitsspeicher; Anmeldung und Abmeldung in der Oberfläche</w:t>
+      </w:r>
+    </w:p>
+    <w:p>
+      <w:pPr>
+        <w:spacing w:after="60"/>
+      </w:pPr>
+      <w:r>
+        <w:t>☒  D01 – App, Lagerhaus-Header, Version und Offline-Service-Worker auf V0.17.0 erhöht</w:t>
+      </w:r>
+    </w:p>
+    <w:p>
+      <w:pPr>
+        <w:spacing w:after="60"/>
+      </w:pPr>
+      <w:r>
+        <w:t>☒  D01 – Technischer Drive-Test mit simulierten API-Antworten bestanden</w:t>
+      </w:r>
+    </w:p>
+    <w:p>
+      <w:pPr>
+        <w:spacing w:after="60"/>
+      </w:pPr>
+      <w:r>
+        <w:t>☒  D01 – AES-256-GCM-Backup-Roundtrip für alle sechs IndexedDB-Stores inklusive PDF/Foto bestanden</w:t>
+      </w:r>
+    </w:p>
+    <w:p>
+      <w:pPr>
+        <w:spacing w:after="60"/>
+      </w:pPr>
+      <w:r>
+        <w:t>☒  D01 – Mobile Chromium-Oberflächenprüfung (390 px) und F07-Oberflächenprüfung bestanden</w:t>
+      </w:r>
+    </w:p>
+    <w:p>
+      <w:pPr>
+        <w:spacing w:after="60"/>
+      </w:pPr>
+      <w:r>
+        <w:t>☒  D01 – Historische Node-Regressionen: 18 von 18 bestanden (Versions-Assertions auf D01 normalisiert)</w:t>
+      </w:r>
+    </w:p>
+    <w:p>
+      <w:pPr>
+        <w:spacing w:after="60"/>
+      </w:pPr>
+      <w:r>
+        <w:t>☒  D01 – Einrichtungsanleitung GOOGLE_DRIVE_EINRICHTUNG.md und Update-Protokoll erstellt</w:t>
+      </w:r>
+    </w:p>
+    <w:p>
+      <w:pPr>
+        <w:spacing w:after="60"/>
+      </w:pPr>
+      <w:r>
+        <w:t>☐  D01 – Google-Cloud-Projekt, aktivierte Google Drive API, OAuth-Client und persönlicher Testnutzer eingerichtet</w:t>
+      </w:r>
+    </w:p>
+    <w:p>
+      <w:pPr>
+        <w:spacing w:after="60"/>
+      </w:pPr>
+      <w:r>
+        <w:t>☐  D01 – Erster echter Google-Login / Upload / Download / Drive-Anzeige in einem Google-Konto geprüft</w:t>
+      </w:r>
+    </w:p>
+    <w:p>
+      <w:pPr>
+        <w:spacing w:after="60"/>
+      </w:pPr>
+      <w:r>
+        <w:t>☐  D01 – Wiederherstellung auf realem Android-/PC-Zweitgerät mit Testdaten erfolgreich geprüft</w:t>
+      </w:r>
+    </w:p>
+    <w:p>
+      <w:pPr>
+        <w:spacing w:after="60"/>
+      </w:pPr>
+      <w:r>
+        <w:t>☐  D01 – GitHub Pages nach Veröffentlichung geladen, Cache-Version und installiertes PWA-Update praktisch geprüft</w:t>
+      </w:r>
+    </w:p>
+    <w:p>
+      <w:r>
+        <w:t>Prüfhinweis: Cloud-OAuth ist technisch vorbereitet, benötigt aber eine individuelle Google-Cloud-Web-Client-ID. Ohne diese ID keine erfolgreiche Google-Anmeldung. Keine realen Kontotests behauptet.</w:t>
       </w:r>
     </w:p>
     <w:sectPr>

</xml_diff>

<commit_message>
D02 V0.17.1: Sichtbare Google-Drive-Bestätigungen und Fehlerhinweise mit Word-Checklisten
</commit_message>
<xml_diff>
--- a/DOKUMENTATION/bauhaus.docx
+++ b/DOKUMENTATION/bauhaus.docx
@@ -8965,6 +8965,104 @@
     <w:p>
       <w:r>
         <w:t>Prüfhinweis: Cloud-OAuth ist technisch vorbereitet, benötigt aber eine individuelle Google-Cloud-Web-Client-ID. Ohne diese ID keine erfolgreiche Google-Anmeldung. Keine realen Kontotests behauptet.</w:t>
+      </w:r>
+    </w:p>
+    <w:p>
+      <w:pPr>
+        <w:pStyle w:val="Heading1"/>
+      </w:pPr>
+      <w:r>
+        <w:t>D02 · Sichtbare Google-Drive-Rückmeldungen · Beta V0.17.1 · 28.10.2026</w:t>
+      </w:r>
+    </w:p>
+    <w:p>
+      <w:r>
+        <w:t>☒  D02 – Client-ID speichern: sofort sichtbare grüne Bestätigung unter dem Knopf und als mobile Meldung</w:t>
+      </w:r>
+    </w:p>
+    <w:p>
+      <w:r>
+        <w:t>☒  D02 – Ungültige oder leere Client-ID wird abgewiesen; klare rote Fehlermeldung statt falschem Erfolg</w:t>
+      </w:r>
+    </w:p>
+    <w:p>
+      <w:r>
+        <w:t>☒  D02 – Google-Anmeldung zeigt „Google angemeldet“ erst nach Token-Rückmeldung</w:t>
+      </w:r>
+    </w:p>
+    <w:p>
+      <w:r>
+        <w:t>☒  D02 – Fehlgeschlagener Abruf der Backup-Liste wird getrennt von erfolgreicher Google-Anmeldung angezeigt</w:t>
+      </w:r>
+    </w:p>
+    <w:p>
+      <w:r>
+        <w:t>☒  D02 – Google Drive Backup: Fortschritt, erfolgreiche Upload-Bestätigung mit Dateiname und Fehler sichtbar</w:t>
+      </w:r>
+    </w:p>
+    <w:p>
+      <w:r>
+        <w:t>☒  D02 – Erfolgreicher Upload bleibt auch dann als Erfolg erkennbar, wenn anschließende Listenaktualisierung scheitert</w:t>
+      </w:r>
+    </w:p>
+    <w:p>
+      <w:r>
+        <w:t>☒  D02 – Backup-Liste aktualisieren und Abmelden zeigen eigene Rückmeldungen</w:t>
+      </w:r>
+    </w:p>
+    <w:p>
+      <w:r>
+        <w:t>☒  D02 – Wiederherstellung sowie lokaler Backup-Import/-Export zeigen Erfolg, Abbruch oder Fehler</w:t>
+      </w:r>
+    </w:p>
+    <w:p>
+      <w:r>
+        <w:t>☒  D02 – Mobile Statusmeldung über der Navigation, hoher Kontrast, Schließen-Schaltfläche, zugängliche Live-Region</w:t>
+      </w:r>
+    </w:p>
+    <w:p>
+      <w:r>
+        <w:t>☒  D02 – App-Header, Version und Service-Worker-Cache auf V0.17.1 aktualisiert</w:t>
+      </w:r>
+    </w:p>
+    <w:p>
+      <w:r>
+        <w:t>☒  D02 – Chromium-Simulation bei 390 px: Speichern, Fehler, Anmelden, Backup, Uploadfehler, Abmelden getestet</w:t>
+      </w:r>
+    </w:p>
+    <w:p>
+      <w:r>
+        <w:t>☒  D02 – 18 von 18 historische Node-Regressionsprüfungen erfolgreich</w:t>
+      </w:r>
+    </w:p>
+    <w:p>
+      <w:r>
+        <w:t>☒  D02 – Bestehende Datenbank- und Verschlüsselungsfunktionen unverändert; keine Datenbereinigung</w:t>
+      </w:r>
+    </w:p>
+    <w:p>
+      <w:r>
+        <w:t>☒  D02 – Neue Word-Checkliste D02 und aktualisierte Mastercheckliste bauhaus.docx erstellt</w:t>
+      </w:r>
+    </w:p>
+    <w:p>
+      <w:r>
+        <w:t>☐  D02 – Upload eines echten verschlüsselten Backups im Google-Konto des Nutzers kontrolliert</w:t>
+      </w:r>
+    </w:p>
+    <w:p>
+      <w:r>
+        <w:t>☐  D02 – Wiederherstellung real auf zweitem Gerät mit Testdaten geprüft</w:t>
+      </w:r>
+    </w:p>
+    <w:p>
+      <w:r>
+        <w:t>☐  D02 – PWA-Update und neuer Service-Worker direkt auf Android überprüft</w:t>
+      </w:r>
+    </w:p>
+    <w:p>
+      <w:r>
+        <w:t>D02-Prüfhinweis: Simulierte OAuth/Drive-Abläufe und mobile Chromium-Klicks bestanden. Kein echter Datei-Upload/Restore ins Google-Konto im automatisierten Test durchgeführt.</w:t>
       </w:r>
     </w:p>
     <w:sectPr>

</xml_diff>